<commit_message>
Show four agent roles in the paper: requirements and design, prototype and build, QA, deployment
Fig. 1 groups the nine stages under the four roles, Table II merges its rows the same
way, and the abstract, introduction and Section III say four roles.

Co-Authored-By: Claude Opus 5.5 <noreply@anthropic.com>
Claude-Session: https://claude.ai/code/session_0111Df7UgJw8J3KuMVvbeH3J
</commit_message>
<xml_diff>
--- a/research/paper/AgentForge_ICAC2026_Paper.docx
+++ b/research/paper/AgentForge_ICAC2026_Paper.docx
@@ -38,7 +38,7 @@
           <w:sz w:val="18"/>
           <w:szCs w:val="18"/>
         </w:rPr>
-        <w:t xml:space="preserve">Large language models can now write most of a web application, yet the agent’s own report that the work is finished remains the weakest evidence in the process. This paper presents AgentForge, a desktop system in which five LLM agent roles (requirements, prototype, build, quality assurance and deployment) carry a product idea through an adaptive interview, an approved plan, a requirements specification with eleven kinds of diagrams, wireframes, an interactive prototype, a phased build, browser-level testing and a cloud deployment. The roles share one tool-calling engine and hand work to each other through a project record on disk. Every hand-off is checked by code rather than by a model: a depth floor on the plan; schema, plan-coverage and evidence audits on the specification; a named-page gate on the build; requirement verdicts computed from test-runner output; and a probe of the deployed HTTPS address that the deploying agent does not control. Personal data typed by the user is replaced with placeholders before every model request and restored in the generated artifacts. Measurements taken during development show three effects. Writing the specification as five parallel parts cut its generation for a 31-page store from 546 s to 141 s. One conversation carried through a build grew to 900,000 tokens and made each model call about four times slower, which moved the hand-off from the conversation to files. Computing requirement status from test results corrected a report of 0 of 116 requirements met after every test had passed. A protocol for a controlled evaluation is specified.</w:t>
+        <w:t xml:space="preserve">Large language models can now write most of a web application, yet the agent’s own report that the work is finished remains the weakest evidence in the process. This paper presents AgentForge, a desktop system in which four LLM agent roles (requirements and design, prototype and build, quality assurance, and deployment) carry a product idea through an adaptive interview, an approved plan, a requirements specification with eleven kinds of diagrams, wireframes, an interactive prototype, a phased build, browser-level testing and a cloud deployment. The roles share one tool-calling engine and hand work to each other through a project record on disk. Every hand-off is checked by code rather than by a model: a depth floor on the plan; schema, plan-coverage and evidence audits on the specification; a named-page gate on the build; requirement verdicts computed from test-runner output; and a probe of the deployed HTTPS address that the deploying agent does not control. Personal data typed by the user is replaced with placeholders before every model request and restored in the generated artifacts. Measurements taken during development show three effects. Writing the specification as five parallel parts cut its generation for a 31-page store from 546 s to 141 s. One conversation carried through a build grew to 900,000 tokens and made each model call about four times slower, which moved the hand-off from the conversation to files. Computing requirement status from test results corrected a report of 0 of 116 requirements met after every test had passed. A protocol for a controlled evaluation is specified.</w:t>
       </w:r>
     </w:p>
     <w:p>
@@ -201,7 +201,7 @@
           <w:sz w:val="20"/>
           <w:szCs w:val="20"/>
         </w:rPr>
-        <w:t xml:space="preserve">AgentForge is built on one rule: a model may write anything, but code decides whether a stage is finished. Five agent roles take turns on one tool-calling engine. They pass work to each other through files in the project’s own record, and every stage boundary has a check that reads those files and either lets the project through or names what is missing. The model is used where judgement is needed (choosing the next interview question, writing a page, fixing a failing journey) and kept out of the decision about whether that work is done. The paper makes four contributions:</w:t>
+        <w:t xml:space="preserve">AgentForge is built on one rule: a model may write anything, but code decides whether a stage is finished. Four agent roles take turns on one tool-calling engine. They pass work to each other through files in the project’s own record, and every stage boundary has a check that reads those files and either lets the project through or names what is missing. The model is used where judgement is needed (choosing the next interview question, writing a page, fixing a failing journey) and kept out of the decision about whether that work is done. The paper makes four contributions:</w:t>
       </w:r>
     </w:p>
     <w:p>
@@ -232,7 +232,7 @@
           <w:sz w:val="20"/>
           <w:szCs w:val="20"/>
         </w:rPr>
-        <w:t xml:space="preserve">A pipeline from a one-sentence idea to a live HTTPS address in which five agent roles share one engine and one on-disk project record (Section III).</w:t>
+        <w:t xml:space="preserve">A pipeline from a one-sentence idea to a live HTTPS address in which four agent roles share one engine and one on-disk project record (Section III).</w:t>
       </w:r>
     </w:p>
     <w:p>
@@ -2260,7 +2260,7 @@
       <w:r>
         <w:drawing>
           <wp:inline distT="0" distB="0" distL="0" distR="0">
-            <wp:extent cx="3181350" cy="4219575"/>
+            <wp:extent cx="3181350" cy="4495800"/>
             <wp:effectExtent t="0" r="0" b="0" l="0"/>
             <wp:docPr id="1" name="" descr="" title=""/>
             <wp:cNvGraphicFramePr>
@@ -2285,7 +2285,7 @@
                   <pic:spPr bwMode="auto">
                     <a:xfrm>
                       <a:off x="0" y="0"/>
-                      <a:ext cx="3181350" cy="4219575"/>
+                      <a:ext cx="3181350" cy="4495800"/>
                     </a:xfrm>
                     <a:prstGeom prst="rect">
                       <a:avLst/>
@@ -2315,7 +2315,7 @@
           <w:sz w:val="16"/>
           <w:szCs w:val="16"/>
         </w:rPr>
-        <w:t xml:space="preserve">AgentForge architecture. Five agent roles share one engine and hand off through the project record; the checks between stages are decided by code.</w:t>
+        <w:t xml:space="preserve">AgentForge architecture. Four agent roles share one engine and hand off through the project record; the checks between stages are decided by code.</w:t>
       </w:r>
     </w:p>
     <w:p>
@@ -2344,7 +2344,7 @@
           <w:sz w:val="20"/>
           <w:szCs w:val="20"/>
         </w:rPr>
-        <w:t xml:space="preserve">The pipeline has nine stages: interview, plan, specification, wireframes, design, prototype, build, test and deploy. Five agent roles own them (Table II). A role is not a separate process or a separate model. It is a set of prompts, a stage of the project and a label on the events the Studio shows. All five run on the same engine against the same workspace, and every instruction a model receives is a Markdown file under </w:t>
+        <w:t xml:space="preserve">The pipeline has nine stages: interview, plan, specification, wireframes, design, prototype, build, test and deploy. Four agent roles own them (Table II). A role is not a separate process or a separate model. It is a set of prompts, a stage of the project and a label on the events the Studio shows. All four run on the same engine against the same workspace, and every instruction a model receives is a Markdown file under </w:t>
       </w:r>
       <w:r>
         <w:rPr>
@@ -2546,7 +2546,7 @@
                 <w:sz w:val="16"/>
                 <w:szCs w:val="16"/>
               </w:rPr>
-              <w:t xml:space="preserve">Requirements</w:t>
+              <w:t xml:space="preserve">Requirements + Designer</w:t>
             </w:r>
           </w:p>
         </w:tc>
@@ -2573,7 +2573,7 @@
                 <w:sz w:val="16"/>
                 <w:szCs w:val="16"/>
               </w:rPr>
-              <w:t xml:space="preserve">Interview, plan, specification, 11 diagrams, hand-off files, wireframes</w:t>
+              <w:t xml:space="preserve">Interview, plan, specification, 11 diagrams, hand-off files, wireframes, theme choice</w:t>
             </w:r>
           </w:p>
         </w:tc>
@@ -2632,7 +2632,7 @@
                 <w:sz w:val="16"/>
                 <w:szCs w:val="16"/>
               </w:rPr>
-              <w:t xml:space="preserve">Prototype</w:t>
+              <w:t xml:space="preserve">Prototype + Builder</w:t>
             </w:r>
           </w:p>
         </w:tc>
@@ -2659,7 +2659,7 @@
                 <w:sz w:val="16"/>
                 <w:szCs w:val="16"/>
               </w:rPr>
-              <w:t xml:space="preserve">Theme choice, prototype app, demo account per role</w:t>
+              <w:t xml:space="preserve">Prototype app, demo account per role, application, unit and journey tests, build report</w:t>
             </w:r>
           </w:p>
         </w:tc>
@@ -2686,93 +2686,7 @@
                 <w:sz w:val="16"/>
                 <w:szCs w:val="16"/>
               </w:rPr>
-              <w:t xml:space="preserve">Every screen has a page; app bundles</w:t>
-            </w:r>
-          </w:p>
-        </w:tc>
-      </w:tr>
-      <w:tr>
-        <w:trPr>
-          <w:cantSplit/>
-        </w:trPr>
-        <w:tc>
-          <w:tcPr>
-            <w:tcW w:type="dxa" w:w="1050"/>
-            <w:tcMar>
-              <w:top w:type="dxa" w:w="20"/>
-              <w:left w:type="dxa" w:w="45"/>
-              <w:bottom w:type="dxa" w:w="20"/>
-              <w:right w:type="dxa" w:w="45"/>
-            </w:tcMar>
-            <w:vAlign w:val="center"/>
-          </w:tcPr>
-          <w:p>
-            <w:pPr>
-              <w:spacing w:after="0"/>
-              <w:jc w:val="left"/>
-            </w:pPr>
-            <w:r>
-              <w:rPr>
-                <w:b w:val="false"/>
-                <w:bCs w:val="false"/>
-                <w:sz w:val="16"/>
-                <w:szCs w:val="16"/>
-              </w:rPr>
-              <w:t xml:space="preserve">Builder</w:t>
-            </w:r>
-          </w:p>
-        </w:tc>
-        <w:tc>
-          <w:tcPr>
-            <w:tcW w:type="dxa" w:w="2071"/>
-            <w:tcMar>
-              <w:top w:type="dxa" w:w="20"/>
-              <w:left w:type="dxa" w:w="45"/>
-              <w:bottom w:type="dxa" w:w="20"/>
-              <w:right w:type="dxa" w:w="45"/>
-            </w:tcMar>
-            <w:vAlign w:val="center"/>
-          </w:tcPr>
-          <w:p>
-            <w:pPr>
-              <w:spacing w:after="0"/>
-              <w:jc w:val="left"/>
-            </w:pPr>
-            <w:r>
-              <w:rPr>
-                <w:b w:val="false"/>
-                <w:bCs w:val="false"/>
-                <w:sz w:val="16"/>
-                <w:szCs w:val="16"/>
-              </w:rPr>
-              <w:t xml:space="preserve">Application, unit and journey tests, build report</w:t>
-            </w:r>
-          </w:p>
-        </w:tc>
-        <w:tc>
-          <w:tcPr>
-            <w:tcW w:type="dxa" w:w="1900"/>
-            <w:tcMar>
-              <w:top w:type="dxa" w:w="20"/>
-              <w:left w:type="dxa" w:w="45"/>
-              <w:bottom w:type="dxa" w:w="20"/>
-              <w:right w:type="dxa" w:w="45"/>
-            </w:tcMar>
-            <w:vAlign w:val="center"/>
-          </w:tcPr>
-          <w:p>
-            <w:pPr>
-              <w:spacing w:after="0"/>
-              <w:jc w:val="left"/>
-            </w:pPr>
-            <w:r>
-              <w:rPr>
-                <w:b w:val="false"/>
-                <w:bCs w:val="false"/>
-                <w:sz w:val="16"/>
-                <w:szCs w:val="16"/>
-              </w:rPr>
-              <w:t xml:space="preserve">Phase files; named-page gate; sign-in page</w:t>
+              <w:t xml:space="preserve">Every screen has a page; phase files; named-page gate; sign-in page</w:t>
             </w:r>
           </w:p>
         </w:tc>

</xml_diff>

<commit_message>
Add a Human in the Loop subsection to the paper's System Design
Section III-H says what the user decides at each stage: approvals, chat at any
stage with plan-first changes and versions, the select, pencil and text tools
on the previews, the design customiser, permission cards, Stop and the Yes/No
rounds. A new table lists the user's actions stage by stage.

To stay at six pages, the roles table (which repeated Fig. 1) and three
lightly used references were removed and a few paragraphs were tightened.
Table references are now numbered by the build.

Co-Authored-By: Claude Opus 5.5 <noreply@anthropic.com>
Claude-Session: https://claude.ai/code/session_0111Df7UgJw8J3KuMVvbeH3J
</commit_message>
<xml_diff>
--- a/research/paper/AgentForge_ICAC2026_Paper.docx
+++ b/research/paper/AgentForge_ICAC2026_Paper.docx
@@ -38,7 +38,7 @@
           <w:sz w:val="18"/>
           <w:szCs w:val="18"/>
         </w:rPr>
-        <w:t xml:space="preserve">Large language models can now write most of a web application, yet the agent’s own report that the work is finished remains the weakest evidence in the process. This paper presents AgentForge, a desktop system in which four LLM agent roles (requirements and design, prototype and build, quality assurance, and deployment) carry a product idea through an adaptive interview, an approved plan, a requirements specification with eleven kinds of diagrams, wireframes, an interactive prototype, a phased build, browser-level testing and a cloud deployment. The roles share one tool-calling engine and hand work to each other through a project record on disk. Every hand-off is checked by code rather than by a model: a depth floor on the plan; schema, plan-coverage and evidence audits on the specification; a named-page gate on the build; requirement verdicts computed from test-runner output; and a probe of the deployed HTTPS address that the deploying agent does not control. Personal data typed by the user is replaced with placeholders before every model request and restored in the generated artifacts. Measurements taken during development show three effects. Writing the specification as five parallel parts cut its generation for a 31-page store from 546 s to 141 s. One conversation carried through a build grew to 900,000 tokens and made each model call about four times slower, which moved the hand-off from the conversation to files. Computing requirement status from test results corrected a report of 0 of 116 requirements met after every test had passed. A protocol for a controlled evaluation is specified.</w:t>
+        <w:t xml:space="preserve">Large language models can now write most of a web application, yet the agent’s own report that the work is finished remains the weakest evidence in the process. AgentForge is a desktop system in which four LLM agent roles (requirements and design, prototype and build, quality assurance, and deployment) take a product idea through an adaptive interview, an approved plan, a requirements specification, wireframes, a prototype, a phased build, browser-level testing and a cloud deployment. The roles share one tool-calling engine and hand off through a project record on disk, and every hand-off is checked by code: a depth floor on the plan, coverage and evidence audits on the specification, a named-page gate on the build, requirement verdicts computed from test output, and a probe of the deployed HTTPS address. The user approves each major stage and can change any stage by chat or by pointing at the page, and typed personal data is replaced with placeholders before every model request. During development, writing the specification as five parallel parts cut its generation for a 31-page store from 546 s to 141 s; a build conversation that grew to 900,000 tokens made each call about four times slower, which moved the hand-off to files; and computed requirement status corrected a report of 0 of 116 requirements met after every test had passed. A controlled evaluation protocol is specified.</w:t>
       </w:r>
     </w:p>
     <w:p>
@@ -232,7 +232,7 @@
           <w:sz w:val="20"/>
           <w:szCs w:val="20"/>
         </w:rPr>
-        <w:t xml:space="preserve">A pipeline from a one-sentence idea to a live HTTPS address in which four agent roles share one engine and one on-disk project record (Section III).</w:t>
+        <w:t xml:space="preserve">A pipeline from a one-sentence idea to a live HTTPS address in which four agent roles share one engine and one on-disk project record, and the user approves and can steer every stage (Section III).</w:t>
       </w:r>
     </w:p>
     <w:p>
@@ -496,7 +496,7 @@
           <w:sz w:val="20"/>
           <w:szCs w:val="20"/>
         </w:rPr>
-        <w:t xml:space="preserve">Dividing a problem among communicating specialists predates language models </w:t>
+        <w:t xml:space="preserve">LLM-based multi-agent systems differ mainly in how agents coordinate. ChatDev runs a virtual software company through chat-chained waterfall phases </w:t>
       </w:r>
       <w:r>
         <w:rPr>
@@ -510,7 +510,7 @@
           <w:sz w:val="20"/>
           <w:szCs w:val="20"/>
         </w:rPr>
-        <w:t xml:space="preserve">, </w:t>
+        <w:t xml:space="preserve">. MetaGPT encodes standard operating procedures as roles that exchange structured documents </w:t>
       </w:r>
       <w:r>
         <w:rPr>
@@ -524,7 +524,7 @@
           <w:sz w:val="20"/>
           <w:szCs w:val="20"/>
         </w:rPr>
-        <w:t xml:space="preserve">. The LLM-based versions differ mainly in how agents coordinate. ChatDev runs a virtual software company through chat-chained waterfall phases </w:t>
+        <w:t xml:space="preserve">. AutoGen frames collaboration as programmable multi-agent conversation </w:t>
       </w:r>
       <w:r>
         <w:rPr>
@@ -538,7 +538,7 @@
           <w:sz w:val="20"/>
           <w:szCs w:val="20"/>
         </w:rPr>
-        <w:t xml:space="preserve">. MetaGPT encodes standard operating procedures as roles that exchange structured documents </w:t>
+        <w:t xml:space="preserve">, and AgentCoder separates a programmer agent from a test designer and a test executor, showing that independently written tests improve the final code </w:t>
       </w:r>
       <w:r>
         <w:rPr>
@@ -552,35 +552,21 @@
           <w:sz w:val="20"/>
           <w:szCs w:val="20"/>
         </w:rPr>
-        <w:t xml:space="preserve">. AutoGen frames collaboration as programmable multi-agent conversation </w:t>
-      </w:r>
-      <w:r>
-        <w:rPr>
-          <w:sz w:val="20"/>
-          <w:szCs w:val="20"/>
-        </w:rPr>
-        <w:t xml:space="preserve">[13]</w:t>
-      </w:r>
-      <w:r>
-        <w:rPr>
-          <w:sz w:val="20"/>
-          <w:szCs w:val="20"/>
-        </w:rPr>
-        <w:t xml:space="preserve">, and AgentCoder separates a programmer agent from a test designer and a test executor, showing that independently written tests improve the final code </w:t>
-      </w:r>
-      <w:r>
-        <w:rPr>
-          <w:sz w:val="20"/>
-          <w:szCs w:val="20"/>
-        </w:rPr>
-        <w:t xml:space="preserve">[14]</w:t>
-      </w:r>
-      <w:r>
-        <w:rPr>
-          <w:sz w:val="20"/>
-          <w:szCs w:val="20"/>
-        </w:rPr>
-        <w:t xml:space="preserve">. As described in their papers, these systems start from a requirement given as text and end with source code. Interviewing the user, holding the result to a plan the user approved and carrying the application to a deployed address are outside their scope (Table I).</w:t>
+        <w:t xml:space="preserve">. As described in their papers, these systems start from a requirement given as text and end with source code. Interviewing the user, holding the result to a plan the user approved and carrying the application to a deployed address are outside their scope (Table </w:t>
+      </w:r>
+      <w:r>
+        <w:rPr>
+          <w:sz w:val="20"/>
+          <w:szCs w:val="20"/>
+        </w:rPr>
+        <w:t xml:space="preserve">I</w:t>
+      </w:r>
+      <w:r>
+        <w:rPr>
+          <w:sz w:val="20"/>
+          <w:szCs w:val="20"/>
+        </w:rPr>
+        <w:t xml:space="preserve">).</w:t>
       </w:r>
     </w:p>
     <w:p>
@@ -695,7 +681,7 @@
                 <w:sz w:val="14"/>
                 <w:szCs w:val="14"/>
               </w:rPr>
-              <w:t xml:space="preserve">[11]</w:t>
+              <w:t xml:space="preserve">[9]</w:t>
             </w:r>
           </w:p>
         </w:tc>
@@ -737,7 +723,7 @@
                 <w:sz w:val="14"/>
                 <w:szCs w:val="14"/>
               </w:rPr>
-              <w:t xml:space="preserve">[12]</w:t>
+              <w:t xml:space="preserve">[10]</w:t>
             </w:r>
           </w:p>
         </w:tc>
@@ -779,7 +765,7 @@
                 <w:sz w:val="14"/>
                 <w:szCs w:val="14"/>
               </w:rPr>
-              <w:t xml:space="preserve">[13]</w:t>
+              <w:t xml:space="preserve">[11]</w:t>
             </w:r>
           </w:p>
         </w:tc>
@@ -821,7 +807,7 @@
                 <w:sz w:val="14"/>
                 <w:szCs w:val="14"/>
               </w:rPr>
-              <w:t xml:space="preserve">[14]</w:t>
+              <w:t xml:space="preserve">[12]</w:t>
             </w:r>
           </w:p>
         </w:tc>
@@ -2035,7 +2021,7 @@
           <w:sz w:val="14"/>
           <w:szCs w:val="14"/>
         </w:rPr>
-        <w:t xml:space="preserve">Partial: MetaGPT writes structured requirement and design documents but does not check them against a plan the user approved; ChatDev, MetaGPT and AutoGen run generated code and feed errors back without a pass criterion fixed in advance.</w:t>
+        <w:t xml:space="preserve">Partial: MetaGPT’s structured documents are not checked against a plan the user approved; ChatDev, MetaGPT and AutoGen feed run errors back without a pass criterion fixed in advance.</w:t>
       </w:r>
     </w:p>
     <w:p>
@@ -2064,7 +2050,35 @@
           <w:sz w:val="20"/>
           <w:szCs w:val="20"/>
         </w:rPr>
-        <w:t xml:space="preserve">Self-Refine loops a model over its own critique of one output </w:t>
+        <w:t xml:space="preserve">Self-Refine loops a model over its own critique </w:t>
+      </w:r>
+      <w:r>
+        <w:rPr>
+          <w:sz w:val="20"/>
+          <w:szCs w:val="20"/>
+        </w:rPr>
+        <w:t xml:space="preserve">[13]</w:t>
+      </w:r>
+      <w:r>
+        <w:rPr>
+          <w:sz w:val="20"/>
+          <w:szCs w:val="20"/>
+        </w:rPr>
+        <w:t xml:space="preserve">, and Reflexion turns failure feedback into verbal memory across attempts </w:t>
+      </w:r>
+      <w:r>
+        <w:rPr>
+          <w:sz w:val="20"/>
+          <w:szCs w:val="20"/>
+        </w:rPr>
+        <w:t xml:space="preserve">[14]</w:t>
+      </w:r>
+      <w:r>
+        <w:rPr>
+          <w:sz w:val="20"/>
+          <w:szCs w:val="20"/>
+        </w:rPr>
+        <w:t xml:space="preserve">; both let the model judge its own work. Without external feedback, models do not reliably correct their reasoning </w:t>
       </w:r>
       <w:r>
         <w:rPr>
@@ -2078,7 +2092,7 @@
           <w:sz w:val="20"/>
           <w:szCs w:val="20"/>
         </w:rPr>
-        <w:t xml:space="preserve">, and Reflexion turns failure feedback into verbal memory across attempts at a task </w:t>
+        <w:t xml:space="preserve">, and LLM judges show position, verbosity and self-enhancement biases </w:t>
       </w:r>
       <w:r>
         <w:rPr>
@@ -2092,7 +2106,7 @@
           <w:sz w:val="20"/>
           <w:szCs w:val="20"/>
         </w:rPr>
-        <w:t xml:space="preserve">. Both rely on the model to judge its own work. Without external feedback, models do not reliably correct their own reasoning </w:t>
+        <w:t xml:space="preserve">. Models also use the middle of a long context less well than its ends </w:t>
       </w:r>
       <w:r>
         <w:rPr>
@@ -2106,35 +2120,7 @@
           <w:sz w:val="20"/>
           <w:szCs w:val="20"/>
         </w:rPr>
-        <w:t xml:space="preserve">, and LLM judges show position, verbosity and self-enhancement biases </w:t>
-      </w:r>
-      <w:r>
-        <w:rPr>
-          <w:sz w:val="20"/>
-          <w:szCs w:val="20"/>
-        </w:rPr>
-        <w:t xml:space="preserve">[18]</w:t>
-      </w:r>
-      <w:r>
-        <w:rPr>
-          <w:sz w:val="20"/>
-          <w:szCs w:val="20"/>
-        </w:rPr>
-        <w:t xml:space="preserve">. Long inputs bring a separate cost: models use information in the middle of a long context less well than information at its ends </w:t>
-      </w:r>
-      <w:r>
-        <w:rPr>
-          <w:sz w:val="20"/>
-          <w:szCs w:val="20"/>
-        </w:rPr>
-        <w:t xml:space="preserve">[19]</w:t>
-      </w:r>
-      <w:r>
-        <w:rPr>
-          <w:sz w:val="20"/>
-          <w:szCs w:val="20"/>
-        </w:rPr>
-        <w:t xml:space="preserve">. AgentForge keeps model critique where a picture or a document must be read, but the pass or fail decision is always a function of files on disk.</w:t>
+        <w:t xml:space="preserve">. AgentForge keeps model critique where a picture or a document must be read, but pass or fail is always a function of files on disk.</w:t>
       </w:r>
     </w:p>
     <w:p>
@@ -2170,49 +2156,35 @@
           <w:sz w:val="20"/>
           <w:szCs w:val="20"/>
         </w:rPr>
+        <w:t xml:space="preserve">[18]</w:t>
+      </w:r>
+      <w:r>
+        <w:rPr>
+          <w:sz w:val="20"/>
+          <w:szCs w:val="20"/>
+        </w:rPr>
+        <w:t xml:space="preserve">. Public corpora such as PURE </w:t>
+      </w:r>
+      <w:r>
+        <w:rPr>
+          <w:sz w:val="20"/>
+          <w:szCs w:val="20"/>
+        </w:rPr>
+        <w:t xml:space="preserve">[19]</w:t>
+      </w:r>
+      <w:r>
+        <w:rPr>
+          <w:sz w:val="20"/>
+          <w:szCs w:val="20"/>
+        </w:rPr>
+        <w:t xml:space="preserve"> make requirement quality measurable, and multi-agent LLM pipelines have been used to derive UML models from natural-language requirements </w:t>
+      </w:r>
+      <w:r>
+        <w:rPr>
+          <w:sz w:val="20"/>
+          <w:szCs w:val="20"/>
+        </w:rPr>
         <w:t xml:space="preserve">[20]</w:t>
-      </w:r>
-      <w:r>
-        <w:rPr>
-          <w:sz w:val="20"/>
-          <w:szCs w:val="20"/>
-        </w:rPr>
-        <w:t xml:space="preserve">. Public corpora such as PURE </w:t>
-      </w:r>
-      <w:r>
-        <w:rPr>
-          <w:sz w:val="20"/>
-          <w:szCs w:val="20"/>
-        </w:rPr>
-        <w:t xml:space="preserve">[21]</w:t>
-      </w:r>
-      <w:r>
-        <w:rPr>
-          <w:sz w:val="20"/>
-          <w:szCs w:val="20"/>
-        </w:rPr>
-        <w:t xml:space="preserve"> and the expanded PROMISE set </w:t>
-      </w:r>
-      <w:r>
-        <w:rPr>
-          <w:sz w:val="20"/>
-          <w:szCs w:val="20"/>
-        </w:rPr>
-        <w:t xml:space="preserve">[22]</w:t>
-      </w:r>
-      <w:r>
-        <w:rPr>
-          <w:sz w:val="20"/>
-          <w:szCs w:val="20"/>
-        </w:rPr>
-        <w:t xml:space="preserve"> make requirement quality measurable, and multi-agent LLM pipelines have been used to derive UML models from natural-language requirements </w:t>
-      </w:r>
-      <w:r>
-        <w:rPr>
-          <w:sz w:val="20"/>
-          <w:szCs w:val="20"/>
-        </w:rPr>
-        <w:t xml:space="preserve">[23]</w:t>
       </w:r>
       <w:r>
         <w:rPr>
@@ -2344,7 +2316,7 @@
           <w:sz w:val="20"/>
           <w:szCs w:val="20"/>
         </w:rPr>
-        <w:t xml:space="preserve">The pipeline has nine stages: interview, plan, specification, wireframes, design, prototype, build, test and deploy. Four agent roles own them (Table II). A role is not a separate process or a separate model. It is a set of prompts, a stage of the project and a label on the events the Studio shows. All four run on the same engine against the same workspace, and every instruction a model receives is a Markdown file under </w:t>
+        <w:t xml:space="preserve">The pipeline has nine stages: interview, plan, specification, wireframes, design, prototype, build, test and deploy. Four agent roles own them (Fig. 1). A role is not a separate process or a separate model. It is a set of prompts, a stage of the project and a label on the events the Studio shows. All four run on the same engine against the same workspace, and every instruction a model receives is a Markdown file under </w:t>
       </w:r>
       <w:r>
         <w:rPr>
@@ -2396,482 +2368,6 @@
     <w:p>
       <w:pPr>
         <w:keepNext/>
-        <w:spacing w:after="80" w:before="160"/>
-        <w:jc w:val="center"/>
-      </w:pPr>
-      <w:r>
-        <w:rPr>
-          <w:smallCaps/>
-          <w:sz w:val="16"/>
-          <w:szCs w:val="16"/>
-        </w:rPr>
-        <w:t xml:space="preserve">TABLE II.  </w:t>
-      </w:r>
-      <w:r>
-        <w:rPr>
-          <w:smallCaps/>
-          <w:sz w:val="16"/>
-          <w:szCs w:val="16"/>
-        </w:rPr>
-        <w:t xml:space="preserve">Agent Roles, What They Produce and What Checks Them</w:t>
-      </w:r>
-    </w:p>
-    <w:tbl>
-      <w:tblPr>
-        <w:tblW w:type="dxa" w:w="5021"/>
-        <w:tblBorders>
-          <w:top w:val="single" w:color="000000" w:sz="4"/>
-          <w:left w:val="single" w:color="000000" w:sz="4"/>
-          <w:bottom w:val="single" w:color="000000" w:sz="4"/>
-          <w:right w:val="single" w:color="000000" w:sz="4"/>
-          <w:insideH w:val="single" w:color="000000" w:sz="4"/>
-          <w:insideV w:val="single" w:color="000000" w:sz="4"/>
-        </w:tblBorders>
-      </w:tblPr>
-      <w:tblGrid>
-        <w:gridCol w:w="1050"/>
-        <w:gridCol w:w="2071"/>
-        <w:gridCol w:w="1900"/>
-      </w:tblGrid>
-      <w:tr>
-        <w:trPr>
-          <w:tblHeader/>
-        </w:trPr>
-        <w:tc>
-          <w:tcPr>
-            <w:tcW w:type="dxa" w:w="1050"/>
-            <w:tcMar>
-              <w:top w:type="dxa" w:w="20"/>
-              <w:left w:type="dxa" w:w="45"/>
-              <w:bottom w:type="dxa" w:w="20"/>
-              <w:right w:type="dxa" w:w="45"/>
-            </w:tcMar>
-            <w:vAlign w:val="center"/>
-          </w:tcPr>
-          <w:p>
-            <w:pPr>
-              <w:spacing w:after="0"/>
-              <w:jc w:val="center"/>
-            </w:pPr>
-            <w:r>
-              <w:rPr>
-                <w:b/>
-                <w:bCs/>
-                <w:sz w:val="16"/>
-                <w:szCs w:val="16"/>
-              </w:rPr>
-              <w:t xml:space="preserve">Role</w:t>
-            </w:r>
-          </w:p>
-        </w:tc>
-        <w:tc>
-          <w:tcPr>
-            <w:tcW w:type="dxa" w:w="2071"/>
-            <w:tcMar>
-              <w:top w:type="dxa" w:w="20"/>
-              <w:left w:type="dxa" w:w="45"/>
-              <w:bottom w:type="dxa" w:w="20"/>
-              <w:right w:type="dxa" w:w="45"/>
-            </w:tcMar>
-            <w:vAlign w:val="center"/>
-          </w:tcPr>
-          <w:p>
-            <w:pPr>
-              <w:spacing w:after="0"/>
-              <w:jc w:val="center"/>
-            </w:pPr>
-            <w:r>
-              <w:rPr>
-                <w:b/>
-                <w:bCs/>
-                <w:sz w:val="16"/>
-                <w:szCs w:val="16"/>
-              </w:rPr>
-              <w:t xml:space="preserve">Produces</w:t>
-            </w:r>
-          </w:p>
-        </w:tc>
-        <w:tc>
-          <w:tcPr>
-            <w:tcW w:type="dxa" w:w="1900"/>
-            <w:tcMar>
-              <w:top w:type="dxa" w:w="20"/>
-              <w:left w:type="dxa" w:w="45"/>
-              <w:bottom w:type="dxa" w:w="20"/>
-              <w:right w:type="dxa" w:w="45"/>
-            </w:tcMar>
-            <w:vAlign w:val="center"/>
-          </w:tcPr>
-          <w:p>
-            <w:pPr>
-              <w:spacing w:after="0"/>
-              <w:jc w:val="center"/>
-            </w:pPr>
-            <w:r>
-              <w:rPr>
-                <w:b/>
-                <w:bCs/>
-                <w:sz w:val="16"/>
-                <w:szCs w:val="16"/>
-              </w:rPr>
-              <w:t xml:space="preserve">Checked by code</w:t>
-            </w:r>
-          </w:p>
-        </w:tc>
-      </w:tr>
-      <w:tr>
-        <w:trPr>
-          <w:cantSplit/>
-        </w:trPr>
-        <w:tc>
-          <w:tcPr>
-            <w:tcW w:type="dxa" w:w="1050"/>
-            <w:tcMar>
-              <w:top w:type="dxa" w:w="20"/>
-              <w:left w:type="dxa" w:w="45"/>
-              <w:bottom w:type="dxa" w:w="20"/>
-              <w:right w:type="dxa" w:w="45"/>
-            </w:tcMar>
-            <w:vAlign w:val="center"/>
-          </w:tcPr>
-          <w:p>
-            <w:pPr>
-              <w:spacing w:after="0"/>
-              <w:jc w:val="left"/>
-            </w:pPr>
-            <w:r>
-              <w:rPr>
-                <w:b w:val="false"/>
-                <w:bCs w:val="false"/>
-                <w:sz w:val="16"/>
-                <w:szCs w:val="16"/>
-              </w:rPr>
-              <w:t xml:space="preserve">Requirements + Designer</w:t>
-            </w:r>
-          </w:p>
-        </w:tc>
-        <w:tc>
-          <w:tcPr>
-            <w:tcW w:type="dxa" w:w="2071"/>
-            <w:tcMar>
-              <w:top w:type="dxa" w:w="20"/>
-              <w:left w:type="dxa" w:w="45"/>
-              <w:bottom w:type="dxa" w:w="20"/>
-              <w:right w:type="dxa" w:w="45"/>
-            </w:tcMar>
-            <w:vAlign w:val="center"/>
-          </w:tcPr>
-          <w:p>
-            <w:pPr>
-              <w:spacing w:after="0"/>
-              <w:jc w:val="left"/>
-            </w:pPr>
-            <w:r>
-              <w:rPr>
-                <w:b w:val="false"/>
-                <w:bCs w:val="false"/>
-                <w:sz w:val="16"/>
-                <w:szCs w:val="16"/>
-              </w:rPr>
-              <w:t xml:space="preserve">Interview, plan, specification, 11 diagrams, hand-off files, wireframes, theme choice</w:t>
-            </w:r>
-          </w:p>
-        </w:tc>
-        <w:tc>
-          <w:tcPr>
-            <w:tcW w:type="dxa" w:w="1900"/>
-            <w:tcMar>
-              <w:top w:type="dxa" w:w="20"/>
-              <w:left w:type="dxa" w:w="45"/>
-              <w:bottom w:type="dxa" w:w="20"/>
-              <w:right w:type="dxa" w:w="45"/>
-            </w:tcMar>
-            <w:vAlign w:val="center"/>
-          </w:tcPr>
-          <w:p>
-            <w:pPr>
-              <w:spacing w:after="0"/>
-              <w:jc w:val="left"/>
-            </w:pPr>
-            <w:r>
-              <w:rPr>
-                <w:b w:val="false"/>
-                <w:bCs w:val="false"/>
-                <w:sz w:val="16"/>
-                <w:szCs w:val="16"/>
-              </w:rPr>
-              <w:t xml:space="preserve">Depth floor; schema; plan coverage; evidence audit</w:t>
-            </w:r>
-          </w:p>
-        </w:tc>
-      </w:tr>
-      <w:tr>
-        <w:trPr>
-          <w:cantSplit/>
-        </w:trPr>
-        <w:tc>
-          <w:tcPr>
-            <w:tcW w:type="dxa" w:w="1050"/>
-            <w:tcMar>
-              <w:top w:type="dxa" w:w="20"/>
-              <w:left w:type="dxa" w:w="45"/>
-              <w:bottom w:type="dxa" w:w="20"/>
-              <w:right w:type="dxa" w:w="45"/>
-            </w:tcMar>
-            <w:vAlign w:val="center"/>
-          </w:tcPr>
-          <w:p>
-            <w:pPr>
-              <w:spacing w:after="0"/>
-              <w:jc w:val="left"/>
-            </w:pPr>
-            <w:r>
-              <w:rPr>
-                <w:b w:val="false"/>
-                <w:bCs w:val="false"/>
-                <w:sz w:val="16"/>
-                <w:szCs w:val="16"/>
-              </w:rPr>
-              <w:t xml:space="preserve">Prototype + Builder</w:t>
-            </w:r>
-          </w:p>
-        </w:tc>
-        <w:tc>
-          <w:tcPr>
-            <w:tcW w:type="dxa" w:w="2071"/>
-            <w:tcMar>
-              <w:top w:type="dxa" w:w="20"/>
-              <w:left w:type="dxa" w:w="45"/>
-              <w:bottom w:type="dxa" w:w="20"/>
-              <w:right w:type="dxa" w:w="45"/>
-            </w:tcMar>
-            <w:vAlign w:val="center"/>
-          </w:tcPr>
-          <w:p>
-            <w:pPr>
-              <w:spacing w:after="0"/>
-              <w:jc w:val="left"/>
-            </w:pPr>
-            <w:r>
-              <w:rPr>
-                <w:b w:val="false"/>
-                <w:bCs w:val="false"/>
-                <w:sz w:val="16"/>
-                <w:szCs w:val="16"/>
-              </w:rPr>
-              <w:t xml:space="preserve">Prototype app, demo account per role, application, unit and journey tests, build report</w:t>
-            </w:r>
-          </w:p>
-        </w:tc>
-        <w:tc>
-          <w:tcPr>
-            <w:tcW w:type="dxa" w:w="1900"/>
-            <w:tcMar>
-              <w:top w:type="dxa" w:w="20"/>
-              <w:left w:type="dxa" w:w="45"/>
-              <w:bottom w:type="dxa" w:w="20"/>
-              <w:right w:type="dxa" w:w="45"/>
-            </w:tcMar>
-            <w:vAlign w:val="center"/>
-          </w:tcPr>
-          <w:p>
-            <w:pPr>
-              <w:spacing w:after="0"/>
-              <w:jc w:val="left"/>
-            </w:pPr>
-            <w:r>
-              <w:rPr>
-                <w:b w:val="false"/>
-                <w:bCs w:val="false"/>
-                <w:sz w:val="16"/>
-                <w:szCs w:val="16"/>
-              </w:rPr>
-              <w:t xml:space="preserve">Every screen has a page; phase files; named-page gate; sign-in page</w:t>
-            </w:r>
-          </w:p>
-        </w:tc>
-      </w:tr>
-      <w:tr>
-        <w:trPr>
-          <w:cantSplit/>
-        </w:trPr>
-        <w:tc>
-          <w:tcPr>
-            <w:tcW w:type="dxa" w:w="1050"/>
-            <w:tcMar>
-              <w:top w:type="dxa" w:w="20"/>
-              <w:left w:type="dxa" w:w="45"/>
-              <w:bottom w:type="dxa" w:w="20"/>
-              <w:right w:type="dxa" w:w="45"/>
-            </w:tcMar>
-            <w:vAlign w:val="center"/>
-          </w:tcPr>
-          <w:p>
-            <w:pPr>
-              <w:spacing w:after="0"/>
-              <w:jc w:val="left"/>
-            </w:pPr>
-            <w:r>
-              <w:rPr>
-                <w:b w:val="false"/>
-                <w:bCs w:val="false"/>
-                <w:sz w:val="16"/>
-                <w:szCs w:val="16"/>
-              </w:rPr>
-              <w:t xml:space="preserve">QA</w:t>
-            </w:r>
-          </w:p>
-        </w:tc>
-        <w:tc>
-          <w:tcPr>
-            <w:tcW w:type="dxa" w:w="2071"/>
-            <w:tcMar>
-              <w:top w:type="dxa" w:w="20"/>
-              <w:left w:type="dxa" w:w="45"/>
-              <w:bottom w:type="dxa" w:w="20"/>
-              <w:right w:type="dxa" w:w="45"/>
-            </w:tcMar>
-            <w:vAlign w:val="center"/>
-          </w:tcPr>
-          <w:p>
-            <w:pPr>
-              <w:spacing w:after="0"/>
-              <w:jc w:val="left"/>
-            </w:pPr>
-            <w:r>
-              <w:rPr>
-                <w:b w:val="false"/>
-                <w:bCs w:val="false"/>
-                <w:sz w:val="16"/>
-                <w:szCs w:val="16"/>
-              </w:rPr>
-              <w:t xml:space="preserve">Page and journey fixes, a11y, performance and security results</w:t>
-            </w:r>
-          </w:p>
-        </w:tc>
-        <w:tc>
-          <w:tcPr>
-            <w:tcW w:type="dxa" w:w="1900"/>
-            <w:tcMar>
-              <w:top w:type="dxa" w:w="20"/>
-              <w:left w:type="dxa" w:w="45"/>
-              <w:bottom w:type="dxa" w:w="20"/>
-              <w:right w:type="dxa" w:w="45"/>
-            </w:tcMar>
-            <w:vAlign w:val="center"/>
-          </w:tcPr>
-          <w:p>
-            <w:pPr>
-              <w:spacing w:after="0"/>
-              <w:jc w:val="left"/>
-            </w:pPr>
-            <w:r>
-              <w:rPr>
-                <w:b w:val="false"/>
-                <w:bCs w:val="false"/>
-                <w:sz w:val="16"/>
-                <w:szCs w:val="16"/>
-              </w:rPr>
-              <w:t xml:space="preserve">Runner output; Eq. (1); runtime check</w:t>
-            </w:r>
-          </w:p>
-        </w:tc>
-      </w:tr>
-      <w:tr>
-        <w:trPr>
-          <w:cantSplit/>
-        </w:trPr>
-        <w:tc>
-          <w:tcPr>
-            <w:tcW w:type="dxa" w:w="1050"/>
-            <w:tcMar>
-              <w:top w:type="dxa" w:w="20"/>
-              <w:left w:type="dxa" w:w="45"/>
-              <w:bottom w:type="dxa" w:w="20"/>
-              <w:right w:type="dxa" w:w="45"/>
-            </w:tcMar>
-            <w:vAlign w:val="center"/>
-          </w:tcPr>
-          <w:p>
-            <w:pPr>
-              <w:spacing w:after="0"/>
-              <w:jc w:val="left"/>
-            </w:pPr>
-            <w:r>
-              <w:rPr>
-                <w:b w:val="false"/>
-                <w:bCs w:val="false"/>
-                <w:sz w:val="16"/>
-                <w:szCs w:val="16"/>
-              </w:rPr>
-              <w:t xml:space="preserve">Deployment</w:t>
-            </w:r>
-          </w:p>
-        </w:tc>
-        <w:tc>
-          <w:tcPr>
-            <w:tcW w:type="dxa" w:w="2071"/>
-            <w:tcMar>
-              <w:top w:type="dxa" w:w="20"/>
-              <w:left w:type="dxa" w:w="45"/>
-              <w:bottom w:type="dxa" w:w="20"/>
-              <w:right w:type="dxa" w:w="45"/>
-            </w:tcMar>
-            <w:vAlign w:val="center"/>
-          </w:tcPr>
-          <w:p>
-            <w:pPr>
-              <w:spacing w:after="0"/>
-              <w:jc w:val="left"/>
-            </w:pPr>
-            <w:r>
-              <w:rPr>
-                <w:b w:val="false"/>
-                <w:bCs w:val="false"/>
-                <w:sz w:val="16"/>
-                <w:szCs w:val="16"/>
-              </w:rPr>
-              <w:t xml:space="preserve">Plan the user approves, release, run record</w:t>
-            </w:r>
-          </w:p>
-        </w:tc>
-        <w:tc>
-          <w:tcPr>
-            <w:tcW w:type="dxa" w:w="1900"/>
-            <w:tcMar>
-              <w:top w:type="dxa" w:w="20"/>
-              <w:left w:type="dxa" w:w="45"/>
-              <w:bottom w:type="dxa" w:w="20"/>
-              <w:right w:type="dxa" w:w="45"/>
-            </w:tcMar>
-            <w:vAlign w:val="center"/>
-          </w:tcPr>
-          <w:p>
-            <w:pPr>
-              <w:spacing w:after="0"/>
-              <w:jc w:val="left"/>
-            </w:pPr>
-            <w:r>
-              <w:rPr>
-                <w:b w:val="false"/>
-                <w:bCs w:val="false"/>
-                <w:sz w:val="16"/>
-                <w:szCs w:val="16"/>
-              </w:rPr>
-              <w:t xml:space="preserve">HTTPS probe by the Studio; one repair</w:t>
-            </w:r>
-          </w:p>
-        </w:tc>
-      </w:tr>
-    </w:tbl>
-    <w:p>
-      <w:pPr>
-        <w:spacing w:after="80"/>
-      </w:pPr>
-    </w:p>
-    <w:p>
-      <w:pPr>
-        <w:keepNext/>
         <w:spacing w:after="60" w:before="120"/>
       </w:pPr>
       <w:r>
@@ -2902,7 +2398,7 @@
           <w:sz w:val="20"/>
           <w:szCs w:val="20"/>
         </w:rPr>
-        <w:t xml:space="preserve">[24]</w:t>
+        <w:t xml:space="preserve">[21]</w:t>
       </w:r>
       <w:r>
         <w:rPr>
@@ -2916,7 +2412,7 @@
           <w:sz w:val="20"/>
           <w:szCs w:val="20"/>
         </w:rPr>
-        <w:t xml:space="preserve">[25]</w:t>
+        <w:t xml:space="preserve">[22]</w:t>
       </w:r>
       <w:r>
         <w:rPr>
@@ -2951,7 +2447,7 @@
           <w:sz w:val="20"/>
           <w:szCs w:val="20"/>
         </w:rPr>
-        <w:t xml:space="preserve">The first design kept one conversation per project so that every stage could see everything before it. A compaction step summarised older turns once the conversation passed 88% of the model’s window, four stretches at a time, with a mechanical digest of file paths, commands and requests as the fallback when the model returned no summary. Section V-C shows why that was not enough. Each stage, and each build phase, now starts from a small conversation: earlier turns are archived verbatim, a short memory is kept, and the stage reads what it needs from the record.</w:t>
+        <w:t xml:space="preserve">The first design kept one conversation per project and compacted it into a summary past 88% of the model’s window. Section V-C shows why that was not enough. Each stage and each build phase now starts from a small conversation; earlier turns are archived verbatim and the inputs are read from the record.</w:t>
       </w:r>
     </w:p>
     <w:p>
@@ -2994,7 +2490,7 @@
           <w:sz w:val="20"/>
           <w:szCs w:val="20"/>
         </w:rPr>
-        <w:t xml:space="preserve">The plan is what the user approves, and it is a ceiling: the specification’s pages come from its screens, its tables from its records and its roles from its users. A depth floor rejects a plan that cannot be built from. The product intent must be a full paragraph of at least 120 characters, and every screen needs a purpose. In a record-based application every record keeps at least two fields and at least one workflow has two or more steps. If the product has sign-in, at least one role needs two things it can do, the plan must say how accounts are created, and open sign-up may not create a privileged role such as an administrator, manager or cashier.</w:t>
+        <w:t xml:space="preserve">The plan is what the user approves, and it is a ceiling: the specification’s pages come from its screens, its tables from its records and its roles from its users. Its depth floor requires a product intent of at least 120 characters and a purpose for every screen. In a record-based application every record keeps at least two fields and at least one workflow has two or more steps. If the product has sign-in, at least one role needs two things it can do, the plan must say how accounts are created, and open sign-up may not create a privileged role such as an administrator, manager or cashier.</w:t>
       </w:r>
     </w:p>
     <w:p>
@@ -3054,7 +2550,7 @@
           <w:sz w:val="20"/>
           <w:szCs w:val="20"/>
         </w:rPr>
-        <w:t xml:space="preserve"> is seven fixed rules: both requirement sets exist; identifiers follow FR-### or NFR-### and are unique; each requirement says “shall”; each names a verification method from a fixed list; each functional requirement has a rationale; each non-functional requirement carries a number with a unit or a named standard; and each functional requirement has exactly one traceability row with a test case. A model reviewer then scores functional, non-functional, security, ambiguity and traceability quality from 0 to 5 and lists findings. A finding that cites a requirement not in the document is rejected, every failed audit rule is added as a blocker, and Python, not the reviewer’s verdict, decides that the draft passed: no blocker and every score at least 3. Repairs are JSON edits applied only if the result still validates. By default one review round runs and its outcome is stamped on the document, because asking a model to rewrite a large specification risked losing content.</w:t>
+        <w:t xml:space="preserve"> is seven fixed rules: both requirement sets exist; identifiers follow FR-### or NFR-### and are unique; each requirement says “shall”; each names a verification method from a fixed list; each functional requirement has a rationale; each non-functional requirement carries a number with a unit or a named standard; and each functional requirement has exactly one traceability row with a test case. A model reviewer then scores functional, non-functional, security, ambiguity and traceability quality from 0 to 5 and lists findings. A finding that cites a requirement not in the document is rejected, every failed audit rule is added as a blocker, and Python, not the reviewer’s verdict, decides that the draft passed: no blocker and every score at least 3. Repairs are JSON edits applied only if the result still validates. By default one review round runs and its result is stamped on the document.</w:t>
       </w:r>
     </w:p>
     <w:p>
@@ -3136,7 +2632,7 @@
           <w:sz w:val="20"/>
           <w:szCs w:val="20"/>
         </w:rPr>
-        <w:t xml:space="preserve">[26]</w:t>
+        <w:t xml:space="preserve">[23]</w:t>
       </w:r>
       <w:r>
         <w:rPr>
@@ -3159,7 +2655,7 @@
           <w:sz w:val="20"/>
           <w:szCs w:val="20"/>
         </w:rPr>
-        <w:t xml:space="preserve"> alone, so they show what the user asked for rather than what the specification inferred. For ten or more screens, one agent writes the shared layout and the first three pages and three agents write the rest in parallel. Three is close to the number of concurrent requests the hosted model service accepts.</w:t>
+        <w:t xml:space="preserve"> alone, so they show what the user asked for rather than what the specification inferred. For ten or more screens, one agent writes the shared layout and the first three pages and three agents write the rest in parallel.</w:t>
       </w:r>
     </w:p>
     <w:p>
@@ -3377,7 +2873,49 @@
           <w:sz w:val="20"/>
           <w:szCs w:val="20"/>
         </w:rPr>
-        <w:t xml:space="preserve">Testing follows a fixed order. Every page is photographed whole at desktop and mobile width, signed in as a role that may open it, and reviewed for visible defects. The Studio then runs each user journey on its own at desktop width, through a runner that starts the production build on a free port and, on MongoDB stacks, with a fresh, uniquely named test database that is dropped afterwards. A failing journey is fixed and rerun, at most twice, before the next one runs. Requirements on pages that no journey visits get tests of their own. The agent then runs the remaining layers once each: visual comparison, accessibility with axe-core </w:t>
+        <w:t xml:space="preserve">Testing follows a fixed order. Every page is photographed whole at desktop and mobile width, signed in as a role that may open it, and reviewed for visible defects. The Studio then runs each user journey on its own with Playwright </w:t>
+      </w:r>
+      <w:r>
+        <w:rPr>
+          <w:sz w:val="20"/>
+          <w:szCs w:val="20"/>
+        </w:rPr>
+        <w:t xml:space="preserve">[24]</w:t>
+      </w:r>
+      <w:r>
+        <w:rPr>
+          <w:sz w:val="20"/>
+          <w:szCs w:val="20"/>
+        </w:rPr>
+        <w:t xml:space="preserve"> against the production build, on MongoDB stacks with a fresh test database that is dropped afterwards. A failing journey is fixed and rerun, at most twice, before the next one runs, and pages that no journey visits get requirement tests of their own. The agent then runs the remaining layers once each: visual comparison, accessibility with axe-core </w:t>
+      </w:r>
+      <w:r>
+        <w:rPr>
+          <w:sz w:val="20"/>
+          <w:szCs w:val="20"/>
+        </w:rPr>
+        <w:t xml:space="preserve">[25]</w:t>
+      </w:r>
+      <w:r>
+        <w:rPr>
+          <w:sz w:val="20"/>
+          <w:szCs w:val="20"/>
+        </w:rPr>
+        <w:t xml:space="preserve">, performance with Lighthouse </w:t>
+      </w:r>
+      <w:r>
+        <w:rPr>
+          <w:sz w:val="20"/>
+          <w:szCs w:val="20"/>
+        </w:rPr>
+        <w:t xml:space="preserve">[26]</w:t>
+      </w:r>
+      <w:r>
+        <w:rPr>
+          <w:sz w:val="20"/>
+          <w:szCs w:val="20"/>
+        </w:rPr>
+        <w:t xml:space="preserve">, a ZAP baseline scan </w:t>
       </w:r>
       <w:r>
         <w:rPr>
@@ -3391,35 +2929,7 @@
           <w:sz w:val="20"/>
           <w:szCs w:val="20"/>
         </w:rPr>
-        <w:t xml:space="preserve">, performance with Lighthouse </w:t>
-      </w:r>
-      <w:r>
-        <w:rPr>
-          <w:sz w:val="20"/>
-          <w:szCs w:val="20"/>
-        </w:rPr>
-        <w:t xml:space="preserve">[28]</w:t>
-      </w:r>
-      <w:r>
-        <w:rPr>
-          <w:sz w:val="20"/>
-          <w:szCs w:val="20"/>
-        </w:rPr>
-        <w:t xml:space="preserve">, a ZAP baseline scan </w:t>
-      </w:r>
-      <w:r>
-        <w:rPr>
-          <w:sz w:val="20"/>
-          <w:szCs w:val="20"/>
-        </w:rPr>
-        <w:t xml:space="preserve">[29]</w:t>
-      </w:r>
-      <w:r>
-        <w:rPr>
-          <w:sz w:val="20"/>
-          <w:szCs w:val="20"/>
-        </w:rPr>
-        <w:t xml:space="preserve"> (passive checks of its own when ZAP cannot run) and a dependency audit. A fix made at that point is checked with a runtime test (build, then every page opens), not with another journey run. The agent cannot run the whole journey suite itself; the command is refused, because the Studio runs it once and owns the result. A tool that is not available is recorded as unavailable, never as a pass, and every count in the reports is read from the runners’ own output files.</w:t>
+        <w:t xml:space="preserve"> and a dependency audit; a fix made then is checked by building the app and opening every page. The agent may not run the whole journey suite, which the Studio runs once and owns. A missing tool is recorded as unavailable, never as a pass, and every count is read from the runners’ own output files.</w:t>
       </w:r>
     </w:p>
     <w:p>
@@ -3666,7 +3176,7 @@
           <w:sz w:val="20"/>
           <w:szCs w:val="20"/>
         </w:rPr>
-        <w:t xml:space="preserve">F. Change Requests and Deployment</w:t>
+        <w:t xml:space="preserve">F. Deployment</w:t>
       </w:r>
     </w:p>
     <w:p>
@@ -3680,7 +3190,22 @@
           <w:sz w:val="20"/>
           <w:szCs w:val="20"/>
         </w:rPr>
-        <w:t xml:space="preserve">After the build, a request typed into the chat is planned first. The planner reads the project, may ask up to three questions and shows a plan the user can approve, revise or cancel. Each approved change becomes a version (v1, v2, ...) that lists the files it touched and the test results before and after. The user can also point at elements in the live preview, which are described to the agent by tag, text, attributes and markup.</w:t>
+        <w:t xml:space="preserve">Deployment is planned first, like a change request (Section III-H). The targets are Vercel, Netlify, Azure App Service, AWS EC2, AWS ECS and GitHub, filtered by what the stack supports. The agent works through each provider’s own command-line tool, signed in through that tool’s browser or device-code login, so no token is pasted. Its rules favour one pass over repetition: no test is rerun, the application is built once, at most three questions are asked, and the smoke proof is at most six read-only requests. When the agent records the run as live, the Studio checks the result itself. It requests the public address and every check the agent recorded, and rejects an address that is not HTTPS or whose host is local or a private IP, and any status outside the expected range; 429 and gateway errors from a host that is still starting are retried after 5 s and 10 s. A failure goes back to the agent once. If the address still does not hold, the run ends as failed, with the cause.</w:t>
+      </w:r>
+    </w:p>
+    <w:p>
+      <w:pPr>
+        <w:keepNext/>
+        <w:spacing w:after="60" w:before="120"/>
+      </w:pPr>
+      <w:r>
+        <w:rPr>
+          <w:i/>
+          <w:iCs/>
+          <w:sz w:val="20"/>
+          <w:szCs w:val="20"/>
+        </w:rPr>
+        <w:t xml:space="preserve">G. Safety, Privacy and Reliability</w:t>
       </w:r>
     </w:p>
     <w:p>
@@ -3694,14 +3219,8 @@
           <w:sz w:val="20"/>
           <w:szCs w:val="20"/>
         </w:rPr>
-        <w:t xml:space="preserve">Deployment uses the same plan-first flow. The targets are Vercel, Netlify, Azure App Service, AWS EC2, AWS ECS and GitHub, filtered by what the stack supports. The agent works through each provider’s own command-line tool, signed in through that tool’s browser or device-code login, so no token is pasted. Its rules favour one pass over repetition: no test is rerun, the application is built once, at most three questions are asked, and the smoke proof is at most six read-only requests. When the agent records the run as live, the Studio checks the result itself. It requests the public address and every check the agent recorded, and rejects an address that is not HTTPS or whose host is local or a private IP, and any status outside the expected range; 429 and gateway errors from a host that is still starting are retried after 5 s and 10 s. A failure goes back to the agent once. If the address still does not hold, the run ends as failed, with the cause.</w:t>
-      </w:r>
-    </w:p>
-    <w:p>
-      <w:pPr>
-        <w:keepNext/>
-        <w:spacing w:after="60" w:before="120"/>
-      </w:pPr>
+        <w:t xml:space="preserve">Every command the agent runs is checked against an allowlist of 132 program names and a deny list (</w:t>
+      </w:r>
       <w:r>
         <w:rPr>
           <w:i/>
@@ -3709,7 +3228,14 @@
           <w:sz w:val="20"/>
           <w:szCs w:val="20"/>
         </w:rPr>
-        <w:t xml:space="preserve">G. Safety, Privacy and Reliability</w:t>
+        <w:t xml:space="preserve">sudo</w:t>
+      </w:r>
+      <w:r>
+        <w:rPr>
+          <w:sz w:val="20"/>
+          <w:szCs w:val="20"/>
+        </w:rPr>
+        <w:t xml:space="preserve">, a download piped into a shell, Invoke-Expression, deleting the root or home directory, a credential file sent to a network command). The code calls this defence in depth, not a sandbox. AgentForge’s own source is snapshotted before every command and restored if the command changed it.</w:t>
       </w:r>
     </w:p>
     <w:p>
@@ -3723,23 +3249,21 @@
           <w:sz w:val="20"/>
           <w:szCs w:val="20"/>
         </w:rPr>
-        <w:t xml:space="preserve">Each project runs in one of four permission modes: automatic (only risky commands are asked about), manual, accept edits, and bypass, which must be switched on first. Commands are checked against an allowlist of 132 program names and a deny list (</w:t>
-      </w:r>
-      <w:r>
-        <w:rPr>
-          <w:i/>
-          <w:iCs/>
-          <w:sz w:val="20"/>
-          <w:szCs w:val="20"/>
-        </w:rPr>
-        <w:t xml:space="preserve">sudo</w:t>
-      </w:r>
-      <w:r>
-        <w:rPr>
-          <w:sz w:val="20"/>
-          <w:szCs w:val="20"/>
-        </w:rPr>
-        <w:t xml:space="preserve">, a download piped into a shell, Invoke-Expression, deleting the root or home directory, a credential file sent to a network command). The code calls this defence in depth, not a sandbox. AgentForge’s own source is snapshotted before every command and restored if the command changed it.</w:t>
+        <w:t xml:space="preserve">Personal data does not reach a model in clear text. Everything the user types passes through Microsoft Presidio </w:t>
+      </w:r>
+      <w:r>
+        <w:rPr>
+          <w:sz w:val="20"/>
+          <w:szCs w:val="20"/>
+        </w:rPr>
+        <w:t xml:space="preserve">[28]</w:t>
+      </w:r>
+      <w:r>
+        <w:rPr>
+          <w:sz w:val="20"/>
+          <w:szCs w:val="20"/>
+        </w:rPr>
+        <w:t xml:space="preserve"> with a spaCy English model, set to 15 entity types including Sri Lankan identity and phone numbers. Each value found is kept, encrypted, in a per-project vault on the user’s computer under a placeholder numbered for the whole project (&lt;PERSON_1&gt; is the same person in every message). The one client every model call passes through hides known values on the way out and restores them in the answer and in the arguments of tools that act on the local machine; web search, web fetch and plugin tools keep the placeholders. If Presidio is missing, the message is not sent. Text shaped like a key or a connection string is refused in the chat and must be saved in Settings instead.</w:t>
       </w:r>
     </w:p>
     <w:p>
@@ -3753,35 +3277,22 @@
           <w:sz w:val="20"/>
           <w:szCs w:val="20"/>
         </w:rPr>
-        <w:t xml:space="preserve">Personal data does not reach a model in clear text. Everything the user types passes through Microsoft Presidio </w:t>
-      </w:r>
-      <w:r>
-        <w:rPr>
-          <w:sz w:val="20"/>
-          <w:szCs w:val="20"/>
-        </w:rPr>
-        <w:t xml:space="preserve">[30]</w:t>
-      </w:r>
-      <w:r>
-        <w:rPr>
-          <w:sz w:val="20"/>
-          <w:szCs w:val="20"/>
-        </w:rPr>
-        <w:t xml:space="preserve"> with a spaCy English model </w:t>
-      </w:r>
-      <w:r>
-        <w:rPr>
-          <w:sz w:val="20"/>
-          <w:szCs w:val="20"/>
-        </w:rPr>
-        <w:t xml:space="preserve">[31]</w:t>
-      </w:r>
-      <w:r>
-        <w:rPr>
-          <w:sz w:val="20"/>
-          <w:szCs w:val="20"/>
-        </w:rPr>
-        <w:t xml:space="preserve">, set to 15 entity types including Sri Lankan identity and phone numbers. Each value found is kept, encrypted, in a per-project vault on the user’s computer under a placeholder numbered for the whole project (&lt;PERSON_1&gt; is the same person in every message). The one client every model call passes through hides known values on the way out and restores them in the answer and in the arguments of tools that act on the local machine; web search, web fetch and plugin tools keep the placeholders. If Presidio is missing, the message is not sent. Text shaped like a key or a connection string is refused in the chat and must be saved in Settings instead.</w:t>
+        <w:t xml:space="preserve">A transient model-service failure (a reset connection, a timeout, HTTP 408, 425, 429 or a 5xx error) is retried up to ten times with back-off from 2 s to 30 s. Every stage writes a checkpoint when it starts, finishes or fails, so a run cut off by a restart resumes. Hosted models are reached with the user’s own ollama.com key or through a Cloudflare Worker that holds the service key, passes through eight API routes and meters calls against the user’s account.</w:t>
+      </w:r>
+    </w:p>
+    <w:p>
+      <w:pPr>
+        <w:keepNext/>
+        <w:spacing w:after="60" w:before="120"/>
+      </w:pPr>
+      <w:r>
+        <w:rPr>
+          <w:i/>
+          <w:iCs/>
+          <w:sz w:val="20"/>
+          <w:szCs w:val="20"/>
+        </w:rPr>
+        <w:t xml:space="preserve">H. Human in the Loop</w:t>
       </w:r>
     </w:p>
     <w:p>
@@ -3795,7 +3306,757 @@
           <w:sz w:val="20"/>
           <w:szCs w:val="20"/>
         </w:rPr>
-        <w:t xml:space="preserve">A transient model-service failure (a reset connection, a timeout, HTTP 408, 425, 429 or a 5xx error) is retried up to ten times with back-off from 2 s to 30 s. Every stage writes a checkpoint when it starts, finishes or fails, so a run cut off by a restart resumes. Hosted models are reached with the user’s own ollama.com key or through a Cloudflare Worker that holds the service key, passes through eight API routes and meters calls against the user’s account.</w:t>
+        <w:t xml:space="preserve">The agents do the work, but the user decides what is built and when a stage moves on. Nothing passes the plan, the specification, the design or a deployment without the user’s approval, and every stage has a chat box and an artifact the user can change (Table </w:t>
+      </w:r>
+      <w:r>
+        <w:rPr>
+          <w:sz w:val="20"/>
+          <w:szCs w:val="20"/>
+        </w:rPr>
+        <w:t xml:space="preserve">II</w:t>
+      </w:r>
+      <w:r>
+        <w:rPr>
+          <w:sz w:val="20"/>
+          <w:szCs w:val="20"/>
+        </w:rPr>
+        <w:t xml:space="preserve">). Questions are rationed to what only the user can decide: at most 25 in the interview, five before a build, three per change request and three per deployment. Everything else is a stated default that the user can correct.</w:t>
+      </w:r>
+    </w:p>
+    <w:p>
+      <w:pPr>
+        <w:keepNext/>
+        <w:spacing w:after="80" w:before="160"/>
+        <w:jc w:val="center"/>
+      </w:pPr>
+      <w:r>
+        <w:rPr>
+          <w:smallCaps/>
+          <w:sz w:val="16"/>
+          <w:szCs w:val="16"/>
+        </w:rPr>
+        <w:t xml:space="preserve">TABLE II.  </w:t>
+      </w:r>
+      <w:r>
+        <w:rPr>
+          <w:smallCaps/>
+          <w:sz w:val="16"/>
+          <w:szCs w:val="16"/>
+        </w:rPr>
+        <w:t xml:space="preserve">What the User Can Do at Each Stage</w:t>
+      </w:r>
+    </w:p>
+    <w:tbl>
+      <w:tblPr>
+        <w:tblW w:type="dxa" w:w="5021"/>
+        <w:tblBorders>
+          <w:top w:val="single" w:color="000000" w:sz="4"/>
+          <w:left w:val="single" w:color="000000" w:sz="4"/>
+          <w:bottom w:val="single" w:color="000000" w:sz="4"/>
+          <w:right w:val="single" w:color="000000" w:sz="4"/>
+          <w:insideH w:val="single" w:color="000000" w:sz="4"/>
+          <w:insideV w:val="single" w:color="000000" w:sz="4"/>
+        </w:tblBorders>
+      </w:tblPr>
+      <w:tblGrid>
+        <w:gridCol w:w="1150"/>
+        <w:gridCol w:w="3871"/>
+      </w:tblGrid>
+      <w:tr>
+        <w:trPr>
+          <w:tblHeader/>
+        </w:trPr>
+        <w:tc>
+          <w:tcPr>
+            <w:tcW w:type="dxa" w:w="1150"/>
+            <w:tcMar>
+              <w:top w:type="dxa" w:w="20"/>
+              <w:left w:type="dxa" w:w="45"/>
+              <w:bottom w:type="dxa" w:w="20"/>
+              <w:right w:type="dxa" w:w="45"/>
+            </w:tcMar>
+            <w:vAlign w:val="center"/>
+          </w:tcPr>
+          <w:p>
+            <w:pPr>
+              <w:spacing w:after="0"/>
+              <w:jc w:val="center"/>
+            </w:pPr>
+            <w:r>
+              <w:rPr>
+                <w:b/>
+                <w:bCs/>
+                <w:sz w:val="15"/>
+                <w:szCs w:val="15"/>
+              </w:rPr>
+              <w:t xml:space="preserve">Stage</w:t>
+            </w:r>
+          </w:p>
+        </w:tc>
+        <w:tc>
+          <w:tcPr>
+            <w:tcW w:type="dxa" w:w="3871"/>
+            <w:tcMar>
+              <w:top w:type="dxa" w:w="20"/>
+              <w:left w:type="dxa" w:w="45"/>
+              <w:bottom w:type="dxa" w:w="20"/>
+              <w:right w:type="dxa" w:w="45"/>
+            </w:tcMar>
+            <w:vAlign w:val="center"/>
+          </w:tcPr>
+          <w:p>
+            <w:pPr>
+              <w:spacing w:after="0"/>
+              <w:jc w:val="center"/>
+            </w:pPr>
+            <w:r>
+              <w:rPr>
+                <w:b/>
+                <w:bCs/>
+                <w:sz w:val="15"/>
+                <w:szCs w:val="15"/>
+              </w:rPr>
+              <w:t xml:space="preserve">User actions</w:t>
+            </w:r>
+          </w:p>
+        </w:tc>
+      </w:tr>
+      <w:tr>
+        <w:trPr>
+          <w:cantSplit/>
+        </w:trPr>
+        <w:tc>
+          <w:tcPr>
+            <w:tcW w:type="dxa" w:w="1150"/>
+            <w:tcMar>
+              <w:top w:type="dxa" w:w="20"/>
+              <w:left w:type="dxa" w:w="45"/>
+              <w:bottom w:type="dxa" w:w="20"/>
+              <w:right w:type="dxa" w:w="45"/>
+            </w:tcMar>
+            <w:vAlign w:val="center"/>
+          </w:tcPr>
+          <w:p>
+            <w:pPr>
+              <w:spacing w:after="0"/>
+              <w:jc w:val="left"/>
+            </w:pPr>
+            <w:r>
+              <w:rPr>
+                <w:b w:val="false"/>
+                <w:bCs w:val="false"/>
+                <w:sz w:val="15"/>
+                <w:szCs w:val="15"/>
+              </w:rPr>
+              <w:t xml:space="preserve">Interview</w:t>
+            </w:r>
+          </w:p>
+        </w:tc>
+        <w:tc>
+          <w:tcPr>
+            <w:tcW w:type="dxa" w:w="3871"/>
+            <w:tcMar>
+              <w:top w:type="dxa" w:w="20"/>
+              <w:left w:type="dxa" w:w="45"/>
+              <w:bottom w:type="dxa" w:w="20"/>
+              <w:right w:type="dxa" w:w="45"/>
+            </w:tcMar>
+            <w:vAlign w:val="center"/>
+          </w:tcPr>
+          <w:p>
+            <w:pPr>
+              <w:spacing w:after="0"/>
+              <w:jc w:val="left"/>
+            </w:pPr>
+            <w:r>
+              <w:rPr>
+                <w:b w:val="false"/>
+                <w:bCs w:val="false"/>
+                <w:sz w:val="15"/>
+                <w:szCs w:val="15"/>
+              </w:rPr>
+              <w:t xml:space="preserve">Pick an answer or type one; attach screenshots and documents; correct the summary; skip</w:t>
+            </w:r>
+          </w:p>
+        </w:tc>
+      </w:tr>
+      <w:tr>
+        <w:trPr>
+          <w:cantSplit/>
+        </w:trPr>
+        <w:tc>
+          <w:tcPr>
+            <w:tcW w:type="dxa" w:w="1150"/>
+            <w:tcMar>
+              <w:top w:type="dxa" w:w="20"/>
+              <w:left w:type="dxa" w:w="45"/>
+              <w:bottom w:type="dxa" w:w="20"/>
+              <w:right w:type="dxa" w:w="45"/>
+            </w:tcMar>
+            <w:vAlign w:val="center"/>
+          </w:tcPr>
+          <w:p>
+            <w:pPr>
+              <w:spacing w:after="0"/>
+              <w:jc w:val="left"/>
+            </w:pPr>
+            <w:r>
+              <w:rPr>
+                <w:b w:val="false"/>
+                <w:bCs w:val="false"/>
+                <w:sz w:val="15"/>
+                <w:szCs w:val="15"/>
+              </w:rPr>
+              <w:t xml:space="preserve">Plan</w:t>
+            </w:r>
+          </w:p>
+        </w:tc>
+        <w:tc>
+          <w:tcPr>
+            <w:tcW w:type="dxa" w:w="3871"/>
+            <w:tcMar>
+              <w:top w:type="dxa" w:w="20"/>
+              <w:left w:type="dxa" w:w="45"/>
+              <w:bottom w:type="dxa" w:w="20"/>
+              <w:right w:type="dxa" w:w="45"/>
+            </w:tcMar>
+            <w:vAlign w:val="center"/>
+          </w:tcPr>
+          <w:p>
+            <w:pPr>
+              <w:spacing w:after="0"/>
+              <w:jc w:val="left"/>
+            </w:pPr>
+            <w:r>
+              <w:rPr>
+                <w:b w:val="false"/>
+                <w:bCs w:val="false"/>
+                <w:sz w:val="15"/>
+                <w:szCs w:val="15"/>
+              </w:rPr>
+              <w:t xml:space="preserve">Approve, or revise in their own words; each revision is a new version</w:t>
+            </w:r>
+          </w:p>
+        </w:tc>
+      </w:tr>
+      <w:tr>
+        <w:trPr>
+          <w:cantSplit/>
+        </w:trPr>
+        <w:tc>
+          <w:tcPr>
+            <w:tcW w:type="dxa" w:w="1150"/>
+            <w:tcMar>
+              <w:top w:type="dxa" w:w="20"/>
+              <w:left w:type="dxa" w:w="45"/>
+              <w:bottom w:type="dxa" w:w="20"/>
+              <w:right w:type="dxa" w:w="45"/>
+            </w:tcMar>
+            <w:vAlign w:val="center"/>
+          </w:tcPr>
+          <w:p>
+            <w:pPr>
+              <w:spacing w:after="0"/>
+              <w:jc w:val="left"/>
+            </w:pPr>
+            <w:r>
+              <w:rPr>
+                <w:b w:val="false"/>
+                <w:bCs w:val="false"/>
+                <w:sz w:val="15"/>
+                <w:szCs w:val="15"/>
+              </w:rPr>
+              <w:t xml:space="preserve">Specification</w:t>
+            </w:r>
+          </w:p>
+        </w:tc>
+        <w:tc>
+          <w:tcPr>
+            <w:tcW w:type="dxa" w:w="3871"/>
+            <w:tcMar>
+              <w:top w:type="dxa" w:w="20"/>
+              <w:left w:type="dxa" w:w="45"/>
+              <w:bottom w:type="dxa" w:w="20"/>
+              <w:right w:type="dxa" w:w="45"/>
+            </w:tcMar>
+            <w:vAlign w:val="center"/>
+          </w:tcPr>
+          <w:p>
+            <w:pPr>
+              <w:spacing w:after="0"/>
+              <w:jc w:val="left"/>
+            </w:pPr>
+            <w:r>
+              <w:rPr>
+                <w:b w:val="false"/>
+                <w:bCs w:val="false"/>
+                <w:sz w:val="15"/>
+                <w:szCs w:val="15"/>
+              </w:rPr>
+              <w:t xml:space="preserve">Approve; ask for a revision; answer each open decision (the first option keeps the assumption)</w:t>
+            </w:r>
+          </w:p>
+        </w:tc>
+      </w:tr>
+      <w:tr>
+        <w:trPr>
+          <w:cantSplit/>
+        </w:trPr>
+        <w:tc>
+          <w:tcPr>
+            <w:tcW w:type="dxa" w:w="1150"/>
+            <w:tcMar>
+              <w:top w:type="dxa" w:w="20"/>
+              <w:left w:type="dxa" w:w="45"/>
+              <w:bottom w:type="dxa" w:w="20"/>
+              <w:right w:type="dxa" w:w="45"/>
+            </w:tcMar>
+            <w:vAlign w:val="center"/>
+          </w:tcPr>
+          <w:p>
+            <w:pPr>
+              <w:spacing w:after="0"/>
+              <w:jc w:val="left"/>
+            </w:pPr>
+            <w:r>
+              <w:rPr>
+                <w:b w:val="false"/>
+                <w:bCs w:val="false"/>
+                <w:sz w:val="15"/>
+                <w:szCs w:val="15"/>
+              </w:rPr>
+              <w:t xml:space="preserve">Wireframes</w:t>
+            </w:r>
+          </w:p>
+        </w:tc>
+        <w:tc>
+          <w:tcPr>
+            <w:tcW w:type="dxa" w:w="3871"/>
+            <w:tcMar>
+              <w:top w:type="dxa" w:w="20"/>
+              <w:left w:type="dxa" w:w="45"/>
+              <w:bottom w:type="dxa" w:w="20"/>
+              <w:right w:type="dxa" w:w="45"/>
+            </w:tcMar>
+            <w:vAlign w:val="center"/>
+          </w:tcPr>
+          <w:p>
+            <w:pPr>
+              <w:spacing w:after="0"/>
+              <w:jc w:val="left"/>
+            </w:pPr>
+            <w:r>
+              <w:rPr>
+                <w:b w:val="false"/>
+                <w:bCs w:val="false"/>
+                <w:sz w:val="15"/>
+                <w:szCs w:val="15"/>
+              </w:rPr>
+              <w:t xml:space="preserve">Ask in chat; select, draw on or retype any part of a page</w:t>
+            </w:r>
+          </w:p>
+        </w:tc>
+      </w:tr>
+      <w:tr>
+        <w:trPr>
+          <w:cantSplit/>
+        </w:trPr>
+        <w:tc>
+          <w:tcPr>
+            <w:tcW w:type="dxa" w:w="1150"/>
+            <w:tcMar>
+              <w:top w:type="dxa" w:w="20"/>
+              <w:left w:type="dxa" w:w="45"/>
+              <w:bottom w:type="dxa" w:w="20"/>
+              <w:right w:type="dxa" w:w="45"/>
+            </w:tcMar>
+            <w:vAlign w:val="center"/>
+          </w:tcPr>
+          <w:p>
+            <w:pPr>
+              <w:spacing w:after="0"/>
+              <w:jc w:val="left"/>
+            </w:pPr>
+            <w:r>
+              <w:rPr>
+                <w:b w:val="false"/>
+                <w:bCs w:val="false"/>
+                <w:sz w:val="15"/>
+                <w:szCs w:val="15"/>
+              </w:rPr>
+              <w:t xml:space="preserve">Design</w:t>
+            </w:r>
+          </w:p>
+        </w:tc>
+        <w:tc>
+          <w:tcPr>
+            <w:tcW w:type="dxa" w:w="3871"/>
+            <w:tcMar>
+              <w:top w:type="dxa" w:w="20"/>
+              <w:left w:type="dxa" w:w="45"/>
+              <w:bottom w:type="dxa" w:w="20"/>
+              <w:right w:type="dxa" w:w="45"/>
+            </w:tcMar>
+            <w:vAlign w:val="center"/>
+          </w:tcPr>
+          <w:p>
+            <w:pPr>
+              <w:spacing w:after="0"/>
+              <w:jc w:val="left"/>
+            </w:pPr>
+            <w:r>
+              <w:rPr>
+                <w:b w:val="false"/>
+                <w:bCs w:val="false"/>
+                <w:sz w:val="15"/>
+                <w:szCs w:val="15"/>
+              </w:rPr>
+              <w:t xml:space="preserve">Choose 1 of 70 themes or customise: 32 palettes, 117 heading and body fonts, own pictures, a written brief</w:t>
+            </w:r>
+          </w:p>
+        </w:tc>
+      </w:tr>
+      <w:tr>
+        <w:trPr>
+          <w:cantSplit/>
+        </w:trPr>
+        <w:tc>
+          <w:tcPr>
+            <w:tcW w:type="dxa" w:w="1150"/>
+            <w:tcMar>
+              <w:top w:type="dxa" w:w="20"/>
+              <w:left w:type="dxa" w:w="45"/>
+              <w:bottom w:type="dxa" w:w="20"/>
+              <w:right w:type="dxa" w:w="45"/>
+            </w:tcMar>
+            <w:vAlign w:val="center"/>
+          </w:tcPr>
+          <w:p>
+            <w:pPr>
+              <w:spacing w:after="0"/>
+              <w:jc w:val="left"/>
+            </w:pPr>
+            <w:r>
+              <w:rPr>
+                <w:b w:val="false"/>
+                <w:bCs w:val="false"/>
+                <w:sz w:val="15"/>
+                <w:szCs w:val="15"/>
+              </w:rPr>
+              <w:t xml:space="preserve">Prototype</w:t>
+            </w:r>
+          </w:p>
+        </w:tc>
+        <w:tc>
+          <w:tcPr>
+            <w:tcW w:type="dxa" w:w="3871"/>
+            <w:tcMar>
+              <w:top w:type="dxa" w:w="20"/>
+              <w:left w:type="dxa" w:w="45"/>
+              <w:bottom w:type="dxa" w:w="20"/>
+              <w:right w:type="dxa" w:w="45"/>
+            </w:tcMar>
+            <w:vAlign w:val="center"/>
+          </w:tcPr>
+          <w:p>
+            <w:pPr>
+              <w:spacing w:after="0"/>
+              <w:jc w:val="left"/>
+            </w:pPr>
+            <w:r>
+              <w:rPr>
+                <w:b w:val="false"/>
+                <w:bCs w:val="false"/>
+                <w:sz w:val="15"/>
+                <w:szCs w:val="15"/>
+              </w:rPr>
+              <w:t xml:space="preserve">Ask in chat; select, draw on or retype; approve before the build</w:t>
+            </w:r>
+          </w:p>
+        </w:tc>
+      </w:tr>
+      <w:tr>
+        <w:trPr>
+          <w:cantSplit/>
+        </w:trPr>
+        <w:tc>
+          <w:tcPr>
+            <w:tcW w:type="dxa" w:w="1150"/>
+            <w:tcMar>
+              <w:top w:type="dxa" w:w="20"/>
+              <w:left w:type="dxa" w:w="45"/>
+              <w:bottom w:type="dxa" w:w="20"/>
+              <w:right w:type="dxa" w:w="45"/>
+            </w:tcMar>
+            <w:vAlign w:val="center"/>
+          </w:tcPr>
+          <w:p>
+            <w:pPr>
+              <w:spacing w:after="0"/>
+              <w:jc w:val="left"/>
+            </w:pPr>
+            <w:r>
+              <w:rPr>
+                <w:b w:val="false"/>
+                <w:bCs w:val="false"/>
+                <w:sz w:val="15"/>
+                <w:szCs w:val="15"/>
+              </w:rPr>
+              <w:t xml:space="preserve">Build</w:t>
+            </w:r>
+          </w:p>
+        </w:tc>
+        <w:tc>
+          <w:tcPr>
+            <w:tcW w:type="dxa" w:w="3871"/>
+            <w:tcMar>
+              <w:top w:type="dxa" w:w="20"/>
+              <w:left w:type="dxa" w:w="45"/>
+              <w:bottom w:type="dxa" w:w="20"/>
+              <w:right w:type="dxa" w:w="45"/>
+            </w:tcMar>
+            <w:vAlign w:val="center"/>
+          </w:tcPr>
+          <w:p>
+            <w:pPr>
+              <w:spacing w:after="0"/>
+              <w:jc w:val="left"/>
+            </w:pPr>
+            <w:r>
+              <w:rPr>
+                <w:b w:val="false"/>
+                <w:bCs w:val="false"/>
+                <w:sz w:val="15"/>
+                <w:szCs w:val="15"/>
+              </w:rPr>
+              <w:t xml:space="preserve">Connect missing accounts; answer up to five questions; edit code; allow or stop further fix rounds</w:t>
+            </w:r>
+          </w:p>
+        </w:tc>
+      </w:tr>
+      <w:tr>
+        <w:trPr>
+          <w:cantSplit/>
+        </w:trPr>
+        <w:tc>
+          <w:tcPr>
+            <w:tcW w:type="dxa" w:w="1150"/>
+            <w:tcMar>
+              <w:top w:type="dxa" w:w="20"/>
+              <w:left w:type="dxa" w:w="45"/>
+              <w:bottom w:type="dxa" w:w="20"/>
+              <w:right w:type="dxa" w:w="45"/>
+            </w:tcMar>
+            <w:vAlign w:val="center"/>
+          </w:tcPr>
+          <w:p>
+            <w:pPr>
+              <w:spacing w:after="0"/>
+              <w:jc w:val="left"/>
+            </w:pPr>
+            <w:r>
+              <w:rPr>
+                <w:b w:val="false"/>
+                <w:bCs w:val="false"/>
+                <w:sz w:val="15"/>
+                <w:szCs w:val="15"/>
+              </w:rPr>
+              <w:t xml:space="preserve">Test</w:t>
+            </w:r>
+          </w:p>
+        </w:tc>
+        <w:tc>
+          <w:tcPr>
+            <w:tcW w:type="dxa" w:w="3871"/>
+            <w:tcMar>
+              <w:top w:type="dxa" w:w="20"/>
+              <w:left w:type="dxa" w:w="45"/>
+              <w:bottom w:type="dxa" w:w="20"/>
+              <w:right w:type="dxa" w:w="45"/>
+            </w:tcMar>
+            <w:vAlign w:val="center"/>
+          </w:tcPr>
+          <w:p>
+            <w:pPr>
+              <w:spacing w:after="0"/>
+              <w:jc w:val="left"/>
+            </w:pPr>
+            <w:r>
+              <w:rPr>
+                <w:b w:val="false"/>
+                <w:bCs w:val="false"/>
+                <w:sz w:val="15"/>
+                <w:szCs w:val="15"/>
+              </w:rPr>
+              <w:t xml:space="preserve">Choose whether another round of fixes runs; ask for failing journeys to be fixed</w:t>
+            </w:r>
+          </w:p>
+        </w:tc>
+      </w:tr>
+      <w:tr>
+        <w:trPr>
+          <w:cantSplit/>
+        </w:trPr>
+        <w:tc>
+          <w:tcPr>
+            <w:tcW w:type="dxa" w:w="1150"/>
+            <w:tcMar>
+              <w:top w:type="dxa" w:w="20"/>
+              <w:left w:type="dxa" w:w="45"/>
+              <w:bottom w:type="dxa" w:w="20"/>
+              <w:right w:type="dxa" w:w="45"/>
+            </w:tcMar>
+            <w:vAlign w:val="center"/>
+          </w:tcPr>
+          <w:p>
+            <w:pPr>
+              <w:spacing w:after="0"/>
+              <w:jc w:val="left"/>
+            </w:pPr>
+            <w:r>
+              <w:rPr>
+                <w:b w:val="false"/>
+                <w:bCs w:val="false"/>
+                <w:sz w:val="15"/>
+                <w:szCs w:val="15"/>
+              </w:rPr>
+              <w:t xml:space="preserve">Deploy</w:t>
+            </w:r>
+          </w:p>
+        </w:tc>
+        <w:tc>
+          <w:tcPr>
+            <w:tcW w:type="dxa" w:w="3871"/>
+            <w:tcMar>
+              <w:top w:type="dxa" w:w="20"/>
+              <w:left w:type="dxa" w:w="45"/>
+              <w:bottom w:type="dxa" w:w="20"/>
+              <w:right w:type="dxa" w:w="45"/>
+            </w:tcMar>
+            <w:vAlign w:val="center"/>
+          </w:tcPr>
+          <w:p>
+            <w:pPr>
+              <w:spacing w:after="0"/>
+              <w:jc w:val="left"/>
+            </w:pPr>
+            <w:r>
+              <w:rPr>
+                <w:b w:val="false"/>
+                <w:bCs w:val="false"/>
+                <w:sz w:val="15"/>
+                <w:szCs w:val="15"/>
+              </w:rPr>
+              <w:t xml:space="preserve">Approve, revise or cancel the plan; answer up to three questions; sign in to each provider</w:t>
+            </w:r>
+          </w:p>
+        </w:tc>
+      </w:tr>
+      <w:tr>
+        <w:trPr>
+          <w:cantSplit/>
+        </w:trPr>
+        <w:tc>
+          <w:tcPr>
+            <w:tcW w:type="dxa" w:w="1150"/>
+            <w:tcMar>
+              <w:top w:type="dxa" w:w="20"/>
+              <w:left w:type="dxa" w:w="45"/>
+              <w:bottom w:type="dxa" w:w="20"/>
+              <w:right w:type="dxa" w:w="45"/>
+            </w:tcMar>
+            <w:vAlign w:val="center"/>
+          </w:tcPr>
+          <w:p>
+            <w:pPr>
+              <w:spacing w:after="0"/>
+              <w:jc w:val="left"/>
+            </w:pPr>
+            <w:r>
+              <w:rPr>
+                <w:b w:val="false"/>
+                <w:bCs w:val="false"/>
+                <w:sz w:val="15"/>
+                <w:szCs w:val="15"/>
+              </w:rPr>
+              <w:t xml:space="preserve">After build</w:t>
+            </w:r>
+          </w:p>
+        </w:tc>
+        <w:tc>
+          <w:tcPr>
+            <w:tcW w:type="dxa" w:w="3871"/>
+            <w:tcMar>
+              <w:top w:type="dxa" w:w="20"/>
+              <w:left w:type="dxa" w:w="45"/>
+              <w:bottom w:type="dxa" w:w="20"/>
+              <w:right w:type="dxa" w:w="45"/>
+            </w:tcMar>
+            <w:vAlign w:val="center"/>
+          </w:tcPr>
+          <w:p>
+            <w:pPr>
+              <w:spacing w:after="0"/>
+              <w:jc w:val="left"/>
+            </w:pPr>
+            <w:r>
+              <w:rPr>
+                <w:b w:val="false"/>
+                <w:bCs w:val="false"/>
+                <w:sz w:val="15"/>
+                <w:szCs w:val="15"/>
+              </w:rPr>
+              <w:t xml:space="preserve">Request changes in chat, planned first; select or draw on the running app</w:t>
+            </w:r>
+          </w:p>
+        </w:tc>
+      </w:tr>
+    </w:tbl>
+    <w:p>
+      <w:pPr>
+        <w:spacing w:after="80"/>
+      </w:pPr>
+    </w:p>
+    <w:p>
+      <w:pPr>
+        <w:spacing w:after="0" w:line="240"/>
+        <w:ind w:firstLine="245"/>
+        <w:jc w:val="both"/>
+      </w:pPr>
+      <w:r>
+        <w:rPr>
+          <w:sz w:val="20"/>
+          <w:szCs w:val="20"/>
+        </w:rPr>
+        <w:t xml:space="preserve">A message typed at any stage is answered from the project or applied to it, and the agent updates every artifact the request reaches (the specification, the wireframes, the prototype or the build) without widening it. Once a specification exists, a change is planned first: the planner reads the project, may ask up to three questions and shows a plan to approve, revise in the user’s own words or cancel. Nothing is touched before approval, and the plan step can be switched off per project. Each approved change becomes a version (v1, v2, ...) that lists the files it touched and the test results before and after.</w:t>
+      </w:r>
+    </w:p>
+    <w:p>
+      <w:pPr>
+        <w:spacing w:after="0" w:line="240"/>
+        <w:ind w:firstLine="245"/>
+        <w:jc w:val="both"/>
+      </w:pPr>
+      <w:r>
+        <w:rPr>
+          <w:sz w:val="20"/>
+          <w:szCs w:val="20"/>
+        </w:rPr>
+        <w:t xml:space="preserve">Users can also point. On the wireframes, the prototype and the running application, a select tool picks an element and a pencil marks an area; the Studio describes what was picked or drawn round (tag, words, attributes, place on the page and a slice of markup) and attaches a screenshot for the agent. A text tool changes words in place: when they occur once in the source, the Studio swaps them and rebundles the app with no model call; otherwise it hands the change to the agent. Code can be edited directly in the Studio’s code pane.</w:t>
+      </w:r>
+    </w:p>
+    <w:p>
+      <w:pPr>
+        <w:spacing w:after="0" w:line="240"/>
+        <w:ind w:firstLine="245"/>
+        <w:jc w:val="both"/>
+      </w:pPr>
+      <w:r>
+        <w:rPr>
+          <w:sz w:val="20"/>
+          <w:szCs w:val="20"/>
+        </w:rPr>
+        <w:t xml:space="preserve">The user also controls a run while it happens. The permission mode decides what the agent may do unasked, and a permission card offers allow, allow without asking again, or deny with a note for the agent. Stop ends a model request between tokens and a running command with its process tree. Further rounds of fixes are a Yes or No card, and a typed yes in English or Sinhala counts. The model and its reasoning effort can be changed per project without losing the project’s record.</w:t>
       </w:r>
     </w:p>
     <w:p>
@@ -3824,7 +4085,37 @@
           <w:sz w:val="20"/>
           <w:szCs w:val="20"/>
         </w:rPr>
-        <w:t xml:space="preserve">AgentForge 1.0.3 has about 32,300 lines of Python in the backend, engine and agents, 27,800 lines of JavaScript in the Studio, and 19,500 lines of Markdown prompts, including the design themes and the deployment skill pages. The backend serves its HTTP API and its RFC 6455 WebSocket feed from the Python standard library, and uses Pydantic for the specification schema, the cryptography package for the vault, and Presidio and spaCy for the privacy filter. The Studio is a Next.js 16 and React 19 application. The Windows desktop app wraps it in Electron, where the backend opens no network port and talks to the window over standard input and output; a 150 KB online installer fetches the app, an embedded Python 3.12 and pinned command-line tools, each checked against a SHA-256 manifest.</w:t>
+        <w:t xml:space="preserve">AgentForge 1.0.3 has about 32,300 lines of Python (backend, engine and agents), 27,800 lines of JavaScript (Studio) and 19,500 lines of Markdown prompts. The backend serves its HTTP API and WebSocket feed from the Python standard library and uses Pydantic, the cryptography package, Presidio and spaCy. The Studio is a Next.js 16 and React 19 application; the Windows desktop app wraps it in Electron, reaches the backend over standard input and output, and installs through a 150 KB online installer that checks every file against a SHA-256 manifest. Generated applications come from 236 template files: the eleven stacks, a shared testing kit and 18 stack and testing guides. Models are chosen by the user: the bakery project in Section V-B used gpt-oss:120b through Ollama’s cloud, and accounts default to DeepSeek V4.1 Flash. The repository holds 1,733 Python unit tests and twelve Node test files, run against stand-in models.</w:t>
+      </w:r>
+    </w:p>
+    <w:p>
+      <w:pPr>
+        <w:keepNext/>
+        <w:spacing w:after="100" w:before="200"/>
+        <w:jc w:val="center"/>
+      </w:pPr>
+      <w:r>
+        <w:rPr>
+          <w:smallCaps/>
+          <w:sz w:val="20"/>
+          <w:szCs w:val="20"/>
+        </w:rPr>
+        <w:t xml:space="preserve">V. Evaluation and Preliminary Results</w:t>
+      </w:r>
+    </w:p>
+    <w:p>
+      <w:pPr>
+        <w:keepNext/>
+        <w:spacing w:after="60" w:before="120"/>
+      </w:pPr>
+      <w:r>
+        <w:rPr>
+          <w:i/>
+          <w:iCs/>
+          <w:sz w:val="20"/>
+          <w:szCs w:val="20"/>
+        </w:rPr>
+        <w:t xml:space="preserve">A. Research Questions and Protocol</w:t>
       </w:r>
     </w:p>
     <w:p>
@@ -3838,65 +4129,21 @@
           <w:sz w:val="20"/>
           <w:szCs w:val="20"/>
         </w:rPr>
-        <w:t xml:space="preserve">Generated applications come from 236 template files: the eleven stacks, a shared testing kit (Playwright </w:t>
-      </w:r>
-      <w:r>
-        <w:rPr>
-          <w:sz w:val="20"/>
-          <w:szCs w:val="20"/>
-        </w:rPr>
-        <w:t xml:space="preserve">[32]</w:t>
-      </w:r>
-      <w:r>
-        <w:rPr>
-          <w:sz w:val="20"/>
-          <w:szCs w:val="20"/>
-        </w:rPr>
-        <w:t xml:space="preserve">, Vitest, axe-core, Lighthouse CI, ZAP and a server runner) and 18 stack and testing guides that the builder reads before it plans. Screenshots are taken with a locally installed Edge, Chrome or Chromium in headless mode. Models are chosen by the user: the bakery project in Section V-B used gpt-oss:120b served through Ollama’s cloud, and accounts default to DeepSeek V4.1 Flash. The repository holds 1,733 Python unit tests and twelve Node test files, which cover the engine, every gate, the privacy filter and the deployment flow with stand-in models instead of live calls.</w:t>
-      </w:r>
-    </w:p>
-    <w:p>
-      <w:pPr>
-        <w:keepNext/>
-        <w:spacing w:after="100" w:before="200"/>
-        <w:jc w:val="center"/>
-      </w:pPr>
-      <w:r>
-        <w:rPr>
-          <w:smallCaps/>
-          <w:sz w:val="20"/>
-          <w:szCs w:val="20"/>
-        </w:rPr>
-        <w:t xml:space="preserve">V. Evaluation and Preliminary Results</w:t>
-      </w:r>
-    </w:p>
-    <w:p>
-      <w:pPr>
-        <w:keepNext/>
-        <w:spacing w:after="60" w:before="120"/>
-      </w:pPr>
-      <w:r>
-        <w:rPr>
-          <w:i/>
-          <w:iCs/>
-          <w:sz w:val="20"/>
-          <w:szCs w:val="20"/>
-        </w:rPr>
-        <w:t xml:space="preserve">A. Research Questions and Protocol</w:t>
-      </w:r>
-    </w:p>
-    <w:p>
-      <w:pPr>
-        <w:spacing w:after="0" w:line="240"/>
-        <w:ind w:firstLine="245"/>
-        <w:jc w:val="both"/>
-      </w:pPr>
-      <w:r>
-        <w:rPr>
-          <w:sz w:val="20"/>
-          <w:szCs w:val="20"/>
-        </w:rPr>
-        <w:t xml:space="preserve">The observations in Section V-C were gathered while the system was being built, so they cannot attribute an improvement to one component. The controlled study is the next step: a fixed suite of application ideas, from a one-screen tool to stores of over thirty screens, built with the same model and settings under each condition of Table III, three runs per condition, reported as mean and standard deviation. Requests are logged at the single model client, which gives exact token counts and makes leaked personal data countable.</w:t>
+        <w:t xml:space="preserve">The observations in Section V-C were gathered while the system was being built, so they cannot attribute an improvement to one component. The controlled study is the next step: a fixed suite of application ideas, from a one-screen tool to stores of over thirty screens, built with the same model and settings under each condition of Table </w:t>
+      </w:r>
+      <w:r>
+        <w:rPr>
+          <w:sz w:val="20"/>
+          <w:szCs w:val="20"/>
+        </w:rPr>
+        <w:t xml:space="preserve">III</w:t>
+      </w:r>
+      <w:r>
+        <w:rPr>
+          <w:sz w:val="20"/>
+          <w:szCs w:val="20"/>
+        </w:rPr>
+        <w:t xml:space="preserve">, three runs per condition, reported as mean and standard deviation. Requests are logged at the single model client, which gives exact token counts and makes leaked personal data countable.</w:t>
       </w:r>
     </w:p>
     <w:p>
@@ -4573,7 +4820,21 @@
           <w:sz w:val="20"/>
           <w:szCs w:val="20"/>
         </w:rPr>
-        <w:t xml:space="preserve">The observations come from the authors’ own projects: a bakery ordering application (interview to prototype), a 28-page application (specification to deployment), a 31-page online store and a store whose plan had 71 screens. Each row of Table IV is one observed run before and, where stated, after a change, as recorded in the version history. The rows explain the current design; they are not a comparison with other systems.</w:t>
+        <w:t xml:space="preserve">The observations come from the authors’ own projects: a bakery ordering application (interview to prototype), a 28-page application (specification to deployment), a 31-page online store and a store whose plan had 71 screens. Each row of Table </w:t>
+      </w:r>
+      <w:r>
+        <w:rPr>
+          <w:sz w:val="20"/>
+          <w:szCs w:val="20"/>
+        </w:rPr>
+        <w:t xml:space="preserve">IV</w:t>
+      </w:r>
+      <w:r>
+        <w:rPr>
+          <w:sz w:val="20"/>
+          <w:szCs w:val="20"/>
+        </w:rPr>
+        <w:t xml:space="preserve"> is one observed run before and, where stated, after a change, as recorded in the version history. The rows explain the current design; they are not a comparison with other systems.</w:t>
       </w:r>
     </w:p>
     <w:p>
@@ -4602,7 +4863,21 @@
           <w:sz w:val="20"/>
           <w:szCs w:val="20"/>
         </w:rPr>
-        <w:t xml:space="preserve">Table IV lists twelve failures in the order of the pipeline. The coverage gate gave the earliest result: on the bakery project it took the first specification draft from one diagram to seven and from three functional requirements to six. Before the changes in rows 4 to 8, the 28-page application took about seven hours of machine time from specification to deployment.</w:t>
+        <w:t xml:space="preserve">Table </w:t>
+      </w:r>
+      <w:r>
+        <w:rPr>
+          <w:sz w:val="20"/>
+          <w:szCs w:val="20"/>
+        </w:rPr>
+        <w:t xml:space="preserve">IV</w:t>
+      </w:r>
+      <w:r>
+        <w:rPr>
+          <w:sz w:val="20"/>
+          <w:szCs w:val="20"/>
+        </w:rPr>
+        <w:t xml:space="preserve"> lists twelve failures in the order of the pipeline. The coverage gate gave the earliest result: on the bakery project it took the first specification draft from one diagram to seven and from three functional requirements to six. Before the changes in rows 4 to 8, the 28-page application took about seven hours of machine time from specification to deployment.</w:t>
       </w:r>
     </w:p>
     <w:p>
@@ -5811,7 +6086,7 @@
           <w:sz w:val="20"/>
           <w:szCs w:val="20"/>
         </w:rPr>
-        <w:t xml:space="preserve">[19]</w:t>
+        <w:t xml:space="preserve">[17]</w:t>
       </w:r>
       <w:r>
         <w:rPr>
@@ -5841,14 +6116,28 @@
           <w:sz w:val="20"/>
           <w:szCs w:val="20"/>
         </w:rPr>
-        <w:t xml:space="preserve"> Rows 1 and 9 of Table IV are one failure in two stages: the model’s account of its work differed from the files. Each fix replaced a statement by the model with a function of what is on disk, consistent with the finding that models do not reliably correct themselves without external feedback </w:t>
-      </w:r>
-      <w:r>
-        <w:rPr>
-          <w:sz w:val="20"/>
-          <w:szCs w:val="20"/>
-        </w:rPr>
-        <w:t xml:space="preserve">[17]</w:t>
+        <w:t xml:space="preserve"> Rows 1 and 9 of Table </w:t>
+      </w:r>
+      <w:r>
+        <w:rPr>
+          <w:sz w:val="20"/>
+          <w:szCs w:val="20"/>
+        </w:rPr>
+        <w:t xml:space="preserve">IV</w:t>
+      </w:r>
+      <w:r>
+        <w:rPr>
+          <w:sz w:val="20"/>
+          <w:szCs w:val="20"/>
+        </w:rPr>
+        <w:t xml:space="preserve"> are one failure in two stages: the model’s account of its work differed from the files. Each fix replaced a statement by the model with a function of what is on disk, consistent with the finding that models do not reliably correct themselves without external feedback </w:t>
+      </w:r>
+      <w:r>
+        <w:rPr>
+          <w:sz w:val="20"/>
+          <w:szCs w:val="20"/>
+        </w:rPr>
+        <w:t xml:space="preserve">[15]</w:t>
       </w:r>
       <w:r>
         <w:rPr>
@@ -5936,7 +6225,7 @@
           <w:sz w:val="20"/>
           <w:szCs w:val="20"/>
         </w:rPr>
-        <w:t xml:space="preserve">AgentForge started from the view that the hard part of autonomous software engineering is not writing code but knowing when it is done. It hands that decision to code at every boundary: a depth floor on the plan, coverage and evidence checks on the specification, a named-page gate on the build, requirement status computed from test results, and a deployed address checked by the Studio rather than by the agent that deployed it. Building it showed two things the first design did not expect: a conversation is a poor place to keep a project, and every place where a model’s report stood in for evidence eventually gave a wrong answer that a short function over the files could correct. The study of Section V-A will test whether this holds beyond the projects the system was built on.</w:t>
+        <w:t xml:space="preserve">AgentForge started from the view that the hard part of autonomous software engineering is not writing code but knowing when it is done. It hands that decision to code at every boundary and leaves what to build, and when to move on, to the user. Building it showed two things the first design did not expect: a conversation is a poor place to keep a project, and every place where a model’s report stood in for evidence eventually gave a wrong answer that a short function over the files could correct. The study of Section V-A will test whether this holds beyond the projects the system was built on.</w:t>
       </w:r>
     </w:p>
     <w:p>
@@ -6294,7 +6583,7 @@
           <w:sz w:val="16"/>
           <w:szCs w:val="16"/>
         </w:rPr>
-        <w:t xml:space="preserve">S. Russell and P. Norvig, </w:t>
+        <w:t xml:space="preserve">C. Qian et al., “ChatDev: Communicative agents for software development,” in </w:t>
       </w:r>
       <w:r>
         <w:rPr>
@@ -6303,14 +6592,14 @@
           <w:sz w:val="16"/>
           <w:szCs w:val="16"/>
         </w:rPr>
-        <w:t xml:space="preserve">Artificial Intelligence: A Modern Approach</w:t>
-      </w:r>
-      <w:r>
-        <w:rPr>
-          <w:sz w:val="16"/>
-          <w:szCs w:val="16"/>
-        </w:rPr>
-        <w:t xml:space="preserve">, 4th ed. Hoboken, NJ, USA: Pearson, 2021.</w:t>
+        <w:t xml:space="preserve">Proc. 62nd Annu. Meeting Assoc. Comput. Linguistics (ACL)</w:t>
+      </w:r>
+      <w:r>
+        <w:rPr>
+          <w:sz w:val="16"/>
+          <w:szCs w:val="16"/>
+        </w:rPr>
+        <w:t xml:space="preserve">, 2024.</w:t>
       </w:r>
     </w:p>
     <w:p>
@@ -6341,7 +6630,7 @@
           <w:sz w:val="16"/>
           <w:szCs w:val="16"/>
         </w:rPr>
-        <w:t xml:space="preserve">M. Wooldridge, </w:t>
+        <w:t xml:space="preserve">S. Hong et al., “MetaGPT: Meta programming for a multi-agent collaborative framework,” in </w:t>
       </w:r>
       <w:r>
         <w:rPr>
@@ -6350,14 +6639,14 @@
           <w:sz w:val="16"/>
           <w:szCs w:val="16"/>
         </w:rPr>
-        <w:t xml:space="preserve">An Introduction to MultiAgent Systems</w:t>
-      </w:r>
-      <w:r>
-        <w:rPr>
-          <w:sz w:val="16"/>
-          <w:szCs w:val="16"/>
-        </w:rPr>
-        <w:t xml:space="preserve">, 2nd ed. Chichester, U.K.: Wiley, 2009.</w:t>
+        <w:t xml:space="preserve">Proc. Int. Conf. Learn. Represent. (ICLR)</w:t>
+      </w:r>
+      <w:r>
+        <w:rPr>
+          <w:sz w:val="16"/>
+          <w:szCs w:val="16"/>
+        </w:rPr>
+        <w:t xml:space="preserve">, 2024.</w:t>
       </w:r>
     </w:p>
     <w:p>
@@ -6388,23 +6677,7 @@
           <w:sz w:val="16"/>
           <w:szCs w:val="16"/>
         </w:rPr>
-        <w:t xml:space="preserve">C. Qian et al., “ChatDev: Communicative agents for software development,” in </w:t>
-      </w:r>
-      <w:r>
-        <w:rPr>
-          <w:i/>
-          <w:iCs/>
-          <w:sz w:val="16"/>
-          <w:szCs w:val="16"/>
-        </w:rPr>
-        <w:t xml:space="preserve">Proc. 62nd Annu. Meeting Assoc. Comput. Linguistics (ACL)</w:t>
-      </w:r>
-      <w:r>
-        <w:rPr>
-          <w:sz w:val="16"/>
-          <w:szCs w:val="16"/>
-        </w:rPr>
-        <w:t xml:space="preserve">, 2024.</w:t>
+        <w:t xml:space="preserve">Q. Wu et al., “AutoGen: Enabling next-gen LLM applications via multi-agent conversation,” arXiv:2308.08155, 2023.</w:t>
       </w:r>
     </w:p>
     <w:p>
@@ -6435,23 +6708,7 @@
           <w:sz w:val="16"/>
           <w:szCs w:val="16"/>
         </w:rPr>
-        <w:t xml:space="preserve">S. Hong et al., “MetaGPT: Meta programming for a multi-agent collaborative framework,” in </w:t>
-      </w:r>
-      <w:r>
-        <w:rPr>
-          <w:i/>
-          <w:iCs/>
-          <w:sz w:val="16"/>
-          <w:szCs w:val="16"/>
-        </w:rPr>
-        <w:t xml:space="preserve">Proc. Int. Conf. Learn. Represent. (ICLR)</w:t>
-      </w:r>
-      <w:r>
-        <w:rPr>
-          <w:sz w:val="16"/>
-          <w:szCs w:val="16"/>
-        </w:rPr>
-        <w:t xml:space="preserve">, 2024.</w:t>
+        <w:t xml:space="preserve">D. Huang, J. M. Zhang, M. Luck, Q. Bu, Y. Qing, and H. Cui, “AgentCoder: Multi-agent-based code generation with iterative testing and optimisation,” arXiv:2312.13010, 2023.</w:t>
       </w:r>
     </w:p>
     <w:p>
@@ -6482,7 +6739,23 @@
           <w:sz w:val="16"/>
           <w:szCs w:val="16"/>
         </w:rPr>
-        <w:t xml:space="preserve">Q. Wu et al., “AutoGen: Enabling next-gen LLM applications via multi-agent conversation,” arXiv:2308.08155, 2023.</w:t>
+        <w:t xml:space="preserve">A. Madaan et al., “Self-Refine: Iterative refinement with self-feedback,” in </w:t>
+      </w:r>
+      <w:r>
+        <w:rPr>
+          <w:i/>
+          <w:iCs/>
+          <w:sz w:val="16"/>
+          <w:szCs w:val="16"/>
+        </w:rPr>
+        <w:t xml:space="preserve">Proc. Adv. Neural Inf. Process. Syst. (NeurIPS)</w:t>
+      </w:r>
+      <w:r>
+        <w:rPr>
+          <w:sz w:val="16"/>
+          <w:szCs w:val="16"/>
+        </w:rPr>
+        <w:t xml:space="preserve">, 2023.</w:t>
       </w:r>
     </w:p>
     <w:p>
@@ -6513,7 +6786,23 @@
           <w:sz w:val="16"/>
           <w:szCs w:val="16"/>
         </w:rPr>
-        <w:t xml:space="preserve">D. Huang, J. M. Zhang, M. Luck, Q. Bu, Y. Qing, and H. Cui, “AgentCoder: Multi-agent-based code generation with iterative testing and optimisation,” arXiv:2312.13010, 2023.</w:t>
+        <w:t xml:space="preserve">N. Shinn, F. Cassano, A. Gopinath, K. Narasimhan, and S. Yao, “Reflexion: Language agents with verbal reinforcement learning,” in </w:t>
+      </w:r>
+      <w:r>
+        <w:rPr>
+          <w:i/>
+          <w:iCs/>
+          <w:sz w:val="16"/>
+          <w:szCs w:val="16"/>
+        </w:rPr>
+        <w:t xml:space="preserve">Proc. Adv. Neural Inf. Process. Syst. (NeurIPS)</w:t>
+      </w:r>
+      <w:r>
+        <w:rPr>
+          <w:sz w:val="16"/>
+          <w:szCs w:val="16"/>
+        </w:rPr>
+        <w:t xml:space="preserve">, 2023.</w:t>
       </w:r>
     </w:p>
     <w:p>
@@ -6544,7 +6833,7 @@
           <w:sz w:val="16"/>
           <w:szCs w:val="16"/>
         </w:rPr>
-        <w:t xml:space="preserve">A. Madaan et al., “Self-Refine: Iterative refinement with self-feedback,” in </w:t>
+        <w:t xml:space="preserve">J. Huang, X. Chen, S. Mishra, H. S. Zheng, A. W. Yu, X. Song, and D. Zhou, “Large language models cannot self-correct reasoning yet,” in </w:t>
       </w:r>
       <w:r>
         <w:rPr>
@@ -6553,14 +6842,14 @@
           <w:sz w:val="16"/>
           <w:szCs w:val="16"/>
         </w:rPr>
-        <w:t xml:space="preserve">Proc. Adv. Neural Inf. Process. Syst. (NeurIPS)</w:t>
-      </w:r>
-      <w:r>
-        <w:rPr>
-          <w:sz w:val="16"/>
-          <w:szCs w:val="16"/>
-        </w:rPr>
-        <w:t xml:space="preserve">, 2023.</w:t>
+        <w:t xml:space="preserve">Proc. Int. Conf. Learn. Represent. (ICLR)</w:t>
+      </w:r>
+      <w:r>
+        <w:rPr>
+          <w:sz w:val="16"/>
+          <w:szCs w:val="16"/>
+        </w:rPr>
+        <w:t xml:space="preserve">, 2024.</w:t>
       </w:r>
     </w:p>
     <w:p>
@@ -6591,7 +6880,7 @@
           <w:sz w:val="16"/>
           <w:szCs w:val="16"/>
         </w:rPr>
-        <w:t xml:space="preserve">N. Shinn, F. Cassano, A. Gopinath, K. Narasimhan, and S. Yao, “Reflexion: Language agents with verbal reinforcement learning,” in </w:t>
+        <w:t xml:space="preserve">L. Zheng et al., “Judging LLM-as-a-judge with MT-Bench and Chatbot Arena,” in </w:t>
       </w:r>
       <w:r>
         <w:rPr>
@@ -6600,7 +6889,7 @@
           <w:sz w:val="16"/>
           <w:szCs w:val="16"/>
         </w:rPr>
-        <w:t xml:space="preserve">Proc. Adv. Neural Inf. Process. Syst. (NeurIPS)</w:t>
+        <w:t xml:space="preserve">Proc. Adv. Neural Inf. Process. Syst. (NeurIPS), Datasets and Benchmarks Track</w:t>
       </w:r>
       <w:r>
         <w:rPr>
@@ -6638,7 +6927,7 @@
           <w:sz w:val="16"/>
           <w:szCs w:val="16"/>
         </w:rPr>
-        <w:t xml:space="preserve">J. Huang, X. Chen, S. Mishra, H. S. Zheng, A. W. Yu, X. Song, and D. Zhou, “Large language models cannot self-correct reasoning yet,” in </w:t>
+        <w:t xml:space="preserve">N. F. Liu, K. Lin, J. Hewitt, A. Paranjape, M. Bevilacqua, F. Petroni, and P. Liang, “Lost in the middle: How language models use long contexts,” </w:t>
       </w:r>
       <w:r>
         <w:rPr>
@@ -6647,14 +6936,14 @@
           <w:sz w:val="16"/>
           <w:szCs w:val="16"/>
         </w:rPr>
-        <w:t xml:space="preserve">Proc. Int. Conf. Learn. Represent. (ICLR)</w:t>
-      </w:r>
-      <w:r>
-        <w:rPr>
-          <w:sz w:val="16"/>
-          <w:szCs w:val="16"/>
-        </w:rPr>
-        <w:t xml:space="preserve">, 2024.</w:t>
+        <w:t xml:space="preserve">Trans. Assoc. Comput. Linguistics</w:t>
+      </w:r>
+      <w:r>
+        <w:rPr>
+          <w:sz w:val="16"/>
+          <w:szCs w:val="16"/>
+        </w:rPr>
+        <w:t xml:space="preserve">, vol. 12, pp. 157–173, 2024.</w:t>
       </w:r>
     </w:p>
     <w:p>
@@ -6682,26 +6971,19 @@
       </w:r>
       <w:r>
         <w:rPr>
-          <w:sz w:val="16"/>
-          <w:szCs w:val="16"/>
-        </w:rPr>
-        <w:t xml:space="preserve">L. Zheng et al., “Judging LLM-as-a-judge with MT-Bench and Chatbot Arena,” in </w:t>
-      </w:r>
-      <w:r>
-        <w:rPr>
           <w:i/>
           <w:iCs/>
           <w:sz w:val="16"/>
           <w:szCs w:val="16"/>
         </w:rPr>
-        <w:t xml:space="preserve">Proc. Adv. Neural Inf. Process. Syst. (NeurIPS), Datasets and Benchmarks Track</w:t>
-      </w:r>
-      <w:r>
-        <w:rPr>
-          <w:sz w:val="16"/>
-          <w:szCs w:val="16"/>
-        </w:rPr>
-        <w:t xml:space="preserve">, 2023.</w:t>
+        <w:t xml:space="preserve">Systems and Software Engineering—Life Cycle Processes—Requirements Engineering</w:t>
+      </w:r>
+      <w:r>
+        <w:rPr>
+          <w:sz w:val="16"/>
+          <w:szCs w:val="16"/>
+        </w:rPr>
+        <w:t xml:space="preserve">, ISO/IEC/IEEE 29148:2018, 2018.</w:t>
       </w:r>
     </w:p>
     <w:p>
@@ -6732,7 +7014,7 @@
           <w:sz w:val="16"/>
           <w:szCs w:val="16"/>
         </w:rPr>
-        <w:t xml:space="preserve">N. F. Liu, K. Lin, J. Hewitt, A. Paranjape, M. Bevilacqua, F. Petroni, and P. Liang, “Lost in the middle: How language models use long contexts,” </w:t>
+        <w:t xml:space="preserve">A. Ferrari, G. O. Spagnolo, and S. Gnesi, “PURE: A dataset of public requirements documents,” in </w:t>
       </w:r>
       <w:r>
         <w:rPr>
@@ -6741,14 +7023,14 @@
           <w:sz w:val="16"/>
           <w:szCs w:val="16"/>
         </w:rPr>
-        <w:t xml:space="preserve">Trans. Assoc. Comput. Linguistics</w:t>
-      </w:r>
-      <w:r>
-        <w:rPr>
-          <w:sz w:val="16"/>
-          <w:szCs w:val="16"/>
-        </w:rPr>
-        <w:t xml:space="preserve">, vol. 12, pp. 157–173, 2024.</w:t>
+        <w:t xml:space="preserve">Proc. IEEE 25th Int. Requirements Eng. Conf. (RE)</w:t>
+      </w:r>
+      <w:r>
+        <w:rPr>
+          <w:sz w:val="16"/>
+          <w:szCs w:val="16"/>
+        </w:rPr>
+        <w:t xml:space="preserve">, 2017, pp. 502–505.</w:t>
       </w:r>
     </w:p>
     <w:p>
@@ -6776,19 +7058,10 @@
       </w:r>
       <w:r>
         <w:rPr>
-          <w:i/>
-          <w:iCs/>
-          <w:sz w:val="16"/>
-          <w:szCs w:val="16"/>
-        </w:rPr>
-        <w:t xml:space="preserve">Systems and Software Engineering—Life Cycle Processes—Requirements Engineering</w:t>
-      </w:r>
-      <w:r>
-        <w:rPr>
-          <w:sz w:val="16"/>
-          <w:szCs w:val="16"/>
-        </w:rPr>
-        <w:t xml:space="preserve">, ISO/IEC/IEEE 29148:2018, 2018.</w:t>
+          <w:sz w:val="16"/>
+          <w:szCs w:val="16"/>
+        </w:rPr>
+        <w:t xml:space="preserve">P. Giannouris, “Multi-agent LLM system for UML class diagram generation from natural language requirements,” arXiv:2511.22409, 2025.</w:t>
       </w:r>
     </w:p>
     <w:p>
@@ -6819,23 +7092,7 @@
           <w:sz w:val="16"/>
           <w:szCs w:val="16"/>
         </w:rPr>
-        <w:t xml:space="preserve">A. Ferrari, G. O. Spagnolo, and S. Gnesi, “PURE: A dataset of public requirements documents,” in </w:t>
-      </w:r>
-      <w:r>
-        <w:rPr>
-          <w:i/>
-          <w:iCs/>
-          <w:sz w:val="16"/>
-          <w:szCs w:val="16"/>
-        </w:rPr>
-        <w:t xml:space="preserve">Proc. IEEE 25th Int. Requirements Eng. Conf. (RE)</w:t>
-      </w:r>
-      <w:r>
-        <w:rPr>
-          <w:sz w:val="16"/>
-          <w:szCs w:val="16"/>
-        </w:rPr>
-        <w:t xml:space="preserve">, 2017, pp. 502–505.</w:t>
+        <w:t xml:space="preserve">Ollama. [Online]. Available: https://ollama.com</w:t>
       </w:r>
     </w:p>
     <w:p>
@@ -6866,23 +7123,7 @@
           <w:sz w:val="16"/>
           <w:szCs w:val="16"/>
         </w:rPr>
-        <w:t xml:space="preserve">M. Lima, V. Valle, E. Costa, F. Lira, and B. Gadelha, “Software engineering repositories: Expanding the PROMISE database,” in </w:t>
-      </w:r>
-      <w:r>
-        <w:rPr>
-          <w:i/>
-          <w:iCs/>
-          <w:sz w:val="16"/>
-          <w:szCs w:val="16"/>
-        </w:rPr>
-        <w:t xml:space="preserve">Proc. 33rd Brazilian Symp. Softw. Eng. (SBES)</w:t>
-      </w:r>
-      <w:r>
-        <w:rPr>
-          <w:sz w:val="16"/>
-          <w:szCs w:val="16"/>
-        </w:rPr>
-        <w:t xml:space="preserve">, 2019.</w:t>
+        <w:t xml:space="preserve">Anthropic, “Model Context Protocol specification.” [Online]. Available: https://modelcontextprotocol.io</w:t>
       </w:r>
     </w:p>
     <w:p>
@@ -6913,7 +7154,7 @@
           <w:sz w:val="16"/>
           <w:szCs w:val="16"/>
         </w:rPr>
-        <w:t xml:space="preserve">P. Giannouris, “Multi-agent LLM system for UML class diagram generation from natural language requirements,” arXiv:2511.22409, 2025.</w:t>
+        <w:t xml:space="preserve">Anthropic, “web-artifacts-builder,” Agent Skills repository. [Online]. Available: https://github.com/anthropics/skills</w:t>
       </w:r>
     </w:p>
     <w:p>
@@ -6944,7 +7185,7 @@
           <w:sz w:val="16"/>
           <w:szCs w:val="16"/>
         </w:rPr>
-        <w:t xml:space="preserve">Ollama. [Online]. Available: https://ollama.com</w:t>
+        <w:t xml:space="preserve">Microsoft, “Playwright.” [Online]. Available: https://playwright.dev</w:t>
       </w:r>
     </w:p>
     <w:p>
@@ -6975,7 +7216,7 @@
           <w:sz w:val="16"/>
           <w:szCs w:val="16"/>
         </w:rPr>
-        <w:t xml:space="preserve">Anthropic, “Model Context Protocol specification.” [Online]. Available: https://modelcontextprotocol.io</w:t>
+        <w:t xml:space="preserve">Deque Systems, “axe-core: Accessibility engine for automated web UI testing.” [Online]. Available: https://github.com/dequelabs/axe-core</w:t>
       </w:r>
     </w:p>
     <w:p>
@@ -7006,7 +7247,7 @@
           <w:sz w:val="16"/>
           <w:szCs w:val="16"/>
         </w:rPr>
-        <w:t xml:space="preserve">Anthropic, “web-artifacts-builder,” Agent Skills repository. [Online]. Available: https://github.com/anthropics/skills</w:t>
+        <w:t xml:space="preserve">Google, “Lighthouse.” [Online]. Available: https://developer.chrome.com/docs/lighthouse</w:t>
       </w:r>
     </w:p>
     <w:p>
@@ -7037,7 +7278,7 @@
           <w:sz w:val="16"/>
           <w:szCs w:val="16"/>
         </w:rPr>
-        <w:t xml:space="preserve">Deque Systems, “axe-core: Accessibility engine for automated web UI testing.” [Online]. Available: https://github.com/dequelabs/axe-core</w:t>
+        <w:t xml:space="preserve">ZAP by Checkmarx (formerly OWASP ZAP), “Zed Attack Proxy.” [Online]. Available: https://www.zaproxy.org</w:t>
       </w:r>
     </w:p>
     <w:p>
@@ -7068,131 +7309,7 @@
           <w:sz w:val="16"/>
           <w:szCs w:val="16"/>
         </w:rPr>
-        <w:t xml:space="preserve">Google, “Lighthouse.” [Online]. Available: https://developer.chrome.com/docs/lighthouse</w:t>
-      </w:r>
-    </w:p>
-    <w:p>
-      <w:pPr>
-        <w:tabs>
-          <w:tab w:val="left" w:pos="400"/>
-        </w:tabs>
-        <w:spacing w:after="0"/>
-        <w:ind w:left="400" w:hanging="400"/>
-        <w:jc w:val="left"/>
-      </w:pPr>
-      <w:r>
-        <w:rPr>
-          <w:sz w:val="16"/>
-          <w:szCs w:val="16"/>
-        </w:rPr>
-        <w:t xml:space="preserve">[29]</w:t>
-      </w:r>
-      <w:r>
-        <w:rPr>
-          <w:sz w:val="16"/>
-          <w:szCs w:val="16"/>
-        </w:rPr>
-        <w:tab/>
-      </w:r>
-      <w:r>
-        <w:rPr>
-          <w:sz w:val="16"/>
-          <w:szCs w:val="16"/>
-        </w:rPr>
-        <w:t xml:space="preserve">ZAP by Checkmarx (formerly OWASP ZAP), “Zed Attack Proxy.” [Online]. Available: https://www.zaproxy.org</w:t>
-      </w:r>
-    </w:p>
-    <w:p>
-      <w:pPr>
-        <w:tabs>
-          <w:tab w:val="left" w:pos="400"/>
-        </w:tabs>
-        <w:spacing w:after="0"/>
-        <w:ind w:left="400" w:hanging="400"/>
-        <w:jc w:val="left"/>
-      </w:pPr>
-      <w:r>
-        <w:rPr>
-          <w:sz w:val="16"/>
-          <w:szCs w:val="16"/>
-        </w:rPr>
-        <w:t xml:space="preserve">[30]</w:t>
-      </w:r>
-      <w:r>
-        <w:rPr>
-          <w:sz w:val="16"/>
-          <w:szCs w:val="16"/>
-        </w:rPr>
-        <w:tab/>
-      </w:r>
-      <w:r>
-        <w:rPr>
-          <w:sz w:val="16"/>
-          <w:szCs w:val="16"/>
-        </w:rPr>
         <w:t xml:space="preserve">Microsoft, “Presidio: Data protection and de-identification SDK.” [Online]. Available: https://github.com/microsoft/presidio</w:t>
-      </w:r>
-    </w:p>
-    <w:p>
-      <w:pPr>
-        <w:tabs>
-          <w:tab w:val="left" w:pos="400"/>
-        </w:tabs>
-        <w:spacing w:after="0"/>
-        <w:ind w:left="400" w:hanging="400"/>
-        <w:jc w:val="left"/>
-      </w:pPr>
-      <w:r>
-        <w:rPr>
-          <w:sz w:val="16"/>
-          <w:szCs w:val="16"/>
-        </w:rPr>
-        <w:t xml:space="preserve">[31]</w:t>
-      </w:r>
-      <w:r>
-        <w:rPr>
-          <w:sz w:val="16"/>
-          <w:szCs w:val="16"/>
-        </w:rPr>
-        <w:tab/>
-      </w:r>
-      <w:r>
-        <w:rPr>
-          <w:sz w:val="16"/>
-          <w:szCs w:val="16"/>
-        </w:rPr>
-        <w:t xml:space="preserve">M. Honnibal, I. Montani, S. Van Landeghem, and A. Boyd, “spaCy: Industrial-strength natural language processing in Python,” 2020, doi: 10.5281/zenodo.1212303.</w:t>
-      </w:r>
-    </w:p>
-    <w:p>
-      <w:pPr>
-        <w:tabs>
-          <w:tab w:val="left" w:pos="400"/>
-        </w:tabs>
-        <w:spacing w:after="0"/>
-        <w:ind w:left="400" w:hanging="400"/>
-        <w:jc w:val="left"/>
-      </w:pPr>
-      <w:r>
-        <w:rPr>
-          <w:sz w:val="16"/>
-          <w:szCs w:val="16"/>
-        </w:rPr>
-        <w:t xml:space="preserve">[32]</w:t>
-      </w:r>
-      <w:r>
-        <w:rPr>
-          <w:sz w:val="16"/>
-          <w:szCs w:val="16"/>
-        </w:rPr>
-        <w:tab/>
-      </w:r>
-      <w:r>
-        <w:rPr>
-          <w:sz w:val="16"/>
-          <w:szCs w:val="16"/>
-        </w:rPr>
-        <w:t xml:space="preserve">Microsoft, “Playwright.” [Online]. Available: https://playwright.dev</w:t>
       </w:r>
     </w:p>
     <w:sectPr>

</xml_diff>

<commit_message>
Write the paper's Implementation section in full
Section IV now gives the technology stack layer by layer (Table III), the
backend runtime, the engine loop and its context handling, the parallel
lanes, the phased build as Algorithm 1, the verification logic (phase
records, run fingerprints, the isolated test database, route keys, the
audit score), command checks, the privacy vault, model access and retries,
and the release. Every constant is taken from the code; the README maps
each one to its file.

Co-Authored-By: Claude Opus 5.5 <noreply@anthropic.com>
Claude-Session: https://claude.ai/code/session_0111Df7UgJw8J3KuMVvbeH3J
</commit_message>
<xml_diff>
--- a/research/paper/AgentForge_ICAC2026_Paper.docx
+++ b/research/paper/AgentForge_ICAC2026_Paper.docx
@@ -4085,7 +4085,2656 @@
           <w:sz w:val="20"/>
           <w:szCs w:val="20"/>
         </w:rPr>
-        <w:t xml:space="preserve">AgentForge 1.0.3 has about 32,300 lines of Python (backend, engine and agents), 27,800 lines of JavaScript (Studio) and 19,500 lines of Markdown prompts. The backend serves its HTTP API and WebSocket feed from the Python standard library and uses Pydantic, the cryptography package, Presidio and spaCy. The Studio is a Next.js 16 and React 19 application; the Windows desktop app wraps it in Electron, reaches the backend over standard input and output, and installs through a 150 KB online installer that checks every file against a SHA-256 manifest. Generated applications come from 236 template files: the eleven stacks, a shared testing kit and 18 stack and testing guides. Models are chosen by the user: the bakery project in Section V-B used gpt-oss:120b through Ollama’s cloud, and accounts default to DeepSeek V4.1 Flash. The repository holds 1,733 Python unit tests and twelve Node test files, run against stand-in models.</w:t>
+        <w:t xml:space="preserve">AgentForge Studio 1.0.3 has about 32,300 lines of Python in the backend, the engine and the agents, 27,800 lines of JavaScript in the Studio, and 19,500 lines of Markdown prompts, including the 70 design themes and the deployment skill pages. Table </w:t>
+      </w:r>
+      <w:r>
+        <w:rPr>
+          <w:sz w:val="20"/>
+          <w:szCs w:val="20"/>
+        </w:rPr>
+        <w:t xml:space="preserve">III</w:t>
+      </w:r>
+      <w:r>
+        <w:rPr>
+          <w:sz w:val="20"/>
+          <w:szCs w:val="20"/>
+        </w:rPr>
+        <w:t xml:space="preserve"> lists the technology at each layer. Three choices shape the rest. The backend has no web framework; it runs on the Python standard library, so the desktop build carries an embedded interpreter and seven Python packages. Every model call goes through one client, which is where retries, account metering and the privacy filter live. And every artifact is a file in the project record, so any stage can be stopped, inspected and resumed.</w:t>
+      </w:r>
+    </w:p>
+    <w:p>
+      <w:pPr>
+        <w:keepNext/>
+        <w:spacing w:after="80" w:before="160"/>
+        <w:jc w:val="center"/>
+      </w:pPr>
+      <w:r>
+        <w:rPr>
+          <w:smallCaps/>
+          <w:sz w:val="16"/>
+          <w:szCs w:val="16"/>
+        </w:rPr>
+        <w:t xml:space="preserve">TABLE III.  </w:t>
+      </w:r>
+      <w:r>
+        <w:rPr>
+          <w:smallCaps/>
+          <w:sz w:val="16"/>
+          <w:szCs w:val="16"/>
+        </w:rPr>
+        <w:t xml:space="preserve">Technology Stack</w:t>
+      </w:r>
+    </w:p>
+    <w:tbl>
+      <w:tblPr>
+        <w:tblW w:type="dxa" w:w="5021"/>
+        <w:tblBorders>
+          <w:top w:val="single" w:color="000000" w:sz="4"/>
+          <w:left w:val="single" w:color="000000" w:sz="4"/>
+          <w:bottom w:val="single" w:color="000000" w:sz="4"/>
+          <w:right w:val="single" w:color="000000" w:sz="4"/>
+          <w:insideH w:val="single" w:color="000000" w:sz="4"/>
+          <w:insideV w:val="single" w:color="000000" w:sz="4"/>
+        </w:tblBorders>
+      </w:tblPr>
+      <w:tblGrid>
+        <w:gridCol w:w="1060"/>
+        <w:gridCol w:w="2361"/>
+        <w:gridCol w:w="1600"/>
+      </w:tblGrid>
+      <w:tr>
+        <w:trPr>
+          <w:tblHeader/>
+        </w:trPr>
+        <w:tc>
+          <w:tcPr>
+            <w:tcW w:type="dxa" w:w="1060"/>
+            <w:tcMar>
+              <w:top w:type="dxa" w:w="20"/>
+              <w:left w:type="dxa" w:w="45"/>
+              <w:bottom w:type="dxa" w:w="20"/>
+              <w:right w:type="dxa" w:w="45"/>
+            </w:tcMar>
+            <w:vAlign w:val="center"/>
+          </w:tcPr>
+          <w:p>
+            <w:pPr>
+              <w:spacing w:after="0"/>
+              <w:jc w:val="center"/>
+            </w:pPr>
+            <w:r>
+              <w:rPr>
+                <w:b/>
+                <w:bCs/>
+                <w:sz w:val="15"/>
+                <w:szCs w:val="15"/>
+              </w:rPr>
+              <w:t xml:space="preserve">Layer</w:t>
+            </w:r>
+          </w:p>
+        </w:tc>
+        <w:tc>
+          <w:tcPr>
+            <w:tcW w:type="dxa" w:w="2361"/>
+            <w:tcMar>
+              <w:top w:type="dxa" w:w="20"/>
+              <w:left w:type="dxa" w:w="45"/>
+              <w:bottom w:type="dxa" w:w="20"/>
+              <w:right w:type="dxa" w:w="45"/>
+            </w:tcMar>
+            <w:vAlign w:val="center"/>
+          </w:tcPr>
+          <w:p>
+            <w:pPr>
+              <w:spacing w:after="0"/>
+              <w:jc w:val="center"/>
+            </w:pPr>
+            <w:r>
+              <w:rPr>
+                <w:b/>
+                <w:bCs/>
+                <w:sz w:val="15"/>
+                <w:szCs w:val="15"/>
+              </w:rPr>
+              <w:t xml:space="preserve">Technologies</w:t>
+            </w:r>
+          </w:p>
+        </w:tc>
+        <w:tc>
+          <w:tcPr>
+            <w:tcW w:type="dxa" w:w="1600"/>
+            <w:tcMar>
+              <w:top w:type="dxa" w:w="20"/>
+              <w:left w:type="dxa" w:w="45"/>
+              <w:bottom w:type="dxa" w:w="20"/>
+              <w:right w:type="dxa" w:w="45"/>
+            </w:tcMar>
+            <w:vAlign w:val="center"/>
+          </w:tcPr>
+          <w:p>
+            <w:pPr>
+              <w:spacing w:after="0"/>
+              <w:jc w:val="center"/>
+            </w:pPr>
+            <w:r>
+              <w:rPr>
+                <w:b/>
+                <w:bCs/>
+                <w:sz w:val="15"/>
+                <w:szCs w:val="15"/>
+              </w:rPr>
+              <w:t xml:space="preserve">Used for</w:t>
+            </w:r>
+          </w:p>
+        </w:tc>
+      </w:tr>
+      <w:tr>
+        <w:trPr>
+          <w:cantSplit/>
+        </w:trPr>
+        <w:tc>
+          <w:tcPr>
+            <w:tcW w:type="dxa" w:w="1060"/>
+            <w:tcMar>
+              <w:top w:type="dxa" w:w="20"/>
+              <w:left w:type="dxa" w:w="45"/>
+              <w:bottom w:type="dxa" w:w="20"/>
+              <w:right w:type="dxa" w:w="45"/>
+            </w:tcMar>
+            <w:vAlign w:val="center"/>
+          </w:tcPr>
+          <w:p>
+            <w:pPr>
+              <w:spacing w:after="0"/>
+              <w:jc w:val="left"/>
+            </w:pPr>
+            <w:r>
+              <w:rPr>
+                <w:b w:val="false"/>
+                <w:bCs w:val="false"/>
+                <w:sz w:val="15"/>
+                <w:szCs w:val="15"/>
+              </w:rPr>
+              <w:t xml:space="preserve">Studio</w:t>
+            </w:r>
+          </w:p>
+        </w:tc>
+        <w:tc>
+          <w:tcPr>
+            <w:tcW w:type="dxa" w:w="2361"/>
+            <w:tcMar>
+              <w:top w:type="dxa" w:w="20"/>
+              <w:left w:type="dxa" w:w="45"/>
+              <w:bottom w:type="dxa" w:w="20"/>
+              <w:right w:type="dxa" w:w="45"/>
+            </w:tcMar>
+            <w:vAlign w:val="center"/>
+          </w:tcPr>
+          <w:p>
+            <w:pPr>
+              <w:spacing w:after="0"/>
+              <w:jc w:val="left"/>
+            </w:pPr>
+            <w:r>
+              <w:rPr>
+                <w:b w:val="false"/>
+                <w:bCs w:val="false"/>
+                <w:sz w:val="15"/>
+                <w:szCs w:val="15"/>
+              </w:rPr>
+              <w:t xml:space="preserve">Next.js 16, React 19, Tailwind CSS 4, Zustand 5, Lucide, JSZip</w:t>
+            </w:r>
+          </w:p>
+        </w:tc>
+        <w:tc>
+          <w:tcPr>
+            <w:tcW w:type="dxa" w:w="1600"/>
+            <w:tcMar>
+              <w:top w:type="dxa" w:w="20"/>
+              <w:left w:type="dxa" w:w="45"/>
+              <w:bottom w:type="dxa" w:w="20"/>
+              <w:right w:type="dxa" w:w="45"/>
+            </w:tcMar>
+            <w:vAlign w:val="center"/>
+          </w:tcPr>
+          <w:p>
+            <w:pPr>
+              <w:spacing w:after="0"/>
+              <w:jc w:val="left"/>
+            </w:pPr>
+            <w:r>
+              <w:rPr>
+                <w:b w:val="false"/>
+                <w:bCs w:val="false"/>
+                <w:sz w:val="15"/>
+                <w:szCs w:val="15"/>
+              </w:rPr>
+              <w:t xml:space="preserve">Chat, stage views, previews, testing and deployment panels</w:t>
+            </w:r>
+          </w:p>
+        </w:tc>
+      </w:tr>
+      <w:tr>
+        <w:trPr>
+          <w:cantSplit/>
+        </w:trPr>
+        <w:tc>
+          <w:tcPr>
+            <w:tcW w:type="dxa" w:w="1060"/>
+            <w:tcMar>
+              <w:top w:type="dxa" w:w="20"/>
+              <w:left w:type="dxa" w:w="45"/>
+              <w:bottom w:type="dxa" w:w="20"/>
+              <w:right w:type="dxa" w:w="45"/>
+            </w:tcMar>
+            <w:vAlign w:val="center"/>
+          </w:tcPr>
+          <w:p>
+            <w:pPr>
+              <w:spacing w:after="0"/>
+              <w:jc w:val="left"/>
+            </w:pPr>
+            <w:r>
+              <w:rPr>
+                <w:b w:val="false"/>
+                <w:bCs w:val="false"/>
+                <w:sz w:val="15"/>
+                <w:szCs w:val="15"/>
+              </w:rPr>
+              <w:t xml:space="preserve">Desktop</w:t>
+            </w:r>
+          </w:p>
+        </w:tc>
+        <w:tc>
+          <w:tcPr>
+            <w:tcW w:type="dxa" w:w="2361"/>
+            <w:tcMar>
+              <w:top w:type="dxa" w:w="20"/>
+              <w:left w:type="dxa" w:w="45"/>
+              <w:bottom w:type="dxa" w:w="20"/>
+              <w:right w:type="dxa" w:w="45"/>
+            </w:tcMar>
+            <w:vAlign w:val="center"/>
+          </w:tcPr>
+          <w:p>
+            <w:pPr>
+              <w:spacing w:after="0"/>
+              <w:jc w:val="left"/>
+            </w:pPr>
+            <w:r>
+              <w:rPr>
+                <w:b w:val="false"/>
+                <w:bCs w:val="false"/>
+                <w:sz w:val="15"/>
+                <w:szCs w:val="15"/>
+              </w:rPr>
+              <w:t xml:space="preserve">Electron 44, electron-builder 26, agentforge:// scheme, C# online installer</w:t>
+            </w:r>
+          </w:p>
+        </w:tc>
+        <w:tc>
+          <w:tcPr>
+            <w:tcW w:type="dxa" w:w="1600"/>
+            <w:tcMar>
+              <w:top w:type="dxa" w:w="20"/>
+              <w:left w:type="dxa" w:w="45"/>
+              <w:bottom w:type="dxa" w:w="20"/>
+              <w:right w:type="dxa" w:w="45"/>
+            </w:tcMar>
+            <w:vAlign w:val="center"/>
+          </w:tcPr>
+          <w:p>
+            <w:pPr>
+              <w:spacing w:after="0"/>
+              <w:jc w:val="left"/>
+            </w:pPr>
+            <w:r>
+              <w:rPr>
+                <w:b w:val="false"/>
+                <w:bCs w:val="false"/>
+                <w:sz w:val="15"/>
+                <w:szCs w:val="15"/>
+              </w:rPr>
+              <w:t xml:space="preserve">One window; backend over stdio</w:t>
+            </w:r>
+          </w:p>
+        </w:tc>
+      </w:tr>
+      <w:tr>
+        <w:trPr>
+          <w:cantSplit/>
+        </w:trPr>
+        <w:tc>
+          <w:tcPr>
+            <w:tcW w:type="dxa" w:w="1060"/>
+            <w:tcMar>
+              <w:top w:type="dxa" w:w="20"/>
+              <w:left w:type="dxa" w:w="45"/>
+              <w:bottom w:type="dxa" w:w="20"/>
+              <w:right w:type="dxa" w:w="45"/>
+            </w:tcMar>
+            <w:vAlign w:val="center"/>
+          </w:tcPr>
+          <w:p>
+            <w:pPr>
+              <w:spacing w:after="0"/>
+              <w:jc w:val="left"/>
+            </w:pPr>
+            <w:r>
+              <w:rPr>
+                <w:b w:val="false"/>
+                <w:bCs w:val="false"/>
+                <w:sz w:val="15"/>
+                <w:szCs w:val="15"/>
+              </w:rPr>
+              <w:t xml:space="preserve">Backend</w:t>
+            </w:r>
+          </w:p>
+        </w:tc>
+        <w:tc>
+          <w:tcPr>
+            <w:tcW w:type="dxa" w:w="2361"/>
+            <w:tcMar>
+              <w:top w:type="dxa" w:w="20"/>
+              <w:left w:type="dxa" w:w="45"/>
+              <w:bottom w:type="dxa" w:w="20"/>
+              <w:right w:type="dxa" w:w="45"/>
+            </w:tcMar>
+            <w:vAlign w:val="center"/>
+          </w:tcPr>
+          <w:p>
+            <w:pPr>
+              <w:spacing w:after="0"/>
+              <w:jc w:val="left"/>
+            </w:pPr>
+            <w:r>
+              <w:rPr>
+                <w:b w:val="false"/>
+                <w:bCs w:val="false"/>
+                <w:sz w:val="15"/>
+                <w:szCs w:val="15"/>
+              </w:rPr>
+              <w:t xml:space="preserve">Python 3.10+ standard library (ThreadingHTTPServer, RFC 6455 feed, threads), Pydantic 2, httpx, cryptography (Fernet)</w:t>
+            </w:r>
+          </w:p>
+        </w:tc>
+        <w:tc>
+          <w:tcPr>
+            <w:tcW w:type="dxa" w:w="1600"/>
+            <w:tcMar>
+              <w:top w:type="dxa" w:w="20"/>
+              <w:left w:type="dxa" w:w="45"/>
+              <w:bottom w:type="dxa" w:w="20"/>
+              <w:right w:type="dxa" w:w="45"/>
+            </w:tcMar>
+            <w:vAlign w:val="center"/>
+          </w:tcPr>
+          <w:p>
+            <w:pPr>
+              <w:spacing w:after="0"/>
+              <w:jc w:val="left"/>
+            </w:pPr>
+            <w:r>
+              <w:rPr>
+                <w:b w:val="false"/>
+                <w:bCs w:val="false"/>
+                <w:sz w:val="15"/>
+                <w:szCs w:val="15"/>
+              </w:rPr>
+              <w:t xml:space="preserve">API, jobs, event bus, schema, vault</w:t>
+            </w:r>
+          </w:p>
+        </w:tc>
+      </w:tr>
+      <w:tr>
+        <w:trPr>
+          <w:cantSplit/>
+        </w:trPr>
+        <w:tc>
+          <w:tcPr>
+            <w:tcW w:type="dxa" w:w="1060"/>
+            <w:tcMar>
+              <w:top w:type="dxa" w:w="20"/>
+              <w:left w:type="dxa" w:w="45"/>
+              <w:bottom w:type="dxa" w:w="20"/>
+              <w:right w:type="dxa" w:w="45"/>
+            </w:tcMar>
+            <w:vAlign w:val="center"/>
+          </w:tcPr>
+          <w:p>
+            <w:pPr>
+              <w:spacing w:after="0"/>
+              <w:jc w:val="left"/>
+            </w:pPr>
+            <w:r>
+              <w:rPr>
+                <w:b w:val="false"/>
+                <w:bCs w:val="false"/>
+                <w:sz w:val="15"/>
+                <w:szCs w:val="15"/>
+              </w:rPr>
+              <w:t xml:space="preserve">Engine</w:t>
+            </w:r>
+          </w:p>
+        </w:tc>
+        <w:tc>
+          <w:tcPr>
+            <w:tcW w:type="dxa" w:w="2361"/>
+            <w:tcMar>
+              <w:top w:type="dxa" w:w="20"/>
+              <w:left w:type="dxa" w:w="45"/>
+              <w:bottom w:type="dxa" w:w="20"/>
+              <w:right w:type="dxa" w:w="45"/>
+            </w:tcMar>
+            <w:vAlign w:val="center"/>
+          </w:tcPr>
+          <w:p>
+            <w:pPr>
+              <w:spacing w:after="0"/>
+              <w:jc w:val="left"/>
+            </w:pPr>
+            <w:r>
+              <w:rPr>
+                <w:b w:val="false"/>
+                <w:bCs w:val="false"/>
+                <w:sz w:val="15"/>
+                <w:szCs w:val="15"/>
+              </w:rPr>
+              <w:t xml:space="preserve">Ollama Python SDK, ten tools, MCP client (JSON-RPC 2.0 over stdio)</w:t>
+            </w:r>
+          </w:p>
+        </w:tc>
+        <w:tc>
+          <w:tcPr>
+            <w:tcW w:type="dxa" w:w="1600"/>
+            <w:tcMar>
+              <w:top w:type="dxa" w:w="20"/>
+              <w:left w:type="dxa" w:w="45"/>
+              <w:bottom w:type="dxa" w:w="20"/>
+              <w:right w:type="dxa" w:w="45"/>
+            </w:tcMar>
+            <w:vAlign w:val="center"/>
+          </w:tcPr>
+          <w:p>
+            <w:pPr>
+              <w:spacing w:after="0"/>
+              <w:jc w:val="left"/>
+            </w:pPr>
+            <w:r>
+              <w:rPr>
+                <w:b w:val="false"/>
+                <w:bCs w:val="false"/>
+                <w:sz w:val="15"/>
+                <w:szCs w:val="15"/>
+              </w:rPr>
+              <w:t xml:space="preserve">Tool-calling loop of every agent role</w:t>
+            </w:r>
+          </w:p>
+        </w:tc>
+      </w:tr>
+      <w:tr>
+        <w:trPr>
+          <w:cantSplit/>
+        </w:trPr>
+        <w:tc>
+          <w:tcPr>
+            <w:tcW w:type="dxa" w:w="1060"/>
+            <w:tcMar>
+              <w:top w:type="dxa" w:w="20"/>
+              <w:left w:type="dxa" w:w="45"/>
+              <w:bottom w:type="dxa" w:w="20"/>
+              <w:right w:type="dxa" w:w="45"/>
+            </w:tcMar>
+            <w:vAlign w:val="center"/>
+          </w:tcPr>
+          <w:p>
+            <w:pPr>
+              <w:spacing w:after="0"/>
+              <w:jc w:val="left"/>
+            </w:pPr>
+            <w:r>
+              <w:rPr>
+                <w:b w:val="false"/>
+                <w:bCs w:val="false"/>
+                <w:sz w:val="15"/>
+                <w:szCs w:val="15"/>
+              </w:rPr>
+              <w:t xml:space="preserve">Models</w:t>
+            </w:r>
+          </w:p>
+        </w:tc>
+        <w:tc>
+          <w:tcPr>
+            <w:tcW w:type="dxa" w:w="2361"/>
+            <w:tcMar>
+              <w:top w:type="dxa" w:w="20"/>
+              <w:left w:type="dxa" w:w="45"/>
+              <w:bottom w:type="dxa" w:w="20"/>
+              <w:right w:type="dxa" w:w="45"/>
+            </w:tcMar>
+            <w:vAlign w:val="center"/>
+          </w:tcPr>
+          <w:p>
+            <w:pPr>
+              <w:spacing w:after="0"/>
+              <w:jc w:val="left"/>
+            </w:pPr>
+            <w:r>
+              <w:rPr>
+                <w:b w:val="false"/>
+                <w:bCs w:val="false"/>
+                <w:sz w:val="15"/>
+                <w:szCs w:val="15"/>
+              </w:rPr>
+              <w:t xml:space="preserve">Local Ollama; ollama.com; Cloudflare Worker proxy with accounts</w:t>
+            </w:r>
+          </w:p>
+        </w:tc>
+        <w:tc>
+          <w:tcPr>
+            <w:tcW w:type="dxa" w:w="1600"/>
+            <w:tcMar>
+              <w:top w:type="dxa" w:w="20"/>
+              <w:left w:type="dxa" w:w="45"/>
+              <w:bottom w:type="dxa" w:w="20"/>
+              <w:right w:type="dxa" w:w="45"/>
+            </w:tcMar>
+            <w:vAlign w:val="center"/>
+          </w:tcPr>
+          <w:p>
+            <w:pPr>
+              <w:spacing w:after="0"/>
+              <w:jc w:val="left"/>
+            </w:pPr>
+            <w:r>
+              <w:rPr>
+                <w:b w:val="false"/>
+                <w:bCs w:val="false"/>
+                <w:sz w:val="15"/>
+                <w:szCs w:val="15"/>
+              </w:rPr>
+              <w:t xml:space="preserve">User-chosen model; vision detected per model</w:t>
+            </w:r>
+          </w:p>
+        </w:tc>
+      </w:tr>
+      <w:tr>
+        <w:trPr>
+          <w:cantSplit/>
+        </w:trPr>
+        <w:tc>
+          <w:tcPr>
+            <w:tcW w:type="dxa" w:w="1060"/>
+            <w:tcMar>
+              <w:top w:type="dxa" w:w="20"/>
+              <w:left w:type="dxa" w:w="45"/>
+              <w:bottom w:type="dxa" w:w="20"/>
+              <w:right w:type="dxa" w:w="45"/>
+            </w:tcMar>
+            <w:vAlign w:val="center"/>
+          </w:tcPr>
+          <w:p>
+            <w:pPr>
+              <w:spacing w:after="0"/>
+              <w:jc w:val="left"/>
+            </w:pPr>
+            <w:r>
+              <w:rPr>
+                <w:b w:val="false"/>
+                <w:bCs w:val="false"/>
+                <w:sz w:val="15"/>
+                <w:szCs w:val="15"/>
+              </w:rPr>
+              <w:t xml:space="preserve">Privacy</w:t>
+            </w:r>
+          </w:p>
+        </w:tc>
+        <w:tc>
+          <w:tcPr>
+            <w:tcW w:type="dxa" w:w="2361"/>
+            <w:tcMar>
+              <w:top w:type="dxa" w:w="20"/>
+              <w:left w:type="dxa" w:w="45"/>
+              <w:bottom w:type="dxa" w:w="20"/>
+              <w:right w:type="dxa" w:w="45"/>
+            </w:tcMar>
+            <w:vAlign w:val="center"/>
+          </w:tcPr>
+          <w:p>
+            <w:pPr>
+              <w:spacing w:after="0"/>
+              <w:jc w:val="left"/>
+            </w:pPr>
+            <w:r>
+              <w:rPr>
+                <w:b w:val="false"/>
+                <w:bCs w:val="false"/>
+                <w:sz w:val="15"/>
+                <w:szCs w:val="15"/>
+              </w:rPr>
+              <w:t xml:space="preserve">Microsoft Presidio, spaCy en_core_web_sm</w:t>
+            </w:r>
+          </w:p>
+        </w:tc>
+        <w:tc>
+          <w:tcPr>
+            <w:tcW w:type="dxa" w:w="1600"/>
+            <w:tcMar>
+              <w:top w:type="dxa" w:w="20"/>
+              <w:left w:type="dxa" w:w="45"/>
+              <w:bottom w:type="dxa" w:w="20"/>
+              <w:right w:type="dxa" w:w="45"/>
+            </w:tcMar>
+            <w:vAlign w:val="center"/>
+          </w:tcPr>
+          <w:p>
+            <w:pPr>
+              <w:spacing w:after="0"/>
+              <w:jc w:val="left"/>
+            </w:pPr>
+            <w:r>
+              <w:rPr>
+                <w:b w:val="false"/>
+                <w:bCs w:val="false"/>
+                <w:sz w:val="15"/>
+                <w:szCs w:val="15"/>
+              </w:rPr>
+              <w:t xml:space="preserve">15 entity types hidden from models</w:t>
+            </w:r>
+          </w:p>
+        </w:tc>
+      </w:tr>
+      <w:tr>
+        <w:trPr>
+          <w:cantSplit/>
+        </w:trPr>
+        <w:tc>
+          <w:tcPr>
+            <w:tcW w:type="dxa" w:w="1060"/>
+            <w:tcMar>
+              <w:top w:type="dxa" w:w="20"/>
+              <w:left w:type="dxa" w:w="45"/>
+              <w:bottom w:type="dxa" w:w="20"/>
+              <w:right w:type="dxa" w:w="45"/>
+            </w:tcMar>
+            <w:vAlign w:val="center"/>
+          </w:tcPr>
+          <w:p>
+            <w:pPr>
+              <w:spacing w:after="0"/>
+              <w:jc w:val="left"/>
+            </w:pPr>
+            <w:r>
+              <w:rPr>
+                <w:b w:val="false"/>
+                <w:bCs w:val="false"/>
+                <w:sz w:val="15"/>
+                <w:szCs w:val="15"/>
+              </w:rPr>
+              <w:t xml:space="preserve">Documents</w:t>
+            </w:r>
+          </w:p>
+        </w:tc>
+        <w:tc>
+          <w:tcPr>
+            <w:tcW w:type="dxa" w:w="2361"/>
+            <w:tcMar>
+              <w:top w:type="dxa" w:w="20"/>
+              <w:left w:type="dxa" w:w="45"/>
+              <w:bottom w:type="dxa" w:w="20"/>
+              <w:right w:type="dxa" w:w="45"/>
+            </w:tcMar>
+            <w:vAlign w:val="center"/>
+          </w:tcPr>
+          <w:p>
+            <w:pPr>
+              <w:spacing w:after="0"/>
+              <w:jc w:val="left"/>
+            </w:pPr>
+            <w:r>
+              <w:rPr>
+                <w:b w:val="false"/>
+                <w:bCs w:val="false"/>
+                <w:sz w:val="15"/>
+                <w:szCs w:val="15"/>
+              </w:rPr>
+              <w:t xml:space="preserve">Mermaid CLI; marked and Puppeteer</w:t>
+            </w:r>
+          </w:p>
+        </w:tc>
+        <w:tc>
+          <w:tcPr>
+            <w:tcW w:type="dxa" w:w="1600"/>
+            <w:tcMar>
+              <w:top w:type="dxa" w:w="20"/>
+              <w:left w:type="dxa" w:w="45"/>
+              <w:bottom w:type="dxa" w:w="20"/>
+              <w:right w:type="dxa" w:w="45"/>
+            </w:tcMar>
+            <w:vAlign w:val="center"/>
+          </w:tcPr>
+          <w:p>
+            <w:pPr>
+              <w:spacing w:after="0"/>
+              <w:jc w:val="left"/>
+            </w:pPr>
+            <w:r>
+              <w:rPr>
+                <w:b w:val="false"/>
+                <w:bCs w:val="false"/>
+                <w:sz w:val="15"/>
+                <w:szCs w:val="15"/>
+              </w:rPr>
+              <w:t xml:space="preserve">SVG diagrams; specification PDF</w:t>
+            </w:r>
+          </w:p>
+        </w:tc>
+      </w:tr>
+      <w:tr>
+        <w:trPr>
+          <w:cantSplit/>
+        </w:trPr>
+        <w:tc>
+          <w:tcPr>
+            <w:tcW w:type="dxa" w:w="1060"/>
+            <w:tcMar>
+              <w:top w:type="dxa" w:w="20"/>
+              <w:left w:type="dxa" w:w="45"/>
+              <w:bottom w:type="dxa" w:w="20"/>
+              <w:right w:type="dxa" w:w="45"/>
+            </w:tcMar>
+            <w:vAlign w:val="center"/>
+          </w:tcPr>
+          <w:p>
+            <w:pPr>
+              <w:spacing w:after="0"/>
+              <w:jc w:val="left"/>
+            </w:pPr>
+            <w:r>
+              <w:rPr>
+                <w:b w:val="false"/>
+                <w:bCs w:val="false"/>
+                <w:sz w:val="15"/>
+                <w:szCs w:val="15"/>
+              </w:rPr>
+              <w:t xml:space="preserve">Wireframe and prototype kit</w:t>
+            </w:r>
+          </w:p>
+        </w:tc>
+        <w:tc>
+          <w:tcPr>
+            <w:tcW w:type="dxa" w:w="2361"/>
+            <w:tcMar>
+              <w:top w:type="dxa" w:w="20"/>
+              <w:left w:type="dxa" w:w="45"/>
+              <w:bottom w:type="dxa" w:w="20"/>
+              <w:right w:type="dxa" w:w="45"/>
+            </w:tcMar>
+            <w:vAlign w:val="center"/>
+          </w:tcPr>
+          <w:p>
+            <w:pPr>
+              <w:spacing w:after="0"/>
+              <w:jc w:val="left"/>
+            </w:pPr>
+            <w:r>
+              <w:rPr>
+                <w:b w:val="false"/>
+                <w:bCs w:val="false"/>
+                <w:sz w:val="15"/>
+                <w:szCs w:val="15"/>
+              </w:rPr>
+              <w:t xml:space="preserve">Vite 5, React 18, TypeScript 5, Tailwind 3.4, shadcn/ui (Radix), Recharts, vite-plugin-singlefile</w:t>
+            </w:r>
+          </w:p>
+        </w:tc>
+        <w:tc>
+          <w:tcPr>
+            <w:tcW w:type="dxa" w:w="1600"/>
+            <w:tcMar>
+              <w:top w:type="dxa" w:w="20"/>
+              <w:left w:type="dxa" w:w="45"/>
+              <w:bottom w:type="dxa" w:w="20"/>
+              <w:right w:type="dxa" w:w="45"/>
+            </w:tcMar>
+            <w:vAlign w:val="center"/>
+          </w:tcPr>
+          <w:p>
+            <w:pPr>
+              <w:spacing w:after="0"/>
+              <w:jc w:val="left"/>
+            </w:pPr>
+            <w:r>
+              <w:rPr>
+                <w:b w:val="false"/>
+                <w:bCs w:val="false"/>
+                <w:sz w:val="15"/>
+                <w:szCs w:val="15"/>
+              </w:rPr>
+              <w:t xml:space="preserve">One self-contained bundle.html per app</w:t>
+            </w:r>
+          </w:p>
+        </w:tc>
+      </w:tr>
+      <w:tr>
+        <w:trPr>
+          <w:cantSplit/>
+        </w:trPr>
+        <w:tc>
+          <w:tcPr>
+            <w:tcW w:type="dxa" w:w="1060"/>
+            <w:tcMar>
+              <w:top w:type="dxa" w:w="20"/>
+              <w:left w:type="dxa" w:w="45"/>
+              <w:bottom w:type="dxa" w:w="20"/>
+              <w:right w:type="dxa" w:w="45"/>
+            </w:tcMar>
+            <w:vAlign w:val="center"/>
+          </w:tcPr>
+          <w:p>
+            <w:pPr>
+              <w:spacing w:after="0"/>
+              <w:jc w:val="left"/>
+            </w:pPr>
+            <w:r>
+              <w:rPr>
+                <w:b w:val="false"/>
+                <w:bCs w:val="false"/>
+                <w:sz w:val="15"/>
+                <w:szCs w:val="15"/>
+              </w:rPr>
+              <w:t xml:space="preserve">Browser</w:t>
+            </w:r>
+          </w:p>
+        </w:tc>
+        <w:tc>
+          <w:tcPr>
+            <w:tcW w:type="dxa" w:w="2361"/>
+            <w:tcMar>
+              <w:top w:type="dxa" w:w="20"/>
+              <w:left w:type="dxa" w:w="45"/>
+              <w:bottom w:type="dxa" w:w="20"/>
+              <w:right w:type="dxa" w:w="45"/>
+            </w:tcMar>
+            <w:vAlign w:val="center"/>
+          </w:tcPr>
+          <w:p>
+            <w:pPr>
+              <w:spacing w:after="0"/>
+              <w:jc w:val="left"/>
+            </w:pPr>
+            <w:r>
+              <w:rPr>
+                <w:b w:val="false"/>
+                <w:bCs w:val="false"/>
+                <w:sz w:val="15"/>
+                <w:szCs w:val="15"/>
+              </w:rPr>
+              <w:t xml:space="preserve">Playwright Chromium; Edge or Chrome in headless mode</w:t>
+            </w:r>
+          </w:p>
+        </w:tc>
+        <w:tc>
+          <w:tcPr>
+            <w:tcW w:type="dxa" w:w="1600"/>
+            <w:tcMar>
+              <w:top w:type="dxa" w:w="20"/>
+              <w:left w:type="dxa" w:w="45"/>
+              <w:bottom w:type="dxa" w:w="20"/>
+              <w:right w:type="dxa" w:w="45"/>
+            </w:tcMar>
+            <w:vAlign w:val="center"/>
+          </w:tcPr>
+          <w:p>
+            <w:pPr>
+              <w:spacing w:after="0"/>
+              <w:jc w:val="left"/>
+            </w:pPr>
+            <w:r>
+              <w:rPr>
+                <w:b w:val="false"/>
+                <w:bCs w:val="false"/>
+                <w:sz w:val="15"/>
+                <w:szCs w:val="15"/>
+              </w:rPr>
+              <w:t xml:space="preserve">Screenshots, page inspection, journey walk</w:t>
+            </w:r>
+          </w:p>
+        </w:tc>
+      </w:tr>
+      <w:tr>
+        <w:trPr>
+          <w:cantSplit/>
+        </w:trPr>
+        <w:tc>
+          <w:tcPr>
+            <w:tcW w:type="dxa" w:w="1060"/>
+            <w:tcMar>
+              <w:top w:type="dxa" w:w="20"/>
+              <w:left w:type="dxa" w:w="45"/>
+              <w:bottom w:type="dxa" w:w="20"/>
+              <w:right w:type="dxa" w:w="45"/>
+            </w:tcMar>
+            <w:vAlign w:val="center"/>
+          </w:tcPr>
+          <w:p>
+            <w:pPr>
+              <w:spacing w:after="0"/>
+              <w:jc w:val="left"/>
+            </w:pPr>
+            <w:r>
+              <w:rPr>
+                <w:b w:val="false"/>
+                <w:bCs w:val="false"/>
+                <w:sz w:val="15"/>
+                <w:szCs w:val="15"/>
+              </w:rPr>
+              <w:t xml:space="preserve">Generated apps</w:t>
+            </w:r>
+          </w:p>
+        </w:tc>
+        <w:tc>
+          <w:tcPr>
+            <w:tcW w:type="dxa" w:w="2361"/>
+            <w:tcMar>
+              <w:top w:type="dxa" w:w="20"/>
+              <w:left w:type="dxa" w:w="45"/>
+              <w:bottom w:type="dxa" w:w="20"/>
+              <w:right w:type="dxa" w:w="45"/>
+            </w:tcMar>
+            <w:vAlign w:val="center"/>
+          </w:tcPr>
+          <w:p>
+            <w:pPr>
+              <w:spacing w:after="0"/>
+              <w:jc w:val="left"/>
+            </w:pPr>
+            <w:r>
+              <w:rPr>
+                <w:b w:val="false"/>
+                <w:bCs w:val="false"/>
+                <w:sz w:val="15"/>
+                <w:szCs w:val="15"/>
+              </w:rPr>
+              <w:t xml:space="preserve">Next.js 15; Remix 2 and Vite 6; Express 4; Supabase (supabase-js 2, @supabase/ssr); MongoDB with Mongoose 8; bcryptjs, jose</w:t>
+            </w:r>
+          </w:p>
+        </w:tc>
+        <w:tc>
+          <w:tcPr>
+            <w:tcW w:type="dxa" w:w="1600"/>
+            <w:tcMar>
+              <w:top w:type="dxa" w:w="20"/>
+              <w:left w:type="dxa" w:w="45"/>
+              <w:bottom w:type="dxa" w:w="20"/>
+              <w:right w:type="dxa" w:w="45"/>
+            </w:tcMar>
+            <w:vAlign w:val="center"/>
+          </w:tcPr>
+          <w:p>
+            <w:pPr>
+              <w:spacing w:after="0"/>
+              <w:jc w:val="left"/>
+            </w:pPr>
+            <w:r>
+              <w:rPr>
+                <w:b w:val="false"/>
+                <w:bCs w:val="false"/>
+                <w:sz w:val="15"/>
+                <w:szCs w:val="15"/>
+              </w:rPr>
+              <w:t xml:space="preserve">Eleven stack templates</w:t>
+            </w:r>
+          </w:p>
+        </w:tc>
+      </w:tr>
+      <w:tr>
+        <w:trPr>
+          <w:cantSplit/>
+        </w:trPr>
+        <w:tc>
+          <w:tcPr>
+            <w:tcW w:type="dxa" w:w="1060"/>
+            <w:tcMar>
+              <w:top w:type="dxa" w:w="20"/>
+              <w:left w:type="dxa" w:w="45"/>
+              <w:bottom w:type="dxa" w:w="20"/>
+              <w:right w:type="dxa" w:w="45"/>
+            </w:tcMar>
+            <w:vAlign w:val="center"/>
+          </w:tcPr>
+          <w:p>
+            <w:pPr>
+              <w:spacing w:after="0"/>
+              <w:jc w:val="left"/>
+            </w:pPr>
+            <w:r>
+              <w:rPr>
+                <w:b w:val="false"/>
+                <w:bCs w:val="false"/>
+                <w:sz w:val="15"/>
+                <w:szCs w:val="15"/>
+              </w:rPr>
+              <w:t xml:space="preserve">Generated tests</w:t>
+            </w:r>
+          </w:p>
+        </w:tc>
+        <w:tc>
+          <w:tcPr>
+            <w:tcW w:type="dxa" w:w="2361"/>
+            <w:tcMar>
+              <w:top w:type="dxa" w:w="20"/>
+              <w:left w:type="dxa" w:w="45"/>
+              <w:bottom w:type="dxa" w:w="20"/>
+              <w:right w:type="dxa" w:w="45"/>
+            </w:tcMar>
+            <w:vAlign w:val="center"/>
+          </w:tcPr>
+          <w:p>
+            <w:pPr>
+              <w:spacing w:after="0"/>
+              <w:jc w:val="left"/>
+            </w:pPr>
+            <w:r>
+              <w:rPr>
+                <w:b w:val="false"/>
+                <w:bCs w:val="false"/>
+                <w:sz w:val="15"/>
+                <w:szCs w:val="15"/>
+              </w:rPr>
+              <w:t xml:space="preserve">Vitest, Testing Library, Supertest, Playwright 1.62, axe-core, Lighthouse CI, ZAP, npm audit, GitHub Actions</w:t>
+            </w:r>
+          </w:p>
+        </w:tc>
+        <w:tc>
+          <w:tcPr>
+            <w:tcW w:type="dxa" w:w="1600"/>
+            <w:tcMar>
+              <w:top w:type="dxa" w:w="20"/>
+              <w:left w:type="dxa" w:w="45"/>
+              <w:bottom w:type="dxa" w:w="20"/>
+              <w:right w:type="dxa" w:w="45"/>
+            </w:tcMar>
+            <w:vAlign w:val="center"/>
+          </w:tcPr>
+          <w:p>
+            <w:pPr>
+              <w:spacing w:after="0"/>
+              <w:jc w:val="left"/>
+            </w:pPr>
+            <w:r>
+              <w:rPr>
+                <w:b w:val="false"/>
+                <w:bCs w:val="false"/>
+                <w:sz w:val="15"/>
+                <w:szCs w:val="15"/>
+              </w:rPr>
+              <w:t xml:space="preserve">Unit, journey, visual, a11y, performance, security</w:t>
+            </w:r>
+          </w:p>
+        </w:tc>
+      </w:tr>
+      <w:tr>
+        <w:trPr>
+          <w:cantSplit/>
+        </w:trPr>
+        <w:tc>
+          <w:tcPr>
+            <w:tcW w:type="dxa" w:w="1060"/>
+            <w:tcMar>
+              <w:top w:type="dxa" w:w="20"/>
+              <w:left w:type="dxa" w:w="45"/>
+              <w:bottom w:type="dxa" w:w="20"/>
+              <w:right w:type="dxa" w:w="45"/>
+            </w:tcMar>
+            <w:vAlign w:val="center"/>
+          </w:tcPr>
+          <w:p>
+            <w:pPr>
+              <w:spacing w:after="0"/>
+              <w:jc w:val="left"/>
+            </w:pPr>
+            <w:r>
+              <w:rPr>
+                <w:b w:val="false"/>
+                <w:bCs w:val="false"/>
+                <w:sz w:val="15"/>
+                <w:szCs w:val="15"/>
+              </w:rPr>
+              <w:t xml:space="preserve">Cloud</w:t>
+            </w:r>
+          </w:p>
+        </w:tc>
+        <w:tc>
+          <w:tcPr>
+            <w:tcW w:type="dxa" w:w="2361"/>
+            <w:tcMar>
+              <w:top w:type="dxa" w:w="20"/>
+              <w:left w:type="dxa" w:w="45"/>
+              <w:bottom w:type="dxa" w:w="20"/>
+              <w:right w:type="dxa" w:w="45"/>
+            </w:tcMar>
+            <w:vAlign w:val="center"/>
+          </w:tcPr>
+          <w:p>
+            <w:pPr>
+              <w:spacing w:after="0"/>
+              <w:jc w:val="left"/>
+            </w:pPr>
+            <w:r>
+              <w:rPr>
+                <w:b w:val="false"/>
+                <w:bCs w:val="false"/>
+                <w:sz w:val="15"/>
+                <w:szCs w:val="15"/>
+              </w:rPr>
+              <w:t xml:space="preserve">Supabase OAuth; MongoDB Atlas CLI; gh, Vercel, Netlify, Azure and AWS CLIs</w:t>
+            </w:r>
+          </w:p>
+        </w:tc>
+        <w:tc>
+          <w:tcPr>
+            <w:tcW w:type="dxa" w:w="1600"/>
+            <w:tcMar>
+              <w:top w:type="dxa" w:w="20"/>
+              <w:left w:type="dxa" w:w="45"/>
+              <w:bottom w:type="dxa" w:w="20"/>
+              <w:right w:type="dxa" w:w="45"/>
+            </w:tcMar>
+            <w:vAlign w:val="center"/>
+          </w:tcPr>
+          <w:p>
+            <w:pPr>
+              <w:spacing w:after="0"/>
+              <w:jc w:val="left"/>
+            </w:pPr>
+            <w:r>
+              <w:rPr>
+                <w:b w:val="false"/>
+                <w:bCs w:val="false"/>
+                <w:sz w:val="15"/>
+                <w:szCs w:val="15"/>
+              </w:rPr>
+              <w:t xml:space="preserve">Provisioning, sign-in, deployment</w:t>
+            </w:r>
+          </w:p>
+        </w:tc>
+      </w:tr>
+      <w:tr>
+        <w:trPr>
+          <w:cantSplit/>
+        </w:trPr>
+        <w:tc>
+          <w:tcPr>
+            <w:tcW w:type="dxa" w:w="1060"/>
+            <w:tcMar>
+              <w:top w:type="dxa" w:w="20"/>
+              <w:left w:type="dxa" w:w="45"/>
+              <w:bottom w:type="dxa" w:w="20"/>
+              <w:right w:type="dxa" w:w="45"/>
+            </w:tcMar>
+            <w:vAlign w:val="center"/>
+          </w:tcPr>
+          <w:p>
+            <w:pPr>
+              <w:spacing w:after="0"/>
+              <w:jc w:val="left"/>
+            </w:pPr>
+            <w:r>
+              <w:rPr>
+                <w:b w:val="false"/>
+                <w:bCs w:val="false"/>
+                <w:sz w:val="15"/>
+                <w:szCs w:val="15"/>
+              </w:rPr>
+              <w:t xml:space="preserve">Integrations</w:t>
+            </w:r>
+          </w:p>
+        </w:tc>
+        <w:tc>
+          <w:tcPr>
+            <w:tcW w:type="dxa" w:w="2361"/>
+            <w:tcMar>
+              <w:top w:type="dxa" w:w="20"/>
+              <w:left w:type="dxa" w:w="45"/>
+              <w:bottom w:type="dxa" w:w="20"/>
+              <w:right w:type="dxa" w:w="45"/>
+            </w:tcMar>
+            <w:vAlign w:val="center"/>
+          </w:tcPr>
+          <w:p>
+            <w:pPr>
+              <w:spacing w:after="0"/>
+              <w:jc w:val="left"/>
+            </w:pPr>
+            <w:r>
+              <w:rPr>
+                <w:b w:val="false"/>
+                <w:bCs w:val="false"/>
+                <w:sz w:val="15"/>
+                <w:szCs w:val="15"/>
+              </w:rPr>
+              <w:t xml:space="preserve">20 providers: payments, e-mail and SMS, image storage, social sign-in, maps, analytics</w:t>
+            </w:r>
+          </w:p>
+        </w:tc>
+        <w:tc>
+          <w:tcPr>
+            <w:tcW w:type="dxa" w:w="1600"/>
+            <w:tcMar>
+              <w:top w:type="dxa" w:w="20"/>
+              <w:left w:type="dxa" w:w="45"/>
+              <w:bottom w:type="dxa" w:w="20"/>
+              <w:right w:type="dxa" w:w="45"/>
+            </w:tcMar>
+            <w:vAlign w:val="center"/>
+          </w:tcPr>
+          <w:p>
+            <w:pPr>
+              <w:spacing w:after="0"/>
+              <w:jc w:val="left"/>
+            </w:pPr>
+            <w:r>
+              <w:rPr>
+                <w:b w:val="false"/>
+                <w:bCs w:val="false"/>
+                <w:sz w:val="15"/>
+                <w:szCs w:val="15"/>
+              </w:rPr>
+              <w:t xml:space="preserve">Optional features, keys encrypted</w:t>
+            </w:r>
+          </w:p>
+        </w:tc>
+      </w:tr>
+    </w:tbl>
+    <w:p>
+      <w:pPr>
+        <w:spacing w:after="80"/>
+      </w:pPr>
+    </w:p>
+    <w:p>
+      <w:pPr>
+        <w:keepNext/>
+        <w:spacing w:after="60" w:before="120"/>
+      </w:pPr>
+      <w:r>
+        <w:rPr>
+          <w:i/>
+          <w:iCs/>
+          <w:sz w:val="20"/>
+          <w:szCs w:val="20"/>
+        </w:rPr>
+        <w:t xml:space="preserve">A. Backend Runtime</w:t>
+      </w:r>
+    </w:p>
+    <w:p>
+      <w:pPr>
+        <w:spacing w:after="0" w:line="240"/>
+        <w:ind w:firstLine="245"/>
+        <w:jc w:val="both"/>
+      </w:pPr>
+      <w:r>
+        <w:rPr>
+          <w:sz w:val="20"/>
+          <w:szCs w:val="20"/>
+        </w:rPr>
+        <w:t xml:space="preserve">The API is a ThreadingHTTPServer bound to 127.0.0.1:7824, and the live feed is an RFC 6455 WebSocket server on port 7825 written on the standard library; the Studio proxies </w:t>
+      </w:r>
+      <w:r>
+        <w:rPr>
+          <w:i/>
+          <w:iCs/>
+          <w:sz w:val="20"/>
+          <w:szCs w:val="20"/>
+        </w:rPr>
+        <w:t xml:space="preserve">/__agentforge/api</w:t>
+      </w:r>
+      <w:r>
+        <w:rPr>
+          <w:sz w:val="20"/>
+          <w:szCs w:val="20"/>
+        </w:rPr>
+        <w:t xml:space="preserve"> and </w:t>
+      </w:r>
+      <w:r>
+        <w:rPr>
+          <w:i/>
+          <w:iCs/>
+          <w:sz w:val="20"/>
+          <w:szCs w:val="20"/>
+        </w:rPr>
+        <w:t xml:space="preserve">/__agentforge/ws</w:t>
+      </w:r>
+      <w:r>
+        <w:rPr>
+          <w:sz w:val="20"/>
+          <w:szCs w:val="20"/>
+        </w:rPr>
+        <w:t xml:space="preserve"> to them. In the desktop app nothing listens: the window and the backend exchange one JSON object per line over standard input and output, and the event feed travels the same way. Work that needs a model never runs inside a request. It becomes a background job on its own thread, and the browser polls for the result, so a specification that takes ten minutes holds no connection open. Every event a stage emits goes to an in-memory bus and is appended to </w:t>
+      </w:r>
+      <w:r>
+        <w:rPr>
+          <w:i/>
+          <w:iCs/>
+          <w:sz w:val="20"/>
+          <w:szCs w:val="20"/>
+        </w:rPr>
+        <w:t xml:space="preserve">events.jsonl</w:t>
+      </w:r>
+      <w:r>
+        <w:rPr>
+          <w:sz w:val="20"/>
+          <w:szCs w:val="20"/>
+        </w:rPr>
+        <w:t xml:space="preserve">, so a browser that reconnects replays the same conversation. The project’s conversation is written to </w:t>
+      </w:r>
+      <w:r>
+        <w:rPr>
+          <w:i/>
+          <w:iCs/>
+          <w:sz w:val="20"/>
+          <w:szCs w:val="20"/>
+        </w:rPr>
+        <w:t xml:space="preserve">context.json</w:t>
+      </w:r>
+      <w:r>
+        <w:rPr>
+          <w:sz w:val="20"/>
+          <w:szCs w:val="20"/>
+        </w:rPr>
+        <w:t xml:space="preserve"> after every turn, turns removed by compaction are appended verbatim to </w:t>
+      </w:r>
+      <w:r>
+        <w:rPr>
+          <w:i/>
+          <w:iCs/>
+          <w:sz w:val="20"/>
+          <w:szCs w:val="20"/>
+        </w:rPr>
+        <w:t xml:space="preserve">context-archive.jsonl</w:t>
+      </w:r>
+      <w:r>
+        <w:rPr>
+          <w:sz w:val="20"/>
+          <w:szCs w:val="20"/>
+        </w:rPr>
+        <w:t xml:space="preserve">, and a checkpoint at the start, end or failure of every stage lets an interrupted run resume. A project only moves forward through the stage order.</w:t>
+      </w:r>
+    </w:p>
+    <w:p>
+      <w:pPr>
+        <w:keepNext/>
+        <w:spacing w:after="60" w:before="120"/>
+      </w:pPr>
+      <w:r>
+        <w:rPr>
+          <w:i/>
+          <w:iCs/>
+          <w:sz w:val="20"/>
+          <w:szCs w:val="20"/>
+        </w:rPr>
+        <w:t xml:space="preserve">B. Engine Logic</w:t>
+      </w:r>
+    </w:p>
+    <w:p>
+      <w:pPr>
+        <w:spacing w:after="0" w:line="240"/>
+        <w:ind w:firstLine="245"/>
+        <w:jc w:val="both"/>
+      </w:pPr>
+      <w:r>
+        <w:rPr>
+          <w:sz w:val="20"/>
+          <w:szCs w:val="20"/>
+        </w:rPr>
+        <w:t xml:space="preserve">One request to the engine is a loop of at most 40 model turns. Each turn sends the conversation with the tool schemas (without the write and command tools in plan mode), executes the returned tool calls and appends their results. Calls that write different files are run up to four at a time, which the wireframe and prototype stages use; edits and commands stay in order. A turn ends the loop when it carries no tool call or a completion marker; a plain closing sentence such as “the task is complete” is accepted when a model omits the marker, unless it also says the work is incomplete.</w:t>
+      </w:r>
+    </w:p>
+    <w:p>
+      <w:pPr>
+        <w:spacing w:after="0" w:line="240"/>
+        <w:ind w:firstLine="245"/>
+        <w:jc w:val="both"/>
+      </w:pPr>
+      <w:r>
+        <w:rPr>
+          <w:sz w:val="20"/>
+          <w:szCs w:val="20"/>
+        </w:rPr>
+        <w:t xml:space="preserve">Context is estimated at four characters per token plus 1,500 per picture. Past 88% of the window, older turns are cut into stretches of up to 100,000 characters, summarised four at a time and merged in groups until one memory remains; a stretch the model will not summarise becomes a mechanical digest of the requests, commands and file paths it contains. When the service rejects a request as too long, the token count it reports rescales the estimate and the history is compacted again, up to three times. A screenshot is attached only while the whole request stays under 2.4 MB, and older pictures are replaced by a note. Structured answers go through a validator, whose error is sent back for at most three attempts, and repairs to the specification are JSON edits (</w:t>
+      </w:r>
+      <w:r>
+        <w:rPr>
+          <w:i/>
+          <w:iCs/>
+          <w:sz w:val="20"/>
+          <w:szCs w:val="20"/>
+        </w:rPr>
+        <w:t xml:space="preserve">set</w:t>
+      </w:r>
+      <w:r>
+        <w:rPr>
+          <w:sz w:val="20"/>
+          <w:szCs w:val="20"/>
+        </w:rPr>
+        <w:t xml:space="preserve">, </w:t>
+      </w:r>
+      <w:r>
+        <w:rPr>
+          <w:i/>
+          <w:iCs/>
+          <w:sz w:val="20"/>
+          <w:szCs w:val="20"/>
+        </w:rPr>
+        <w:t xml:space="preserve">add</w:t>
+      </w:r>
+      <w:r>
+        <w:rPr>
+          <w:sz w:val="20"/>
+          <w:szCs w:val="20"/>
+        </w:rPr>
+        <w:t xml:space="preserve">, </w:t>
+      </w:r>
+      <w:r>
+        <w:rPr>
+          <w:i/>
+          <w:iCs/>
+          <w:sz w:val="20"/>
+          <w:szCs w:val="20"/>
+        </w:rPr>
+        <w:t xml:space="preserve">remove</w:t>
+      </w:r>
+      <w:r>
+        <w:rPr>
+          <w:sz w:val="20"/>
+          <w:szCs w:val="20"/>
+        </w:rPr>
+        <w:t xml:space="preserve">) addressed by path and item key, such as </w:t>
+      </w:r>
+      <w:r>
+        <w:rPr>
+          <w:i/>
+          <w:iCs/>
+          <w:sz w:val="20"/>
+          <w:szCs w:val="20"/>
+        </w:rPr>
+        <w:t xml:space="preserve">functional_requirements[id=FR-012]</w:t>
+      </w:r>
+      <w:r>
+        <w:rPr>
+          <w:sz w:val="20"/>
+          <w:szCs w:val="20"/>
+        </w:rPr>
+        <w:t xml:space="preserve">.</w:t>
+      </w:r>
+    </w:p>
+    <w:p>
+      <w:pPr>
+        <w:spacing w:after="0" w:line="240"/>
+        <w:ind w:firstLine="245"/>
+        <w:jc w:val="both"/>
+      </w:pPr>
+      <w:r>
+        <w:rPr>
+          <w:sz w:val="20"/>
+          <w:szCs w:val="20"/>
+        </w:rPr>
+        <w:t xml:space="preserve">Independent work runs in parallel lanes: five specification parts at once, six diagrams, four compaction workers, and three agents for wireframe pages, page phases and test phases, each agent in a conversation of its own that is archived when it ends. The interview’s bookkeeping of facts and coverage runs on a background thread while the user reads the next question. Algorithm 1 shows how the build combines these parts.</w:t>
+      </w:r>
+    </w:p>
+    <w:p>
+      <w:pPr>
+        <w:keepNext/>
+        <w:spacing w:after="0" w:before="60"/>
+      </w:pPr>
+    </w:p>
+    <w:tbl>
+      <w:tblPr>
+        <w:tblW w:type="dxa" w:w="5021"/>
+        <w:tblBorders>
+          <w:top w:val="single" w:color="000000" w:sz="10"/>
+          <w:left w:val="none" w:color="FFFFFF" w:sz="0"/>
+          <w:bottom w:val="single" w:color="000000" w:sz="10"/>
+          <w:right w:val="none" w:color="FFFFFF" w:sz="0"/>
+          <w:insideH w:val="none" w:color="FFFFFF" w:sz="0"/>
+          <w:insideV w:val="none" w:color="FFFFFF" w:sz="0"/>
+        </w:tblBorders>
+      </w:tblPr>
+      <w:tblGrid>
+        <w:gridCol w:w="5021"/>
+      </w:tblGrid>
+      <w:tr>
+        <w:trPr>
+          <w:cantSplit/>
+        </w:trPr>
+        <w:tc>
+          <w:tcPr>
+            <w:tcW w:type="dxa" w:w="5021"/>
+            <w:tcMar>
+              <w:top w:type="dxa" w:w="40"/>
+              <w:left w:type="dxa" w:w="0"/>
+              <w:bottom w:type="dxa" w:w="60"/>
+              <w:right w:type="dxa" w:w="0"/>
+            </w:tcMar>
+          </w:tcPr>
+          <w:p>
+            <w:pPr>
+              <w:keepNext/>
+              <w:pBdr>
+                <w:bottom w:val="single" w:color="000000" w:sz="4" w:space="2"/>
+              </w:pBdr>
+              <w:spacing w:after="40"/>
+            </w:pPr>
+            <w:r>
+              <w:rPr>
+                <w:b/>
+                <w:bCs/>
+                <w:sz w:val="16"/>
+                <w:szCs w:val="16"/>
+              </w:rPr>
+              <w:t xml:space="preserve">Algorithm 1</w:t>
+            </w:r>
+            <w:r>
+              <w:rPr>
+                <w:sz w:val="16"/>
+                <w:szCs w:val="16"/>
+              </w:rPr>
+              <w:t xml:space="preserve">  </w:t>
+            </w:r>
+            <w:r>
+              <w:rPr>
+                <w:sz w:val="16"/>
+                <w:szCs w:val="16"/>
+              </w:rPr>
+              <w:t xml:space="preserve">Phased build with verified phases</w:t>
+            </w:r>
+          </w:p>
+          <w:p>
+            <w:pPr>
+              <w:keepNext/>
+              <w:tabs>
+                <w:tab w:val="left" w:pos="300"/>
+              </w:tabs>
+              <w:spacing w:after="0"/>
+              <w:ind w:left="300" w:hanging="300"/>
+            </w:pPr>
+            <w:r>
+              <w:rPr>
+                <w:sz w:val="16"/>
+                <w:szCs w:val="16"/>
+              </w:rPr>
+              <w:t xml:space="preserve"/>
+            </w:r>
+            <w:r>
+              <w:rPr>
+                <w:sz w:val="16"/>
+                <w:szCs w:val="16"/>
+              </w:rPr>
+              <w:tab/>
+            </w:r>
+            <w:r>
+              <w:rPr>
+                <w:b/>
+                <w:bCs/>
+                <w:sz w:val="16"/>
+                <w:szCs w:val="16"/>
+              </w:rPr>
+              <w:t xml:space="preserve">Input:</w:t>
+            </w:r>
+            <w:r>
+              <w:rPr>
+                <w:sz w:val="16"/>
+                <w:szCs w:val="16"/>
+              </w:rPr>
+              <w:t xml:space="preserve"> approved routes </w:t>
+            </w:r>
+            <w:r>
+              <w:rPr>
+                <w:i/>
+                <w:iCs/>
+                <w:sz w:val="16"/>
+                <w:szCs w:val="16"/>
+              </w:rPr>
+              <w:t xml:space="preserve">R</w:t>
+            </w:r>
+            <w:r>
+              <w:rPr>
+                <w:sz w:val="16"/>
+                <w:szCs w:val="16"/>
+              </w:rPr>
+              <w:t xml:space="preserve">, stack </w:t>
+            </w:r>
+            <w:r>
+              <w:rPr>
+                <w:i/>
+                <w:iCs/>
+                <w:sz w:val="16"/>
+                <w:szCs w:val="16"/>
+              </w:rPr>
+              <w:t xml:space="preserve">s</w:t>
+            </w:r>
+            <w:r>
+              <w:rPr>
+                <w:sz w:val="16"/>
+                <w:szCs w:val="16"/>
+              </w:rPr>
+              <w:t xml:space="preserve">, the user’s direction </w:t>
+            </w:r>
+            <w:r>
+              <w:rPr>
+                <w:i/>
+                <w:iCs/>
+                <w:sz w:val="16"/>
+                <w:szCs w:val="16"/>
+              </w:rPr>
+              <w:t xml:space="preserve">d</w:t>
+            </w:r>
+            <w:r>
+              <w:rPr>
+                <w:sz w:val="16"/>
+                <w:szCs w:val="16"/>
+              </w:rPr>
+              <w:t xml:space="preserve">, build request </w:t>
+            </w:r>
+            <w:r>
+              <w:rPr>
+                <w:i/>
+                <w:iCs/>
+                <w:sz w:val="16"/>
+                <w:szCs w:val="16"/>
+              </w:rPr>
+              <w:t xml:space="preserve">q</w:t>
+            </w:r>
+          </w:p>
+          <w:p>
+            <w:pPr>
+              <w:keepNext/>
+              <w:tabs>
+                <w:tab w:val="left" w:pos="300"/>
+              </w:tabs>
+              <w:spacing w:after="0"/>
+              <w:ind w:left="300" w:hanging="300"/>
+            </w:pPr>
+            <w:r>
+              <w:rPr>
+                <w:sz w:val="16"/>
+                <w:szCs w:val="16"/>
+              </w:rPr>
+              <w:t xml:space="preserve">1:</w:t>
+            </w:r>
+            <w:r>
+              <w:rPr>
+                <w:sz w:val="16"/>
+                <w:szCs w:val="16"/>
+              </w:rPr>
+              <w:tab/>
+            </w:r>
+            <w:r>
+              <w:rPr>
+                <w:i/>
+                <w:iCs/>
+                <w:sz w:val="16"/>
+                <w:szCs w:val="16"/>
+              </w:rPr>
+              <w:t xml:space="preserve">P</w:t>
+            </w:r>
+            <w:r>
+              <w:rPr>
+                <w:sz w:val="16"/>
+                <w:szCs w:val="16"/>
+              </w:rPr>
+              <w:t xml:space="preserve"> ← [foundation] + chunks(</w:t>
+            </w:r>
+            <w:r>
+              <w:rPr>
+                <w:i/>
+                <w:iCs/>
+                <w:sz w:val="16"/>
+                <w:szCs w:val="16"/>
+              </w:rPr>
+              <w:t xml:space="preserve">R</w:t>
+            </w:r>
+            <w:r>
+              <w:rPr>
+                <w:sz w:val="16"/>
+                <w:szCs w:val="16"/>
+              </w:rPr>
+              <w:t xml:space="preserve">, 4) + [wiring, unit tests, journey tests]</w:t>
+            </w:r>
+          </w:p>
+          <w:p>
+            <w:pPr>
+              <w:keepNext/>
+              <w:tabs>
+                <w:tab w:val="left" w:pos="300"/>
+              </w:tabs>
+              <w:spacing w:after="0"/>
+              <w:ind w:left="300" w:hanging="300"/>
+            </w:pPr>
+            <w:r>
+              <w:rPr>
+                <w:sz w:val="16"/>
+                <w:szCs w:val="16"/>
+              </w:rPr>
+              <w:t xml:space="preserve">2:</w:t>
+            </w:r>
+            <w:r>
+              <w:rPr>
+                <w:sz w:val="16"/>
+                <w:szCs w:val="16"/>
+              </w:rPr>
+              <w:tab/>
+            </w:r>
+            <w:r>
+              <w:rPr>
+                <w:i/>
+                <w:iCs/>
+                <w:sz w:val="16"/>
+                <w:szCs w:val="16"/>
+              </w:rPr>
+              <w:t xml:space="preserve">f</w:t>
+            </w:r>
+            <w:r>
+              <w:rPr>
+                <w:sz w:val="16"/>
+                <w:szCs w:val="16"/>
+              </w:rPr>
+              <w:t xml:space="preserve"> ← SHA-256(</w:t>
+            </w:r>
+            <w:r>
+              <w:rPr>
+                <w:i/>
+                <w:iCs/>
+                <w:sz w:val="16"/>
+                <w:szCs w:val="16"/>
+              </w:rPr>
+              <w:t xml:space="preserve">R</w:t>
+            </w:r>
+            <w:r>
+              <w:rPr>
+                <w:sz w:val="16"/>
+                <w:szCs w:val="16"/>
+              </w:rPr>
+              <w:t xml:space="preserve">, </w:t>
+            </w:r>
+            <w:r>
+              <w:rPr>
+                <w:i/>
+                <w:iCs/>
+                <w:sz w:val="16"/>
+                <w:szCs w:val="16"/>
+              </w:rPr>
+              <w:t xml:space="preserve">s</w:t>
+            </w:r>
+            <w:r>
+              <w:rPr>
+                <w:sz w:val="16"/>
+                <w:szCs w:val="16"/>
+              </w:rPr>
+              <w:t xml:space="preserve">, </w:t>
+            </w:r>
+            <w:r>
+              <w:rPr>
+                <w:i/>
+                <w:iCs/>
+                <w:sz w:val="16"/>
+                <w:szCs w:val="16"/>
+              </w:rPr>
+              <w:t xml:space="preserve">d</w:t>
+            </w:r>
+            <w:r>
+              <w:rPr>
+                <w:sz w:val="16"/>
+                <w:szCs w:val="16"/>
+              </w:rPr>
+              <w:t xml:space="preserve">); if a saved state has fingerprint </w:t>
+            </w:r>
+            <w:r>
+              <w:rPr>
+                <w:i/>
+                <w:iCs/>
+                <w:sz w:val="16"/>
+                <w:szCs w:val="16"/>
+              </w:rPr>
+              <w:t xml:space="preserve">f</w:t>
+            </w:r>
+            <w:r>
+              <w:rPr>
+                <w:sz w:val="16"/>
+                <w:szCs w:val="16"/>
+              </w:rPr>
+              <w:t xml:space="preserve">, keep its done phases</w:t>
+            </w:r>
+          </w:p>
+          <w:p>
+            <w:pPr>
+              <w:keepNext/>
+              <w:tabs>
+                <w:tab w:val="left" w:pos="300"/>
+              </w:tabs>
+              <w:spacing w:after="0"/>
+              <w:ind w:left="300" w:hanging="300"/>
+            </w:pPr>
+            <w:r>
+              <w:rPr>
+                <w:sz w:val="16"/>
+                <w:szCs w:val="16"/>
+              </w:rPr>
+              <w:t xml:space="preserve">3:</w:t>
+            </w:r>
+            <w:r>
+              <w:rPr>
+                <w:sz w:val="16"/>
+                <w:szCs w:val="16"/>
+              </w:rPr>
+              <w:tab/>
+            </w:r>
+            <w:r>
+              <w:rPr>
+                <w:b/>
+                <w:bCs/>
+                <w:sz w:val="16"/>
+                <w:szCs w:val="16"/>
+              </w:rPr>
+              <w:t xml:space="preserve">for each</w:t>
+            </w:r>
+            <w:r>
+              <w:rPr>
+                <w:sz w:val="16"/>
+                <w:szCs w:val="16"/>
+              </w:rPr>
+              <w:t xml:space="preserve"> phase </w:t>
+            </w:r>
+            <w:r>
+              <w:rPr>
+                <w:i/>
+                <w:iCs/>
+                <w:sz w:val="16"/>
+                <w:szCs w:val="16"/>
+              </w:rPr>
+              <w:t xml:space="preserve">p</w:t>
+            </w:r>
+            <w:r>
+              <w:rPr>
+                <w:sz w:val="16"/>
+                <w:szCs w:val="16"/>
+              </w:rPr>
+              <w:t xml:space="preserve"> ∈ </w:t>
+            </w:r>
+            <w:r>
+              <w:rPr>
+                <w:i/>
+                <w:iCs/>
+                <w:sz w:val="16"/>
+                <w:szCs w:val="16"/>
+              </w:rPr>
+              <w:t xml:space="preserve">P</w:t>
+            </w:r>
+            <w:r>
+              <w:rPr>
+                <w:sz w:val="16"/>
+                <w:szCs w:val="16"/>
+              </w:rPr>
+              <w:t xml:space="preserve"> not done </w:t>
+            </w:r>
+            <w:r>
+              <w:rPr>
+                <w:b/>
+                <w:bCs/>
+                <w:sz w:val="16"/>
+                <w:szCs w:val="16"/>
+              </w:rPr>
+              <w:t xml:space="preserve">do</w:t>
+            </w:r>
+          </w:p>
+          <w:p>
+            <w:pPr>
+              <w:keepNext/>
+              <w:tabs>
+                <w:tab w:val="left" w:pos="300"/>
+              </w:tabs>
+              <w:spacing w:after="0"/>
+              <w:ind w:left="300" w:hanging="300"/>
+            </w:pPr>
+            <w:r>
+              <w:rPr>
+                <w:sz w:val="16"/>
+                <w:szCs w:val="16"/>
+              </w:rPr>
+              <w:t xml:space="preserve">4:</w:t>
+            </w:r>
+            <w:r>
+              <w:rPr>
+                <w:sz w:val="16"/>
+                <w:szCs w:val="16"/>
+              </w:rPr>
+              <w:tab/>
+            </w:r>
+            <w:r>
+              <w:rPr>
+                <w:sz w:val="16"/>
+                <w:szCs w:val="16"/>
+              </w:rPr>
+              <w:t xml:space="preserve"> </w:t>
+            </w:r>
+            <w:r>
+              <w:rPr>
+                <w:b/>
+                <w:bCs/>
+                <w:sz w:val="16"/>
+                <w:szCs w:val="16"/>
+              </w:rPr>
+              <w:t xml:space="preserve">if</w:t>
+            </w:r>
+            <w:r>
+              <w:rPr>
+                <w:sz w:val="16"/>
+                <w:szCs w:val="16"/>
+              </w:rPr>
+              <w:t xml:space="preserve"> </w:t>
+            </w:r>
+            <w:r>
+              <w:rPr>
+                <w:i/>
+                <w:iCs/>
+                <w:sz w:val="16"/>
+                <w:szCs w:val="16"/>
+              </w:rPr>
+              <w:t xml:space="preserve">p</w:t>
+            </w:r>
+            <w:r>
+              <w:rPr>
+                <w:sz w:val="16"/>
+                <w:szCs w:val="16"/>
+              </w:rPr>
+              <w:t xml:space="preserve"> starts a run of independent phases </w:t>
+            </w:r>
+            <w:r>
+              <w:rPr>
+                <w:b/>
+                <w:bCs/>
+                <w:sz w:val="16"/>
+                <w:szCs w:val="16"/>
+              </w:rPr>
+              <w:t xml:space="preserve">then</w:t>
+            </w:r>
+            <w:r>
+              <w:rPr>
+                <w:sz w:val="16"/>
+                <w:szCs w:val="16"/>
+              </w:rPr>
+              <w:t xml:space="preserve"> build the run in 3 parallel lanes</w:t>
+            </w:r>
+          </w:p>
+          <w:p>
+            <w:pPr>
+              <w:keepNext/>
+              <w:tabs>
+                <w:tab w:val="left" w:pos="300"/>
+              </w:tabs>
+              <w:spacing w:after="0"/>
+              <w:ind w:left="300" w:hanging="300"/>
+            </w:pPr>
+            <w:r>
+              <w:rPr>
+                <w:sz w:val="16"/>
+                <w:szCs w:val="16"/>
+              </w:rPr>
+              <w:t xml:space="preserve">5:</w:t>
+            </w:r>
+            <w:r>
+              <w:rPr>
+                <w:sz w:val="16"/>
+                <w:szCs w:val="16"/>
+              </w:rPr>
+              <w:tab/>
+            </w:r>
+            <w:r>
+              <w:rPr>
+                <w:sz w:val="16"/>
+                <w:szCs w:val="16"/>
+              </w:rPr>
+              <w:t xml:space="preserve"> </w:t>
+            </w:r>
+            <w:r>
+              <w:rPr>
+                <w:b/>
+                <w:bCs/>
+                <w:sz w:val="16"/>
+                <w:szCs w:val="16"/>
+              </w:rPr>
+              <w:t xml:space="preserve">else</w:t>
+            </w:r>
+            <w:r>
+              <w:rPr>
+                <w:sz w:val="16"/>
+                <w:szCs w:val="16"/>
+              </w:rPr>
+              <w:t xml:space="preserve"> build </w:t>
+            </w:r>
+            <w:r>
+              <w:rPr>
+                <w:i/>
+                <w:iCs/>
+                <w:sz w:val="16"/>
+                <w:szCs w:val="16"/>
+              </w:rPr>
+              <w:t xml:space="preserve">p</w:t>
+            </w:r>
+            <w:r>
+              <w:rPr>
+                <w:sz w:val="16"/>
+                <w:szCs w:val="16"/>
+              </w:rPr>
+              <w:t xml:space="preserve"> in a fresh conversation that begins with </w:t>
+            </w:r>
+            <w:r>
+              <w:rPr>
+                <w:i/>
+                <w:iCs/>
+                <w:sz w:val="16"/>
+                <w:szCs w:val="16"/>
+              </w:rPr>
+              <w:t xml:space="preserve">q</w:t>
+            </w:r>
+          </w:p>
+          <w:p>
+            <w:pPr>
+              <w:keepNext/>
+              <w:tabs>
+                <w:tab w:val="left" w:pos="300"/>
+              </w:tabs>
+              <w:spacing w:after="0"/>
+              <w:ind w:left="300" w:hanging="300"/>
+            </w:pPr>
+            <w:r>
+              <w:rPr>
+                <w:sz w:val="16"/>
+                <w:szCs w:val="16"/>
+              </w:rPr>
+              <w:t xml:space="preserve">6:</w:t>
+            </w:r>
+            <w:r>
+              <w:rPr>
+                <w:sz w:val="16"/>
+                <w:szCs w:val="16"/>
+              </w:rPr>
+              <w:tab/>
+            </w:r>
+            <w:r>
+              <w:rPr>
+                <w:sz w:val="16"/>
+                <w:szCs w:val="16"/>
+              </w:rPr>
+              <w:t xml:space="preserve"> </w:t>
+            </w:r>
+            <w:r>
+              <w:rPr>
+                <w:b/>
+                <w:bCs/>
+                <w:sz w:val="16"/>
+                <w:szCs w:val="16"/>
+              </w:rPr>
+              <w:t xml:space="preserve">repeat</w:t>
+            </w:r>
+            <w:r>
+              <w:rPr>
+                <w:sz w:val="16"/>
+                <w:szCs w:val="16"/>
+              </w:rPr>
+              <w:t xml:space="preserve"> at most twice </w:t>
+            </w:r>
+            <w:r>
+              <w:rPr>
+                <w:b/>
+                <w:bCs/>
+                <w:sz w:val="16"/>
+                <w:szCs w:val="16"/>
+              </w:rPr>
+              <w:t xml:space="preserve">while</w:t>
+            </w:r>
+            <w:r>
+              <w:rPr>
+                <w:sz w:val="16"/>
+                <w:szCs w:val="16"/>
+              </w:rPr>
+              <w:t xml:space="preserve"> problems(</w:t>
+            </w:r>
+            <w:r>
+              <w:rPr>
+                <w:i/>
+                <w:iCs/>
+                <w:sz w:val="16"/>
+                <w:szCs w:val="16"/>
+              </w:rPr>
+              <w:t xml:space="preserve">p</w:t>
+            </w:r>
+            <w:r>
+              <w:rPr>
+                <w:sz w:val="16"/>
+                <w:szCs w:val="16"/>
+              </w:rPr>
+              <w:t xml:space="preserve">) ≠ ∅: repair(</w:t>
+            </w:r>
+            <w:r>
+              <w:rPr>
+                <w:i/>
+                <w:iCs/>
+                <w:sz w:val="16"/>
+                <w:szCs w:val="16"/>
+              </w:rPr>
+              <w:t xml:space="preserve">p</w:t>
+            </w:r>
+            <w:r>
+              <w:rPr>
+                <w:sz w:val="16"/>
+                <w:szCs w:val="16"/>
+              </w:rPr>
+              <w:t xml:space="preserve">, problems(</w:t>
+            </w:r>
+            <w:r>
+              <w:rPr>
+                <w:i/>
+                <w:iCs/>
+                <w:sz w:val="16"/>
+                <w:szCs w:val="16"/>
+              </w:rPr>
+              <w:t xml:space="preserve">p</w:t>
+            </w:r>
+            <w:r>
+              <w:rPr>
+                <w:sz w:val="16"/>
+                <w:szCs w:val="16"/>
+              </w:rPr>
+              <w:t xml:space="preserve">))</w:t>
+            </w:r>
+          </w:p>
+          <w:p>
+            <w:pPr>
+              <w:keepNext/>
+              <w:tabs>
+                <w:tab w:val="left" w:pos="300"/>
+              </w:tabs>
+              <w:spacing w:after="0"/>
+              <w:ind w:left="300" w:hanging="300"/>
+            </w:pPr>
+            <w:r>
+              <w:rPr>
+                <w:sz w:val="16"/>
+                <w:szCs w:val="16"/>
+              </w:rPr>
+              <w:t xml:space="preserve">7:</w:t>
+            </w:r>
+            <w:r>
+              <w:rPr>
+                <w:sz w:val="16"/>
+                <w:szCs w:val="16"/>
+              </w:rPr>
+              <w:tab/>
+            </w:r>
+            <w:r>
+              <w:rPr>
+                <w:sz w:val="16"/>
+                <w:szCs w:val="16"/>
+              </w:rPr>
+              <w:t xml:space="preserve"> mark </w:t>
+            </w:r>
+            <w:r>
+              <w:rPr>
+                <w:i/>
+                <w:iCs/>
+                <w:sz w:val="16"/>
+                <w:szCs w:val="16"/>
+              </w:rPr>
+              <w:t xml:space="preserve">p</w:t>
+            </w:r>
+            <w:r>
+              <w:rPr>
+                <w:sz w:val="16"/>
+                <w:szCs w:val="16"/>
+              </w:rPr>
+              <w:t xml:space="preserve"> done if problems(</w:t>
+            </w:r>
+            <w:r>
+              <w:rPr>
+                <w:i/>
+                <w:iCs/>
+                <w:sz w:val="16"/>
+                <w:szCs w:val="16"/>
+              </w:rPr>
+              <w:t xml:space="preserve">p</w:t>
+            </w:r>
+            <w:r>
+              <w:rPr>
+                <w:sz w:val="16"/>
+                <w:szCs w:val="16"/>
+              </w:rPr>
+              <w:t xml:space="preserve">) = ∅, else incomplete; save state</w:t>
+            </w:r>
+          </w:p>
+          <w:p>
+            <w:pPr>
+              <w:keepNext/>
+              <w:tabs>
+                <w:tab w:val="left" w:pos="300"/>
+              </w:tabs>
+              <w:spacing w:after="0"/>
+              <w:ind w:left="300" w:hanging="300"/>
+            </w:pPr>
+            <w:r>
+              <w:rPr>
+                <w:sz w:val="16"/>
+                <w:szCs w:val="16"/>
+              </w:rPr>
+              <w:t xml:space="preserve">8:</w:t>
+            </w:r>
+            <w:r>
+              <w:rPr>
+                <w:sz w:val="16"/>
+                <w:szCs w:val="16"/>
+              </w:rPr>
+              <w:tab/>
+            </w:r>
+            <w:r>
+              <w:rPr>
+                <w:b/>
+                <w:bCs/>
+                <w:sz w:val="16"/>
+                <w:szCs w:val="16"/>
+              </w:rPr>
+              <w:t xml:space="preserve">if</w:t>
+            </w:r>
+            <w:r>
+              <w:rPr>
+                <w:sz w:val="16"/>
+                <w:szCs w:val="16"/>
+              </w:rPr>
+              <w:t xml:space="preserve"> some </w:t>
+            </w:r>
+            <w:r>
+              <w:rPr>
+                <w:i/>
+                <w:iCs/>
+                <w:sz w:val="16"/>
+                <w:szCs w:val="16"/>
+              </w:rPr>
+              <w:t xml:space="preserve">r</w:t>
+            </w:r>
+            <w:r>
+              <w:rPr>
+                <w:sz w:val="16"/>
+                <w:szCs w:val="16"/>
+              </w:rPr>
+              <w:t xml:space="preserve"> ∈ </w:t>
+            </w:r>
+            <w:r>
+              <w:rPr>
+                <w:i/>
+                <w:iCs/>
+                <w:sz w:val="16"/>
+                <w:szCs w:val="16"/>
+              </w:rPr>
+              <w:t xml:space="preserve">R</w:t>
+            </w:r>
+            <w:r>
+              <w:rPr>
+                <w:sz w:val="16"/>
+                <w:szCs w:val="16"/>
+              </w:rPr>
+              <w:t xml:space="preserve"> has no recorded, non-empty file </w:t>
+            </w:r>
+            <w:r>
+              <w:rPr>
+                <w:b/>
+                <w:bCs/>
+                <w:sz w:val="16"/>
+                <w:szCs w:val="16"/>
+              </w:rPr>
+              <w:t xml:space="preserve">then fail</w:t>
+            </w:r>
+            <w:r>
+              <w:rPr>
+                <w:sz w:val="16"/>
+                <w:szCs w:val="16"/>
+              </w:rPr>
+              <w:t xml:space="preserve"> naming </w:t>
+            </w:r>
+            <w:r>
+              <w:rPr>
+                <w:i/>
+                <w:iCs/>
+                <w:sz w:val="16"/>
+                <w:szCs w:val="16"/>
+              </w:rPr>
+              <w:t xml:space="preserve">r</w:t>
+            </w:r>
+          </w:p>
+          <w:p>
+            <w:pPr>
+              <w:keepNext/>
+              <w:tabs>
+                <w:tab w:val="left" w:pos="300"/>
+              </w:tabs>
+              <w:spacing w:after="0"/>
+              <w:ind w:left="300" w:hanging="300"/>
+            </w:pPr>
+            <w:r>
+              <w:rPr>
+                <w:sz w:val="16"/>
+                <w:szCs w:val="16"/>
+              </w:rPr>
+              <w:t xml:space="preserve">9:</w:t>
+            </w:r>
+            <w:r>
+              <w:rPr>
+                <w:sz w:val="16"/>
+                <w:szCs w:val="16"/>
+              </w:rPr>
+              <w:tab/>
+            </w:r>
+            <w:r>
+              <w:rPr>
+                <w:sz w:val="16"/>
+                <w:szCs w:val="16"/>
+              </w:rPr>
+              <w:t xml:space="preserve">review pages; run journeys one by one; run final checks; set requirement status by Eq. (1)</w:t>
+            </w:r>
+          </w:p>
+        </w:tc>
+      </w:tr>
+    </w:tbl>
+    <w:p>
+      <w:pPr>
+        <w:spacing w:after="100"/>
+      </w:pPr>
+    </w:p>
+    <w:p>
+      <w:pPr>
+        <w:keepNext/>
+        <w:spacing w:after="60" w:before="120"/>
+      </w:pPr>
+      <w:r>
+        <w:rPr>
+          <w:i/>
+          <w:iCs/>
+          <w:sz w:val="20"/>
+          <w:szCs w:val="20"/>
+        </w:rPr>
+        <w:t xml:space="preserve">C. Verification Logic</w:t>
+      </w:r>
+    </w:p>
+    <w:p>
+      <w:pPr>
+        <w:spacing w:after="0" w:line="240"/>
+        <w:ind w:firstLine="245"/>
+        <w:jc w:val="both"/>
+      </w:pPr>
+      <w:r>
+        <w:rPr>
+          <w:sz w:val="20"/>
+          <w:szCs w:val="20"/>
+        </w:rPr>
+        <w:t xml:space="preserve">A page phase is checked against its own progress record, </w:t>
+      </w:r>
+      <w:r>
+        <w:rPr>
+          <w:i/>
+          <w:iCs/>
+          <w:sz w:val="20"/>
+          <w:szCs w:val="20"/>
+        </w:rPr>
+        <w:t xml:space="preserve">build/progress/&lt;phase&gt;.json</w:t>
+      </w:r>
+      <w:r>
+        <w:rPr>
+          <w:sz w:val="20"/>
+          <w:szCs w:val="20"/>
+        </w:rPr>
+        <w:t xml:space="preserve">, which must name files that exist inside the workspace and are not empty. The Studio’s journey run is keyed by a SHA-256 fingerprint over the path and content of every source file, skipping dependencies, build output, test output and the record: while the fingerprint is unchanged, a later Testing run reuses the result instead of running again. The runner script builds the app once, starts the production server on a free port, runs Playwright with one retry and two workers, and stops only the server it started; on MongoDB stacks it creates a database named within Atlas’s 38-character limit and ending in </w:t>
+      </w:r>
+      <w:r>
+        <w:rPr>
+          <w:i/>
+          <w:iCs/>
+          <w:sz w:val="20"/>
+          <w:szCs w:val="20"/>
+        </w:rPr>
+        <w:t xml:space="preserve">_e2e</w:t>
+      </w:r>
+      <w:r>
+        <w:rPr>
+          <w:sz w:val="20"/>
+          <w:szCs w:val="20"/>
+        </w:rPr>
+        <w:t xml:space="preserve">, and drops it afterwards. The suite has 45 minutes, the page photographs 20 and the runtime check 10, and screenshots are copied out as the tests take them, because the next run empties Playwright’s output folder.</w:t>
+      </w:r>
+    </w:p>
+    <w:p>
+      <w:pPr>
+        <w:spacing w:after="0" w:line="240"/>
+        <w:ind w:firstLine="245"/>
+        <w:jc w:val="both"/>
+      </w:pPr>
+      <w:r>
+        <w:rPr>
+          <w:sz w:val="20"/>
+          <w:szCs w:val="20"/>
+        </w:rPr>
+        <w:t xml:space="preserve">The specification checks are plain functions. Routes are compared by a key that ignores letter case and parameter names, so </w:t>
+      </w:r>
+      <w:r>
+        <w:rPr>
+          <w:i/>
+          <w:iCs/>
+          <w:sz w:val="20"/>
+          <w:szCs w:val="20"/>
+        </w:rPr>
+        <w:t xml:space="preserve">/Admin/[branchId]</w:t>
+      </w:r>
+      <w:r>
+        <w:rPr>
+          <w:sz w:val="20"/>
+          <w:szCs w:val="20"/>
+        </w:rPr>
+        <w:t xml:space="preserve"> and </w:t>
+      </w:r>
+      <w:r>
+        <w:rPr>
+          <w:i/>
+          <w:iCs/>
+          <w:sz w:val="20"/>
+          <w:szCs w:val="20"/>
+        </w:rPr>
+        <w:t xml:space="preserve">/admin/:id</w:t>
+      </w:r>
+      <w:r>
+        <w:rPr>
+          <w:sz w:val="20"/>
+          <w:szCs w:val="20"/>
+        </w:rPr>
+        <w:t xml:space="preserve"> are one page; record names are matched to tables through singular and plural forms. The evidence audit scores 100 times the share of its seven rules that pass, capped at 50 when either requirement set is missing, and any score below 100 adds blocking findings. The deployment planner must have opened the target’s skill pages with </w:t>
+      </w:r>
+      <w:r>
+        <w:rPr>
+          <w:i/>
+          <w:iCs/>
+          <w:sz w:val="20"/>
+          <w:szCs w:val="20"/>
+        </w:rPr>
+        <w:t xml:space="preserve">read_file</w:t>
+      </w:r>
+      <w:r>
+        <w:rPr>
+          <w:sz w:val="20"/>
+          <w:szCs w:val="20"/>
+        </w:rPr>
+        <w:t xml:space="preserve"> before its plan is accepted, and the live probe accepts a status range written as 200, 2xx or 200–399.</w:t>
+      </w:r>
+    </w:p>
+    <w:p>
+      <w:pPr>
+        <w:keepNext/>
+        <w:spacing w:after="60" w:before="120"/>
+      </w:pPr>
+      <w:r>
+        <w:rPr>
+          <w:i/>
+          <w:iCs/>
+          <w:sz w:val="20"/>
+          <w:szCs w:val="20"/>
+        </w:rPr>
+        <w:t xml:space="preserve">D. Safety, Privacy and Model Access</w:t>
+      </w:r>
+    </w:p>
+    <w:p>
+      <w:pPr>
+        <w:spacing w:after="0" w:line="240"/>
+        <w:ind w:firstLine="245"/>
+        <w:jc w:val="both"/>
+      </w:pPr>
+      <w:r>
+        <w:rPr>
+          <w:sz w:val="20"/>
+          <w:szCs w:val="20"/>
+        </w:rPr>
+        <w:t xml:space="preserve">A command is split on </w:t>
+      </w:r>
+      <w:r>
+        <w:rPr>
+          <w:i/>
+          <w:iCs/>
+          <w:sz w:val="20"/>
+          <w:szCs w:val="20"/>
+        </w:rPr>
+        <w:t xml:space="preserve">&amp;&amp;</w:t>
+      </w:r>
+      <w:r>
+        <w:rPr>
+          <w:sz w:val="20"/>
+          <w:szCs w:val="20"/>
+        </w:rPr>
+        <w:t xml:space="preserve">, </w:t>
+      </w:r>
+      <w:r>
+        <w:rPr>
+          <w:i/>
+          <w:iCs/>
+          <w:sz w:val="20"/>
+          <w:szCs w:val="20"/>
+        </w:rPr>
+        <w:t xml:space="preserve">||</w:t>
+      </w:r>
+      <w:r>
+        <w:rPr>
+          <w:sz w:val="20"/>
+          <w:szCs w:val="20"/>
+        </w:rPr>
+        <w:t xml:space="preserve">, </w:t>
+      </w:r>
+      <w:r>
+        <w:rPr>
+          <w:i/>
+          <w:iCs/>
+          <w:sz w:val="20"/>
+          <w:szCs w:val="20"/>
+        </w:rPr>
+        <w:t xml:space="preserve">;</w:t>
+      </w:r>
+      <w:r>
+        <w:rPr>
+          <w:sz w:val="20"/>
+          <w:szCs w:val="20"/>
+        </w:rPr>
+        <w:t xml:space="preserve"> and </w:t>
+      </w:r>
+      <w:r>
+        <w:rPr>
+          <w:i/>
+          <w:iCs/>
+          <w:sz w:val="20"/>
+          <w:szCs w:val="20"/>
+        </w:rPr>
+        <w:t xml:space="preserve">|</w:t>
+      </w:r>
+      <w:r>
+        <w:rPr>
+          <w:sz w:val="20"/>
+          <w:szCs w:val="20"/>
+        </w:rPr>
+        <w:t xml:space="preserve"> outside quoted strings, and the program of each part is checked against the allowlist; PowerShell cmdlets pass by their Verb-Noun shape except six that run code or another process. A command may run 600 s, a deployment release 1,800 s, and a server start 75 s; on Windows every process starts without a window. Text search skips dependencies, build and test output and binary files and stops after 20 s. Before each command the files of AgentForge itself are snapshotted, and afterwards any change is undone unless the repository’s HEAD moved, which marks a deliberate pull or checkout.</w:t>
+      </w:r>
+    </w:p>
+    <w:p>
+      <w:pPr>
+        <w:spacing w:after="0" w:line="240"/>
+        <w:ind w:firstLine="245"/>
+        <w:jc w:val="both"/>
+      </w:pPr>
+      <w:r>
+        <w:rPr>
+          <w:sz w:val="20"/>
+          <w:szCs w:val="20"/>
+        </w:rPr>
+        <w:t xml:space="preserve">Presidio analyses typed text in 50,000-character chunks and keeps matches scoring at least 0.4, with added recognisers for Sri Lankan identity numbers and phone numbers in ten regions. Values go to a Fernet-encrypted vault under placeholders such as &lt;PERSON_1&gt;. The model client replaces known values in every message, tool result and earlier tool call before sending, and restores them in the reply; in a streamed reply it holds back a chunk that ends with what may be the start of a placeholder until the next chunk completes it. Provider keys for the 20 optional integrations are encrypted the same way.</w:t>
+      </w:r>
+    </w:p>
+    <w:p>
+      <w:pPr>
+        <w:spacing w:after="0" w:line="240"/>
+        <w:ind w:firstLine="245"/>
+        <w:jc w:val="both"/>
+      </w:pPr>
+      <w:r>
+        <w:rPr>
+          <w:sz w:val="20"/>
+          <w:szCs w:val="20"/>
+        </w:rPr>
+        <w:t xml:space="preserve">The client retries HTTP 408, 425, 429, 500, 502, 503, 504, 522 and 524 and broken transports up to ten times, waiting 2, 4, 8, 15, 20 and then 30 s, and Stop is checked every 0.1 s, so a run never waits for a reply it no longer wants. Replies from hosted models are streamed, since a single response is cut off by the service’s edge after about 100 s without a byte. Whether a model can see pictures is read from its own capability list and cached for a week. The Cloudflare Worker compares the app token in constant time, rate-limits each caller, passes through eight routes, and doubles as the OAuth broker for Supabase sign-in, so its client secret never ships with the app. Each model call is counted as one request against the limit an administrator sets for the account.</w:t>
+      </w:r>
+    </w:p>
+    <w:p>
+      <w:pPr>
+        <w:keepNext/>
+        <w:spacing w:after="60" w:before="120"/>
+      </w:pPr>
+      <w:r>
+        <w:rPr>
+          <w:i/>
+          <w:iCs/>
+          <w:sz w:val="20"/>
+          <w:szCs w:val="20"/>
+        </w:rPr>
+        <w:t xml:space="preserve">E. Distribution and Tests</w:t>
+      </w:r>
+    </w:p>
+    <w:p>
+      <w:pPr>
+        <w:spacing w:after="0" w:line="240"/>
+        <w:ind w:firstLine="245"/>
+        <w:jc w:val="both"/>
+      </w:pPr>
+      <w:r>
+        <w:rPr>
+          <w:sz w:val="20"/>
+          <w:szCs w:val="20"/>
+        </w:rPr>
+        <w:t xml:space="preserve">The release script exports the Studio as static files, stages the backend with its Node modules and an embedded Python 3.12, packages Electron, pins the command-line tools, and compiles a 150 KB online installer with the C# compiler built into Windows; the installer checks every file against a SHA-256 manifest. The desktop app serves the Studio from an </w:t>
+      </w:r>
+      <w:r>
+        <w:rPr>
+          <w:i/>
+          <w:iCs/>
+          <w:sz w:val="20"/>
+          <w:szCs w:val="20"/>
+        </w:rPr>
+        <w:t xml:space="preserve">agentforge://</w:t>
+      </w:r>
+      <w:r>
+        <w:rPr>
+          <w:sz w:val="20"/>
+          <w:szCs w:val="20"/>
+        </w:rPr>
+        <w:t xml:space="preserve"> scheme, and every process it starts is its child, so quitting ends them all. Models are chosen by the user: the bakery project in Section V-B used gpt-oss:120b through Ollama’s cloud, and accounts default to DeepSeek V4.1 Flash. The repository holds 1,733 Python unit tests and twelve Node test files, which cover the engine, every gate, the privacy filter and the deployment flow with stand-in models instead of live calls.</w:t>
       </w:r>
     </w:p>
     <w:p>
@@ -4136,7 +6785,7 @@
           <w:sz w:val="20"/>
           <w:szCs w:val="20"/>
         </w:rPr>
-        <w:t xml:space="preserve">III</w:t>
+        <w:t xml:space="preserve">IV</w:t>
       </w:r>
       <w:r>
         <w:rPr>
@@ -4158,7 +6807,7 @@
           <w:sz w:val="16"/>
           <w:szCs w:val="16"/>
         </w:rPr>
-        <w:t xml:space="preserve">TABLE III.  </w:t>
+        <w:t xml:space="preserve">TABLE IV.  </w:t>
       </w:r>
       <w:r>
         <w:rPr>
@@ -4827,7 +7476,7 @@
           <w:sz w:val="20"/>
           <w:szCs w:val="20"/>
         </w:rPr>
-        <w:t xml:space="preserve">IV</w:t>
+        <w:t xml:space="preserve">V</w:t>
       </w:r>
       <w:r>
         <w:rPr>
@@ -4870,7 +7519,7 @@
           <w:sz w:val="20"/>
           <w:szCs w:val="20"/>
         </w:rPr>
-        <w:t xml:space="preserve">IV</w:t>
+        <w:t xml:space="preserve">V</w:t>
       </w:r>
       <w:r>
         <w:rPr>
@@ -4892,7 +7541,7 @@
           <w:sz w:val="16"/>
           <w:szCs w:val="16"/>
         </w:rPr>
-        <w:t xml:space="preserve">TABLE IV.  </w:t>
+        <w:t xml:space="preserve">TABLE V.  </w:t>
       </w:r>
       <w:r>
         <w:rPr>
@@ -6123,7 +8772,7 @@
           <w:sz w:val="20"/>
           <w:szCs w:val="20"/>
         </w:rPr>
-        <w:t xml:space="preserve">IV</w:t>
+        <w:t xml:space="preserve">V</w:t>
       </w:r>
       <w:r>
         <w:rPr>

</xml_diff>